<commit_message>
Add capital capacity and market-impact stress study
</commit_message>
<xml_diff>
--- a/docs/research_report.docx
+++ b/docs/research_report.docx
@@ -9,6 +9,9 @@
         <w:spacing w:line="540" w:lineRule="exact"/>
       </w:pPr>
       <w:r>
+        <w:rPr>
+          <w:rFonts w:eastAsia="Songti SC"/>
+        </w:rPr>
         <w:t>A股小市值策略的收益延续性与执行约束</w:t>
       </w:r>
     </w:p>
@@ -37,7 +40,7 @@
           <w:b w:val="0"/>
           <w:sz w:val="18"/>
         </w:rPr>
-        <w:t>2026年10月23日  |  样本内2015—2023  |  历史留出2024—2025  |  单边综合成本30bp</w:t>
+        <w:t>2026年10月25日  |  样本内2015—2023  |  历史留出2024—2025  |  单边综合成本30bp</w:t>
       </w:r>
     </w:p>
     <w:p>
@@ -49,6 +52,7 @@
       <w:r>
         <w:rPr>
           <w:rFonts w:eastAsia="Songti SC"/>
+          <w:color w:val="000000"/>
         </w:rPr>
         <w:t>研究问题</w:t>
       </w:r>
@@ -75,6 +79,7 @@
       <w:r>
         <w:rPr>
           <w:rFonts w:eastAsia="Songti SC"/>
+          <w:color w:val="000000"/>
         </w:rPr>
         <w:t>主要结论</w:t>
       </w:r>
@@ -113,9 +118,8 @@
       <w:r>
         <w:rPr>
           <w:rFonts w:eastAsia="Songti SC"/>
-          <w:b w:val="0"/>
         </w:rPr>
-        <w:t>资金实验显示，2024年初投入10万元、执行整手及最低佣金规则时，平均现金占比为45.58%；100万元时降至5.04%，对应年化收益22.00%。这是订单约束敏感性，尚不是实盘结算或市场容量结论。</w:t>
+        <w:t>资金与执行实验表明，同从2024年初现金开始，100万元在1%日容量及η=0.5增量冲击假设下年化21.77%，较同资金开盘基准变动-0.22个百分点；5000万元时为23.38%，尝试完成率77.93%。这是固定日频假设下的压力检验，不能认证实盘容量，详见第12—14节。</w:t>
       </w:r>
     </w:p>
     <w:p>
@@ -668,6 +672,7 @@
       <w:r>
         <w:rPr>
           <w:rFonts w:eastAsia="Songti SC"/>
+          <w:color w:val="000000"/>
         </w:rPr>
         <w:t>1  先固定股票池与投资规则</w:t>
       </w:r>
@@ -694,6 +699,7 @@
       <w:r>
         <w:rPr>
           <w:rFonts w:eastAsia="Songti SC"/>
+          <w:color w:val="000000"/>
         </w:rPr>
         <w:t>市值名次的含义</w:t>
       </w:r>
@@ -1121,6 +1127,7 @@
       <w:r>
         <w:rPr>
           <w:rFonts w:eastAsia="Songti SC"/>
+          <w:color w:val="000000"/>
         </w:rPr>
         <w:t>从信号到实际成交</w:t>
       </w:r>
@@ -1157,7 +1164,10 @@
         <w:spacing w:line="280" w:lineRule="exact"/>
       </w:pPr>
       <w:r>
-        <w:t>财报公告后下一交易日可用；行业与状态采用历史资料。简称证据最多沿用185天，未知不视为正常股。历史版本与估值限制见第12节。</w:t>
+        <w:rPr>
+          <w:rFonts w:eastAsia="Songti SC"/>
+        </w:rPr>
+        <w:t>财报公告后下一交易日可用；行业与状态采用历史资料。简称证据最多沿用185天，未知不视为正常股。历史版本与估值限制见第15节。</w:t>
       </w:r>
     </w:p>
     <w:p>
@@ -1170,6 +1180,7 @@
       <w:r>
         <w:rPr>
           <w:rFonts w:eastAsia="Songti SC"/>
+          <w:color w:val="000000"/>
         </w:rPr>
         <w:t>2  从样本内赢家到历史留出表现</w:t>
       </w:r>
@@ -2230,6 +2241,7 @@
       <w:r>
         <w:rPr>
           <w:rFonts w:eastAsia="Songti SC"/>
+          <w:color w:val="000000"/>
         </w:rPr>
         <w:t>3  收益领先的证据有多强</w:t>
       </w:r>
@@ -2426,6 +2438,7 @@
       <w:r>
         <w:rPr>
           <w:rFonts w:eastAsia="Songti SC"/>
+          <w:color w:val="000000"/>
         </w:rPr>
         <w:t>4  ST规则和交易成本能否改变判断</w:t>
       </w:r>
@@ -2978,6 +2991,7 @@
       <w:r>
         <w:rPr>
           <w:rFonts w:eastAsia="Songti SC"/>
+          <w:color w:val="000000"/>
         </w:rPr>
         <w:t>有卖出规则不等于能够及时离场</w:t>
       </w:r>
@@ -3531,6 +3545,7 @@
       <w:r>
         <w:rPr>
           <w:rFonts w:eastAsia="Songti SC"/>
+          <w:color w:val="000000"/>
         </w:rPr>
         <w:t>5  已知特征解释了多少区间差异</w:t>
       </w:r>
@@ -4245,6 +4260,7 @@
       <w:r>
         <w:rPr>
           <w:rFonts w:eastAsia="Songti SC"/>
+          <w:color w:val="000000"/>
         </w:rPr>
         <w:t>6  扩展到第1000名后是否仍有市值梯度</w:t>
       </w:r>
@@ -5292,6 +5308,7 @@
       <w:r>
         <w:rPr>
           <w:rFonts w:eastAsia="Songti SC"/>
+          <w:color w:val="000000"/>
         </w:rPr>
         <w:t>7  把资金规模转化为可检验的订单约束</w:t>
       </w:r>
@@ -6236,6 +6253,7 @@
       <w:r>
         <w:rPr>
           <w:rFonts w:eastAsia="Songti SC"/>
+          <w:color w:val="000000"/>
         </w:rPr>
         <w:t>数量与资金约束怎样执行</w:t>
       </w:r>
@@ -6262,6 +6280,7 @@
       <w:r>
         <w:rPr>
           <w:rFonts w:eastAsia="Songti SC"/>
+          <w:color w:val="000000"/>
         </w:rPr>
         <w:t>这项实验的边界</w:t>
       </w:r>
@@ -6274,9 +6293,8 @@
       <w:r>
         <w:rPr>
           <w:rFonts w:eastAsia="Songti SC"/>
-          <w:b/>
         </w:rPr>
-        <w:t>复权账户仍假设分红等收益自动再投资，未逐笔重建派息到账、红股、税款及真实整数持股登记；清仓时可能释放复权记账形成的非整数等价份额。因此这是“订单整手与费用敏感性”，不能标为完整实盘账户模拟。成交额参与率、盘口排队和冲击成本也未加入，500万元情景不等于验证500万元容量。</w:t>
+        <w:t>复权账户仍假设分红等收益自动再投资，未逐笔重建派息到账、红股、税款及真实整数持股登记；清仓时可能释放复权记账形成的非整数等价份额。因此这是“订单整手与费用敏感性”，不能标为完整实盘账户模拟。本节仅检验整手及最低佣金；第12—14节另加入日成交额上限和增量冲击。盘口排队与实测冲击校准仍未完成。</w:t>
       </w:r>
     </w:p>
     <w:p>
@@ -6289,6 +6307,7 @@
       <w:r>
         <w:rPr>
           <w:rFonts w:eastAsia="Songti SC"/>
+          <w:color w:val="000000"/>
         </w:rPr>
         <w:t>8  小资金的主要代价是闲置与费用</w:t>
       </w:r>
@@ -7850,6 +7869,10 @@
         <w:spacing w:line="480" w:lineRule="exact"/>
       </w:pPr>
       <w:r>
+        <w:rPr>
+          <w:rFonts w:eastAsia="Songti SC"/>
+          <w:color w:val="000000"/>
+        </w:rPr>
         <w:t>9  收益来源与时间集中度</w:t>
       </w:r>
     </w:p>
@@ -7859,6 +7882,7 @@
       </w:pPr>
       <w:r>
         <w:rPr>
+          <w:rFonts w:eastAsia="Songti SC"/>
           <w:sz w:val="20"/>
         </w:rPr>
         <w:t>最小市值组的优势伴随明显的时间集中度。分组与控制回归支持对市值相关收益差异的描述，但不能识别独立Alpha或壳价值。本节固定原赢家和交易规则，仅检查收益来自哪些时期，不再选组或优化参数。</w:t>
@@ -7870,6 +7894,10 @@
         <w:spacing w:line="360" w:lineRule="exact"/>
       </w:pPr>
       <w:r>
+        <w:rPr>
+          <w:rFonts w:eastAsia="Songti SC"/>
+          <w:color w:val="000000"/>
+        </w:rPr>
         <w:t>市值梯度提供横截面证据</w:t>
       </w:r>
     </w:p>
@@ -7879,6 +7907,7 @@
       </w:pPr>
       <w:r>
         <w:rPr>
+          <w:rFonts w:eastAsia="Songti SC"/>
           <w:sz w:val="20"/>
         </w:rPr>
         <w:t>原五档与新增501—1000名区间在样本内总体呈现较小市值收益较高的特征，但样本外存在区间反转，401—500组的夏普也高于最小组。结合第5节同样本控制回归，现有结果更适合表述为“与市值及相关特征共同变化的收益差异”，不应将全部收益归因于单一市值因子。</w:t>
@@ -7890,6 +7919,7 @@
       </w:pPr>
       <w:r>
         <w:rPr>
+          <w:rFonts w:eastAsia="Songti SC"/>
           <w:sz w:val="20"/>
         </w:rPr>
         <w:t>表11  原策略逐年收益与市场背景</w:t>
@@ -8924,6 +8954,7 @@
       </w:pPr>
       <w:r>
         <w:rPr>
+          <w:rFonts w:eastAsia="Songti SC"/>
           <w:sz w:val="20"/>
         </w:rPr>
         <w:t>2015年的对数收益占2015—2023年累计对数收益的50.9%。不含2015年时，2016—2023年年化收益为12.11%，低于原样本内22.99%；2016—2025年为14.28%。这是不同子时期的描述比较，不是删除不利或有利年份后的新策略。</w:t>
@@ -8935,6 +8966,7 @@
       </w:pPr>
       <w:r>
         <w:rPr>
+          <w:rFonts w:eastAsia="Songti SC"/>
           <w:sz w:val="20"/>
         </w:rPr>
         <w:t>表12  最强月份对复利结果的影响</w:t>
@@ -9301,6 +9333,7 @@
       </w:pPr>
       <w:r>
         <w:rPr>
+          <w:rFonts w:eastAsia="Songti SC"/>
           <w:sz w:val="20"/>
         </w:rPr>
         <w:t>按已实现月对数收益排序，将最强5个月收益替换为0，保留原月份总数，其余月份不变。该事后诊断不能交易，也不是对未来错失月份的预测。2024—2025年贡献占比超过100%，表示这些上涨月份的贡献被其他月份的净损失部分抵消；随意减仓可能错过决定复利结果的反弹。</w:t>
@@ -9313,6 +9346,10 @@
         <w:spacing w:line="480" w:lineRule="exact"/>
       </w:pPr>
       <w:r>
+        <w:rPr>
+          <w:rFonts w:eastAsia="Songti SC"/>
+          <w:color w:val="000000"/>
+        </w:rPr>
         <w:t>10  市场环境与策略适用性</w:t>
       </w:r>
     </w:p>
@@ -9322,6 +9359,7 @@
       </w:pPr>
       <w:r>
         <w:rPr>
+          <w:rFonts w:eastAsia="Songti SC"/>
           <w:sz w:val="20"/>
         </w:rPr>
         <w:t>市场环境分为中证1000当月上涨与不涨；风格环境分为中证1000当月收益高于沪深300与不高于沪深300。两项分别分组，不交叉细分，不调整原持仓。风格数据来自已有本地冻结行情，可计算月收益的期间为2020—2025年；不补造早期指数历史。</w:t>
@@ -9333,6 +9371,10 @@
         <w:spacing w:line="360" w:lineRule="exact"/>
       </w:pPr>
       <w:r>
+        <w:rPr>
+          <w:rFonts w:eastAsia="Songti SC"/>
+          <w:color w:val="000000"/>
+        </w:rPr>
         <w:t>当月环境解释收益差异</w:t>
       </w:r>
     </w:p>
@@ -9342,6 +9384,7 @@
       </w:pPr>
       <w:r>
         <w:rPr>
+          <w:rFonts w:eastAsia="Songti SC"/>
           <w:sz w:val="20"/>
         </w:rPr>
         <w:t>表13  按当月环境分类的原策略表现 2024—2025</w:t>
@@ -10057,6 +10100,7 @@
       </w:pPr>
       <w:r>
         <w:rPr>
+          <w:rFonts w:eastAsia="Songti SC"/>
           <w:sz w:val="20"/>
         </w:rPr>
         <w:t>中证1000占优的13个月，原策略平均月收益7.09%；其余11个月为−3.51%，4次亏损至少10%的月份均落在后者。市场下跌环境中，策略平均仍亏损2.77%，即使平均跑赢中证1000约1.71个百分点，也不意味着能保护本金。</w:t>
@@ -10068,6 +10112,7 @@
       </w:pPr>
       <w:r>
         <w:rPr>
+          <w:rFonts w:eastAsia="Songti SC"/>
           <w:sz w:val="20"/>
         </w:rPr>
         <w:t>当月分类使用了当月结束后才完整知道的市场收益，仅作事后环境归因。股票组合为成本后复权收益，两项指数均为价格收益；这些比较不构成可交易净超额收益或因果解释。</w:t>
@@ -10079,6 +10124,10 @@
         <w:spacing w:line="360" w:lineRule="exact"/>
       </w:pPr>
       <w:r>
+        <w:rPr>
+          <w:rFonts w:eastAsia="Songti SC"/>
+          <w:color w:val="000000"/>
+        </w:rPr>
         <w:t>上月已知环境的区分能力明显减弱</w:t>
       </w:r>
     </w:p>
@@ -10088,6 +10137,7 @@
       </w:pPr>
       <w:r>
         <w:rPr>
+          <w:rFonts w:eastAsia="Songti SC"/>
           <w:sz w:val="20"/>
         </w:rPr>
         <w:t>表14  按上月环境分类的下月原策略表现 2024—2025</w:t>
@@ -10803,6 +10853,7 @@
       </w:pPr>
       <w:r>
         <w:rPr>
+          <w:rFonts w:eastAsia="Songti SC"/>
           <w:sz w:val="20"/>
         </w:rPr>
         <w:t>将环境整体滞后一个月后，大小盘风格两组下月平均收益为3.37%和1.08%，但两组各12个月，均有2次大幅亏损，亏损至少10%的比例同为16.67%。市场涨跌分组的尾部亏损比例也相同。因此，当月环境的强相关不能直接转化为下一月的可靠风险预警。</w:t>
@@ -10814,6 +10865,7 @@
       </w:pPr>
       <w:r>
         <w:rPr>
+          <w:rFonts w:eastAsia="Songti SC"/>
           <w:sz w:val="20"/>
         </w:rPr>
         <w:t>环境分组月份不连续，不计算拼接年化收益或回撤。完整分期统计和逐月标签保存在results/applicability；风格统计始于2020年。以上为描述分析，不改变赢家或仓位。</w:t>
@@ -10826,6 +10878,10 @@
         <w:spacing w:line="480" w:lineRule="exact"/>
       </w:pPr>
       <w:r>
+        <w:rPr>
+          <w:rFonts w:eastAsia="Songti SC"/>
+          <w:color w:val="000000"/>
+        </w:rPr>
         <w:t>11  交易约束决定研究收益的实现程度</w:t>
       </w:r>
     </w:p>
@@ -10835,9 +10891,9 @@
       </w:pPr>
       <w:r>
         <w:rPr>
-          <w:sz w:val="20"/>
+          <w:rFonts w:eastAsia="Songti SC"/>
         </w:rPr>
-        <w:t>交易适用性可以分为成本承受、风险退出和资金分散三个层面。以下汇总第4节及第7—8节的既有实验，不增加新的手续费、资金规模或成交规则。</w:t>
+        <w:t>交易适用性包括成本承受、风险退出、资金分散和市场容量。本节汇总第4及第7—8节的既有实验；第12—14节进一步比较同现金起点的成交容量和增量冲击压力。</w:t>
       </w:r>
     </w:p>
     <w:p>
@@ -10846,6 +10902,7 @@
       </w:pPr>
       <w:r>
         <w:rPr>
+          <w:rFonts w:eastAsia="Songti SC"/>
           <w:sz w:val="20"/>
         </w:rPr>
         <w:t>表15  成本变化与日度风险 2024—2025</w:t>
@@ -11216,6 +11273,7 @@
       </w:pPr>
       <w:r>
         <w:rPr>
+          <w:rFonts w:eastAsia="Songti SC"/>
           <w:sz w:val="20"/>
         </w:rPr>
         <w:t>从10bp提高到50bp，年化收益由24.56%降至22.30%，但最大回撤幅度仍在45%左右。成本改变收益水平和组间排序，无法解释或消除主要尾部风险；该区间不包含基于盘口和成交参与率估计的动态冲击成本。</w:t>
@@ -11227,6 +11285,10 @@
         <w:spacing w:line="360" w:lineRule="exact"/>
       </w:pPr>
       <w:r>
+        <w:rPr>
+          <w:rFonts w:eastAsia="Songti SC"/>
+          <w:color w:val="000000"/>
+        </w:rPr>
         <w:t>退出规则的适用条件是能够成交</w:t>
       </w:r>
     </w:p>
@@ -11236,6 +11298,7 @@
       </w:pPr>
       <w:r>
         <w:rPr>
+          <w:rFonts w:eastAsia="Songti SC"/>
           <w:sz w:val="20"/>
         </w:rPr>
         <w:t>原策略全样本128次风险退出成交中，97次发生延迟，约75.8%。最长已列示案例延迟166个交易日。策略必须能承担风险被识别后仍无法卖出的价格损失；设置ST退出规则不等于已经获得及时止损保护。停牌估值沿用末次价格还可能推迟账面风险显现。</w:t>
@@ -11247,6 +11310,7 @@
       </w:pPr>
       <w:r>
         <w:rPr>
+          <w:rFonts w:eastAsia="Songti SC"/>
           <w:sz w:val="20"/>
         </w:rPr>
         <w:t>表16  同起点资金实验的实现偏差 2024—2025</w:t>
@@ -11722,6 +11786,7 @@
       </w:pPr>
       <w:r>
         <w:rPr>
+          <w:rFonts w:eastAsia="Songti SC"/>
           <w:sz w:val="20"/>
         </w:rPr>
         <w:t>本表均从2024年初现金建仓，执行整手及最低佣金；同起点连续份额对照年化22.88%，平均现金1.22%。10万元情景现金闲置45.58%，较小回撤主要伴随风险暴露降低。100万元时现金约5.04%，年化收益较同起点对照低0.89个百分点；不能与承接旧持仓的23.42%直接相减。</w:t>
@@ -11733,6 +11798,10 @@
         <w:spacing w:line="360" w:lineRule="exact"/>
       </w:pPr>
       <w:r>
+        <w:rPr>
+          <w:rFonts w:eastAsia="Songti SC"/>
+          <w:color w:val="000000"/>
+        </w:rPr>
         <w:t>可陈述的适用边界</w:t>
       </w:r>
     </w:p>
@@ -11742,9 +11811,9 @@
       </w:pPr>
       <w:r>
         <w:rPr>
-          <w:sz w:val="20"/>
+          <w:rFonts w:eastAsia="Songti SC"/>
         </w:rPr>
-        <w:t>本策略更适合被理解为高分散、承担较大权益回撤的小市值研究组合。有限资金下，100只目标的整手及费用约束可能显著改变实际暴露；资金增加可减少整手闲置，却不代表市场容量随之得到验证。现有500万元情景未检验成交量约束、冲击成本和排队，因此不给出可承载资金上限。</w:t>
+        <w:t>本策略是高分散并承担较大权益回撤的小市值研究组合。有限资金下，100只目标的整手及费用约束会改变实际暴露。资金增加可以减少整手闲置，却可能增加成交容量压力。第12—14节按固定日频上限和增量冲击假设检验这一权衡；缺少分钟队列与实测校准，仍不给出认证的实盘资金上限。</w:t>
       </w:r>
     </w:p>
     <w:p>
@@ -11753,9 +11822,4275 @@
       </w:pPr>
       <w:r>
         <w:rPr>
+          <w:rFonts w:eastAsia="Songti SC"/>
           <w:sz w:val="20"/>
         </w:rPr>
         <w:t>收益集中度说明错过少数上涨月代价较高；环境分析说明相对领先与绝对盈利不同；执行实验说明研究净值与实际账户仍有距离。这三项适用性结论共同限定项目的使用范围，不据此产生新的交易信号。</w:t>
+      </w:r>
+    </w:p>
+    <w:p>
+      <w:pPr>
+        <w:pStyle w:val="Heading1"/>
+        <w:pageBreakBefore/>
+        <w:spacing w:line="480" w:lineRule="exact"/>
+      </w:pPr>
+      <w:r>
+        <w:rPr>
+          <w:rFonts w:eastAsia="Songti SC"/>
+          <w:color w:val="000000"/>
+        </w:rPr>
+        <w:t>12  成交容量与增量冲击的固定检验</w:t>
+      </w:r>
+    </w:p>
+    <w:p>
+      <w:pPr>
+        <w:spacing w:after="80" w:line="280" w:lineRule="exact"/>
+      </w:pPr>
+      <w:r>
+        <w:rPr>
+          <w:rFonts w:ascii="Arial" w:hAnsi="Arial" w:eastAsia="Songti SC"/>
+          <w:b w:val="0"/>
+          <w:color w:val="000000"/>
+          <w:sz w:val="20"/>
+        </w:rPr>
+        <w:t>本次固定1—100名赢家，增加8档资金、8种执行场景，并分别重跑2015—2023与2024—2025，共128格。两段均从现金开始，此后不追加或抽走资金。协议在场景结果评估前固定；2024—2025仍是已查看的历史留出，不是新的独立验证。</w:t>
+      </w:r>
+    </w:p>
+    <w:p>
+      <w:pPr>
+        <w:keepNext/>
+        <w:spacing w:after="80" w:line="280" w:lineRule="exact"/>
+      </w:pPr>
+      <w:r>
+        <w:rPr>
+          <w:rFonts w:ascii="Arial" w:hAnsi="Arial" w:eastAsia="Songti SC"/>
+          <w:b/>
+          <w:color w:val="000000"/>
+          <w:sz w:val="20"/>
+        </w:rPr>
+        <w:t>表17  预先固定的执行场景</w:t>
+      </w:r>
+    </w:p>
+    <w:tbl>
+      <w:tblPr>
+        <w:tblW w:type="auto" w:w="0"/>
+        <w:jc w:val="center"/>
+        <w:tblLayout w:type="fixed"/>
+        <w:tblLook w:firstColumn="1" w:firstRow="1" w:lastColumn="0" w:lastRow="0" w:noHBand="0" w:noVBand="1" w:val="04A0"/>
+        <w:tblBorders>
+          <w:top w:val="single" w:sz="4" w:color="D9D9D9"/>
+          <w:bottom w:val="single" w:sz="4" w:color="D9D9D9"/>
+          <w:left w:val="single" w:sz="4" w:color="D9D9D9"/>
+          <w:right w:val="single" w:sz="4" w:color="D9D9D9"/>
+          <w:insideH w:val="single" w:sz="4" w:color="D9D9D9"/>
+          <w:insideV w:val="single" w:sz="4" w:color="D9D9D9"/>
+        </w:tblBorders>
+      </w:tblPr>
+      <w:tblGrid>
+        <w:gridCol w:w="3628"/>
+        <w:gridCol w:w="2041"/>
+        <w:gridCol w:w="2041"/>
+        <w:gridCol w:w="1814"/>
+      </w:tblGrid>
+      <w:tr>
+        <w:trPr>
+          <w:cantSplit/>
+          <w:tblHeader/>
+        </w:trPr>
+        <w:tc>
+          <w:tcPr>
+            <w:tcW w:type="dxa" w:w="3628"/>
+            <w:vAlign w:val="center"/>
+            <w:shd w:fill="E7EBEE"/>
+            <w:tcMar>
+              <w:top w:w="65" w:type="dxa"/>
+              <w:bottom w:w="65" w:type="dxa"/>
+              <w:left w:w="65" w:type="dxa"/>
+              <w:right w:w="65" w:type="dxa"/>
+            </w:tcMar>
+          </w:tcPr>
+          <w:p>
+            <w:pPr>
+              <w:spacing w:before="20" w:after="20" w:line="260" w:lineRule="exact"/>
+              <w:jc w:val="left"/>
+            </w:pPr>
+            <w:r>
+              <w:rPr>
+                <w:rFonts w:ascii="Arial" w:hAnsi="Arial" w:eastAsia="Songti SC"/>
+                <w:b/>
+                <w:sz w:val="18"/>
+              </w:rPr>
+              <w:t>场景</w:t>
+            </w:r>
+          </w:p>
+        </w:tc>
+        <w:tc>
+          <w:tcPr>
+            <w:tcW w:type="dxa" w:w="2041"/>
+            <w:vAlign w:val="center"/>
+            <w:shd w:fill="E7EBEE"/>
+            <w:tcMar>
+              <w:top w:w="65" w:type="dxa"/>
+              <w:bottom w:w="65" w:type="dxa"/>
+              <w:left w:w="65" w:type="dxa"/>
+              <w:right w:w="65" w:type="dxa"/>
+            </w:tcMar>
+          </w:tcPr>
+          <w:p>
+            <w:pPr>
+              <w:spacing w:before="20" w:after="20" w:line="260" w:lineRule="exact"/>
+              <w:jc w:val="center"/>
+            </w:pPr>
+            <w:r>
+              <w:rPr>
+                <w:rFonts w:ascii="Arial" w:hAnsi="Arial" w:eastAsia="Songti SC"/>
+                <w:b/>
+                <w:sz w:val="18"/>
+              </w:rPr>
+              <w:t>成交参照</w:t>
+            </w:r>
+          </w:p>
+        </w:tc>
+        <w:tc>
+          <w:tcPr>
+            <w:tcW w:type="dxa" w:w="2041"/>
+            <w:vAlign w:val="center"/>
+            <w:shd w:fill="E7EBEE"/>
+            <w:tcMar>
+              <w:top w:w="65" w:type="dxa"/>
+              <w:bottom w:w="65" w:type="dxa"/>
+              <w:left w:w="65" w:type="dxa"/>
+              <w:right w:w="65" w:type="dxa"/>
+            </w:tcMar>
+          </w:tcPr>
+          <w:p>
+            <w:pPr>
+              <w:spacing w:before="20" w:after="20" w:line="260" w:lineRule="exact"/>
+              <w:jc w:val="center"/>
+            </w:pPr>
+            <w:r>
+              <w:rPr>
+                <w:rFonts w:ascii="Arial" w:hAnsi="Arial" w:eastAsia="Songti SC"/>
+                <w:b/>
+                <w:sz w:val="18"/>
+              </w:rPr>
+              <w:t>日参与率上限</w:t>
+            </w:r>
+          </w:p>
+        </w:tc>
+        <w:tc>
+          <w:tcPr>
+            <w:tcW w:type="dxa" w:w="1814"/>
+            <w:vAlign w:val="center"/>
+            <w:shd w:fill="E7EBEE"/>
+            <w:tcMar>
+              <w:top w:w="65" w:type="dxa"/>
+              <w:bottom w:w="65" w:type="dxa"/>
+              <w:left w:w="65" w:type="dxa"/>
+              <w:right w:w="65" w:type="dxa"/>
+            </w:tcMar>
+          </w:tcPr>
+          <w:p>
+            <w:pPr>
+              <w:spacing w:before="20" w:after="20" w:line="260" w:lineRule="exact"/>
+              <w:jc w:val="center"/>
+            </w:pPr>
+            <w:r>
+              <w:rPr>
+                <w:rFonts w:ascii="Arial" w:hAnsi="Arial" w:eastAsia="Songti SC"/>
+                <w:b/>
+                <w:sz w:val="18"/>
+              </w:rPr>
+              <w:t>增量冲击η</w:t>
+            </w:r>
+          </w:p>
+        </w:tc>
+      </w:tr>
+      <w:tr>
+        <w:trPr>
+          <w:cantSplit/>
+        </w:trPr>
+        <w:tc>
+          <w:tcPr>
+            <w:tcW w:type="dxa" w:w="3628"/>
+            <w:vAlign w:val="center"/>
+            <w:shd w:fill="FFFFFF"/>
+            <w:tcMar>
+              <w:top w:w="65" w:type="dxa"/>
+              <w:bottom w:w="65" w:type="dxa"/>
+              <w:left w:w="65" w:type="dxa"/>
+              <w:right w:w="65" w:type="dxa"/>
+            </w:tcMar>
+          </w:tcPr>
+          <w:p>
+            <w:pPr>
+              <w:spacing w:before="20" w:after="20" w:line="260" w:lineRule="exact"/>
+              <w:jc w:val="left"/>
+            </w:pPr>
+            <w:r>
+              <w:rPr>
+                <w:rFonts w:ascii="Arial" w:hAnsi="Arial" w:eastAsia="Songti SC"/>
+                <w:b w:val="0"/>
+                <w:sz w:val="18"/>
+              </w:rPr>
+              <w:t>OPEN_BASE 原开盘基准</w:t>
+            </w:r>
+          </w:p>
+        </w:tc>
+        <w:tc>
+          <w:tcPr>
+            <w:tcW w:type="dxa" w:w="2041"/>
+            <w:vAlign w:val="center"/>
+            <w:shd w:fill="FFFFFF"/>
+            <w:tcMar>
+              <w:top w:w="65" w:type="dxa"/>
+              <w:bottom w:w="65" w:type="dxa"/>
+              <w:left w:w="65" w:type="dxa"/>
+              <w:right w:w="65" w:type="dxa"/>
+            </w:tcMar>
+          </w:tcPr>
+          <w:p>
+            <w:pPr>
+              <w:spacing w:before="20" w:after="20" w:line="260" w:lineRule="exact"/>
+              <w:jc w:val="center"/>
+            </w:pPr>
+            <w:r>
+              <w:rPr>
+                <w:rFonts w:ascii="Arial" w:hAnsi="Arial" w:eastAsia="Songti SC"/>
+                <w:b w:val="0"/>
+                <w:sz w:val="18"/>
+              </w:rPr>
+              <w:t>次日开盘</w:t>
+            </w:r>
+          </w:p>
+        </w:tc>
+        <w:tc>
+          <w:tcPr>
+            <w:tcW w:type="dxa" w:w="2041"/>
+            <w:vAlign w:val="center"/>
+            <w:shd w:fill="FFFFFF"/>
+            <w:tcMar>
+              <w:top w:w="65" w:type="dxa"/>
+              <w:bottom w:w="65" w:type="dxa"/>
+              <w:left w:w="65" w:type="dxa"/>
+              <w:right w:w="65" w:type="dxa"/>
+            </w:tcMar>
+          </w:tcPr>
+          <w:p>
+            <w:pPr>
+              <w:spacing w:before="20" w:after="20" w:line="260" w:lineRule="exact"/>
+              <w:jc w:val="center"/>
+            </w:pPr>
+            <w:r>
+              <w:rPr>
+                <w:rFonts w:ascii="Arial" w:hAnsi="Arial" w:eastAsia="Songti SC"/>
+                <w:b w:val="0"/>
+                <w:sz w:val="18"/>
+              </w:rPr>
+              <w:t>无</w:t>
+            </w:r>
+          </w:p>
+        </w:tc>
+        <w:tc>
+          <w:tcPr>
+            <w:tcW w:type="dxa" w:w="1814"/>
+            <w:vAlign w:val="center"/>
+            <w:shd w:fill="FFFFFF"/>
+            <w:tcMar>
+              <w:top w:w="65" w:type="dxa"/>
+              <w:bottom w:w="65" w:type="dxa"/>
+              <w:left w:w="65" w:type="dxa"/>
+              <w:right w:w="65" w:type="dxa"/>
+            </w:tcMar>
+          </w:tcPr>
+          <w:p>
+            <w:pPr>
+              <w:spacing w:before="20" w:after="20" w:line="260" w:lineRule="exact"/>
+              <w:jc w:val="center"/>
+            </w:pPr>
+            <w:r>
+              <w:rPr>
+                <w:rFonts w:ascii="Arial" w:hAnsi="Arial" w:eastAsia="Songti SC"/>
+                <w:b w:val="0"/>
+                <w:sz w:val="18"/>
+              </w:rPr>
+              <w:t>0</w:t>
+            </w:r>
+          </w:p>
+        </w:tc>
+      </w:tr>
+      <w:tr>
+        <w:trPr>
+          <w:cantSplit/>
+        </w:trPr>
+        <w:tc>
+          <w:tcPr>
+            <w:tcW w:type="dxa" w:w="3628"/>
+            <w:vAlign w:val="center"/>
+            <w:shd w:fill="F5F7F8"/>
+            <w:tcMar>
+              <w:top w:w="65" w:type="dxa"/>
+              <w:bottom w:w="65" w:type="dxa"/>
+              <w:left w:w="65" w:type="dxa"/>
+              <w:right w:w="65" w:type="dxa"/>
+            </w:tcMar>
+          </w:tcPr>
+          <w:p>
+            <w:pPr>
+              <w:spacing w:before="20" w:after="20" w:line="260" w:lineRule="exact"/>
+              <w:jc w:val="left"/>
+            </w:pPr>
+            <w:r>
+              <w:rPr>
+                <w:rFonts w:ascii="Arial" w:hAnsi="Arial" w:eastAsia="Songti SC"/>
+                <w:b w:val="0"/>
+                <w:sz w:val="18"/>
+              </w:rPr>
+              <w:t>VWAP_BASE 价格参照</w:t>
+            </w:r>
+          </w:p>
+        </w:tc>
+        <w:tc>
+          <w:tcPr>
+            <w:tcW w:type="dxa" w:w="2041"/>
+            <w:vAlign w:val="center"/>
+            <w:shd w:fill="F5F7F8"/>
+            <w:tcMar>
+              <w:top w:w="65" w:type="dxa"/>
+              <w:bottom w:w="65" w:type="dxa"/>
+              <w:left w:w="65" w:type="dxa"/>
+              <w:right w:w="65" w:type="dxa"/>
+            </w:tcMar>
+          </w:tcPr>
+          <w:p>
+            <w:pPr>
+              <w:spacing w:before="20" w:after="20" w:line="260" w:lineRule="exact"/>
+              <w:jc w:val="center"/>
+            </w:pPr>
+            <w:r>
+              <w:rPr>
+                <w:rFonts w:ascii="Arial" w:hAnsi="Arial" w:eastAsia="Songti SC"/>
+                <w:b w:val="0"/>
+                <w:sz w:val="18"/>
+              </w:rPr>
+              <w:t>日VWAP近似</w:t>
+            </w:r>
+          </w:p>
+        </w:tc>
+        <w:tc>
+          <w:tcPr>
+            <w:tcW w:type="dxa" w:w="2041"/>
+            <w:vAlign w:val="center"/>
+            <w:shd w:fill="F5F7F8"/>
+            <w:tcMar>
+              <w:top w:w="65" w:type="dxa"/>
+              <w:bottom w:w="65" w:type="dxa"/>
+              <w:left w:w="65" w:type="dxa"/>
+              <w:right w:w="65" w:type="dxa"/>
+            </w:tcMar>
+          </w:tcPr>
+          <w:p>
+            <w:pPr>
+              <w:spacing w:before="20" w:after="20" w:line="260" w:lineRule="exact"/>
+              <w:jc w:val="center"/>
+            </w:pPr>
+            <w:r>
+              <w:rPr>
+                <w:rFonts w:ascii="Arial" w:hAnsi="Arial" w:eastAsia="Songti SC"/>
+                <w:b w:val="0"/>
+                <w:sz w:val="18"/>
+              </w:rPr>
+              <w:t>无</w:t>
+            </w:r>
+          </w:p>
+        </w:tc>
+        <w:tc>
+          <w:tcPr>
+            <w:tcW w:type="dxa" w:w="1814"/>
+            <w:vAlign w:val="center"/>
+            <w:shd w:fill="F5F7F8"/>
+            <w:tcMar>
+              <w:top w:w="65" w:type="dxa"/>
+              <w:bottom w:w="65" w:type="dxa"/>
+              <w:left w:w="65" w:type="dxa"/>
+              <w:right w:w="65" w:type="dxa"/>
+            </w:tcMar>
+          </w:tcPr>
+          <w:p>
+            <w:pPr>
+              <w:spacing w:before="20" w:after="20" w:line="260" w:lineRule="exact"/>
+              <w:jc w:val="center"/>
+            </w:pPr>
+            <w:r>
+              <w:rPr>
+                <w:rFonts w:ascii="Arial" w:hAnsi="Arial" w:eastAsia="Songti SC"/>
+                <w:b w:val="0"/>
+                <w:sz w:val="18"/>
+              </w:rPr>
+              <w:t>0</w:t>
+            </w:r>
+          </w:p>
+        </w:tc>
+      </w:tr>
+      <w:tr>
+        <w:trPr>
+          <w:cantSplit/>
+        </w:trPr>
+        <w:tc>
+          <w:tcPr>
+            <w:tcW w:type="dxa" w:w="3628"/>
+            <w:vAlign w:val="center"/>
+            <w:shd w:fill="FFFFFF"/>
+            <w:tcMar>
+              <w:top w:w="65" w:type="dxa"/>
+              <w:bottom w:w="65" w:type="dxa"/>
+              <w:left w:w="65" w:type="dxa"/>
+              <w:right w:w="65" w:type="dxa"/>
+            </w:tcMar>
+          </w:tcPr>
+          <w:p>
+            <w:pPr>
+              <w:spacing w:before="20" w:after="20" w:line="260" w:lineRule="exact"/>
+              <w:jc w:val="left"/>
+            </w:pPr>
+            <w:r>
+              <w:rPr>
+                <w:rFonts w:ascii="Arial" w:hAnsi="Arial" w:eastAsia="Songti SC"/>
+                <w:b w:val="0"/>
+                <w:sz w:val="18"/>
+              </w:rPr>
+              <w:t>CAP_1P 容量对照</w:t>
+            </w:r>
+          </w:p>
+        </w:tc>
+        <w:tc>
+          <w:tcPr>
+            <w:tcW w:type="dxa" w:w="2041"/>
+            <w:vAlign w:val="center"/>
+            <w:shd w:fill="FFFFFF"/>
+            <w:tcMar>
+              <w:top w:w="65" w:type="dxa"/>
+              <w:bottom w:w="65" w:type="dxa"/>
+              <w:left w:w="65" w:type="dxa"/>
+              <w:right w:w="65" w:type="dxa"/>
+            </w:tcMar>
+          </w:tcPr>
+          <w:p>
+            <w:pPr>
+              <w:spacing w:before="20" w:after="20" w:line="260" w:lineRule="exact"/>
+              <w:jc w:val="center"/>
+            </w:pPr>
+            <w:r>
+              <w:rPr>
+                <w:rFonts w:ascii="Arial" w:hAnsi="Arial" w:eastAsia="Songti SC"/>
+                <w:b w:val="0"/>
+                <w:sz w:val="18"/>
+              </w:rPr>
+              <w:t>日VWAP近似</w:t>
+            </w:r>
+          </w:p>
+        </w:tc>
+        <w:tc>
+          <w:tcPr>
+            <w:tcW w:type="dxa" w:w="2041"/>
+            <w:vAlign w:val="center"/>
+            <w:shd w:fill="FFFFFF"/>
+            <w:tcMar>
+              <w:top w:w="65" w:type="dxa"/>
+              <w:bottom w:w="65" w:type="dxa"/>
+              <w:left w:w="65" w:type="dxa"/>
+              <w:right w:w="65" w:type="dxa"/>
+            </w:tcMar>
+          </w:tcPr>
+          <w:p>
+            <w:pPr>
+              <w:spacing w:before="20" w:after="20" w:line="260" w:lineRule="exact"/>
+              <w:jc w:val="center"/>
+            </w:pPr>
+            <w:r>
+              <w:rPr>
+                <w:rFonts w:ascii="Arial" w:hAnsi="Arial" w:eastAsia="Songti SC"/>
+                <w:b w:val="0"/>
+                <w:sz w:val="18"/>
+              </w:rPr>
+              <w:t>1%</w:t>
+            </w:r>
+          </w:p>
+        </w:tc>
+        <w:tc>
+          <w:tcPr>
+            <w:tcW w:type="dxa" w:w="1814"/>
+            <w:vAlign w:val="center"/>
+            <w:shd w:fill="FFFFFF"/>
+            <w:tcMar>
+              <w:top w:w="65" w:type="dxa"/>
+              <w:bottom w:w="65" w:type="dxa"/>
+              <w:left w:w="65" w:type="dxa"/>
+              <w:right w:w="65" w:type="dxa"/>
+            </w:tcMar>
+          </w:tcPr>
+          <w:p>
+            <w:pPr>
+              <w:spacing w:before="20" w:after="20" w:line="260" w:lineRule="exact"/>
+              <w:jc w:val="center"/>
+            </w:pPr>
+            <w:r>
+              <w:rPr>
+                <w:rFonts w:ascii="Arial" w:hAnsi="Arial" w:eastAsia="Songti SC"/>
+                <w:b w:val="0"/>
+                <w:sz w:val="18"/>
+              </w:rPr>
+              <w:t>0</w:t>
+            </w:r>
+          </w:p>
+        </w:tc>
+      </w:tr>
+      <w:tr>
+        <w:trPr>
+          <w:cantSplit/>
+        </w:trPr>
+        <w:tc>
+          <w:tcPr>
+            <w:tcW w:type="dxa" w:w="3628"/>
+            <w:vAlign w:val="center"/>
+            <w:shd w:fill="F5F7F8"/>
+            <w:tcMar>
+              <w:top w:w="65" w:type="dxa"/>
+              <w:bottom w:w="65" w:type="dxa"/>
+              <w:left w:w="65" w:type="dxa"/>
+              <w:right w:w="65" w:type="dxa"/>
+            </w:tcMar>
+          </w:tcPr>
+          <w:p>
+            <w:pPr>
+              <w:spacing w:before="20" w:after="20" w:line="260" w:lineRule="exact"/>
+              <w:jc w:val="left"/>
+            </w:pPr>
+            <w:r>
+              <w:rPr>
+                <w:rFonts w:ascii="Arial" w:hAnsi="Arial" w:eastAsia="Songti SC"/>
+                <w:b w:val="0"/>
+                <w:sz w:val="18"/>
+              </w:rPr>
+              <w:t>CAP_1P_SIGMA 覆盖对照</w:t>
+            </w:r>
+          </w:p>
+        </w:tc>
+        <w:tc>
+          <w:tcPr>
+            <w:tcW w:type="dxa" w:w="2041"/>
+            <w:vAlign w:val="center"/>
+            <w:shd w:fill="F5F7F8"/>
+            <w:tcMar>
+              <w:top w:w="65" w:type="dxa"/>
+              <w:bottom w:w="65" w:type="dxa"/>
+              <w:left w:w="65" w:type="dxa"/>
+              <w:right w:w="65" w:type="dxa"/>
+            </w:tcMar>
+          </w:tcPr>
+          <w:p>
+            <w:pPr>
+              <w:spacing w:before="20" w:after="20" w:line="260" w:lineRule="exact"/>
+              <w:jc w:val="center"/>
+            </w:pPr>
+            <w:r>
+              <w:rPr>
+                <w:rFonts w:ascii="Arial" w:hAnsi="Arial" w:eastAsia="Songti SC"/>
+                <w:b w:val="0"/>
+                <w:sz w:val="18"/>
+              </w:rPr>
+              <w:t>日VWAP近似</w:t>
+            </w:r>
+          </w:p>
+        </w:tc>
+        <w:tc>
+          <w:tcPr>
+            <w:tcW w:type="dxa" w:w="2041"/>
+            <w:vAlign w:val="center"/>
+            <w:shd w:fill="F5F7F8"/>
+            <w:tcMar>
+              <w:top w:w="65" w:type="dxa"/>
+              <w:bottom w:w="65" w:type="dxa"/>
+              <w:left w:w="65" w:type="dxa"/>
+              <w:right w:w="65" w:type="dxa"/>
+            </w:tcMar>
+          </w:tcPr>
+          <w:p>
+            <w:pPr>
+              <w:spacing w:before="20" w:after="20" w:line="260" w:lineRule="exact"/>
+              <w:jc w:val="center"/>
+            </w:pPr>
+            <w:r>
+              <w:rPr>
+                <w:rFonts w:ascii="Arial" w:hAnsi="Arial" w:eastAsia="Songti SC"/>
+                <w:b w:val="0"/>
+                <w:sz w:val="18"/>
+              </w:rPr>
+              <w:t>1%</w:t>
+            </w:r>
+          </w:p>
+        </w:tc>
+        <w:tc>
+          <w:tcPr>
+            <w:tcW w:type="dxa" w:w="1814"/>
+            <w:vAlign w:val="center"/>
+            <w:shd w:fill="F5F7F8"/>
+            <w:tcMar>
+              <w:top w:w="65" w:type="dxa"/>
+              <w:bottom w:w="65" w:type="dxa"/>
+              <w:left w:w="65" w:type="dxa"/>
+              <w:right w:w="65" w:type="dxa"/>
+            </w:tcMar>
+          </w:tcPr>
+          <w:p>
+            <w:pPr>
+              <w:spacing w:before="20" w:after="20" w:line="260" w:lineRule="exact"/>
+              <w:jc w:val="center"/>
+            </w:pPr>
+            <w:r>
+              <w:rPr>
+                <w:rFonts w:ascii="Arial" w:hAnsi="Arial" w:eastAsia="Songti SC"/>
+                <w:b w:val="0"/>
+                <w:sz w:val="18"/>
+              </w:rPr>
+              <w:t>0</w:t>
+            </w:r>
+          </w:p>
+        </w:tc>
+      </w:tr>
+      <w:tr>
+        <w:trPr>
+          <w:cantSplit/>
+        </w:trPr>
+        <w:tc>
+          <w:tcPr>
+            <w:tcW w:type="dxa" w:w="3628"/>
+            <w:vAlign w:val="center"/>
+            <w:shd w:fill="FFFFFF"/>
+            <w:tcMar>
+              <w:top w:w="65" w:type="dxa"/>
+              <w:bottom w:w="65" w:type="dxa"/>
+              <w:left w:w="65" w:type="dxa"/>
+              <w:right w:w="65" w:type="dxa"/>
+            </w:tcMar>
+          </w:tcPr>
+          <w:p>
+            <w:pPr>
+              <w:spacing w:before="20" w:after="20" w:line="260" w:lineRule="exact"/>
+              <w:jc w:val="left"/>
+            </w:pPr>
+            <w:r>
+              <w:rPr>
+                <w:rFonts w:ascii="Arial" w:hAnsi="Arial" w:eastAsia="Songti SC"/>
+                <w:b w:val="0"/>
+                <w:sz w:val="18"/>
+              </w:rPr>
+              <w:t>MAIN_1P 主压力</w:t>
+            </w:r>
+          </w:p>
+        </w:tc>
+        <w:tc>
+          <w:tcPr>
+            <w:tcW w:type="dxa" w:w="2041"/>
+            <w:vAlign w:val="center"/>
+            <w:shd w:fill="FFFFFF"/>
+            <w:tcMar>
+              <w:top w:w="65" w:type="dxa"/>
+              <w:bottom w:w="65" w:type="dxa"/>
+              <w:left w:w="65" w:type="dxa"/>
+              <w:right w:w="65" w:type="dxa"/>
+            </w:tcMar>
+          </w:tcPr>
+          <w:p>
+            <w:pPr>
+              <w:spacing w:before="20" w:after="20" w:line="260" w:lineRule="exact"/>
+              <w:jc w:val="center"/>
+            </w:pPr>
+            <w:r>
+              <w:rPr>
+                <w:rFonts w:ascii="Arial" w:hAnsi="Arial" w:eastAsia="Songti SC"/>
+                <w:b w:val="0"/>
+                <w:sz w:val="18"/>
+              </w:rPr>
+              <w:t>日VWAP近似</w:t>
+            </w:r>
+          </w:p>
+        </w:tc>
+        <w:tc>
+          <w:tcPr>
+            <w:tcW w:type="dxa" w:w="2041"/>
+            <w:vAlign w:val="center"/>
+            <w:shd w:fill="FFFFFF"/>
+            <w:tcMar>
+              <w:top w:w="65" w:type="dxa"/>
+              <w:bottom w:w="65" w:type="dxa"/>
+              <w:left w:w="65" w:type="dxa"/>
+              <w:right w:w="65" w:type="dxa"/>
+            </w:tcMar>
+          </w:tcPr>
+          <w:p>
+            <w:pPr>
+              <w:spacing w:before="20" w:after="20" w:line="260" w:lineRule="exact"/>
+              <w:jc w:val="center"/>
+            </w:pPr>
+            <w:r>
+              <w:rPr>
+                <w:rFonts w:ascii="Arial" w:hAnsi="Arial" w:eastAsia="Songti SC"/>
+                <w:b w:val="0"/>
+                <w:sz w:val="18"/>
+              </w:rPr>
+              <w:t>1%</w:t>
+            </w:r>
+          </w:p>
+        </w:tc>
+        <w:tc>
+          <w:tcPr>
+            <w:tcW w:type="dxa" w:w="1814"/>
+            <w:vAlign w:val="center"/>
+            <w:shd w:fill="FFFFFF"/>
+            <w:tcMar>
+              <w:top w:w="65" w:type="dxa"/>
+              <w:bottom w:w="65" w:type="dxa"/>
+              <w:left w:w="65" w:type="dxa"/>
+              <w:right w:w="65" w:type="dxa"/>
+            </w:tcMar>
+          </w:tcPr>
+          <w:p>
+            <w:pPr>
+              <w:spacing w:before="20" w:after="20" w:line="260" w:lineRule="exact"/>
+              <w:jc w:val="center"/>
+            </w:pPr>
+            <w:r>
+              <w:rPr>
+                <w:rFonts w:ascii="Arial" w:hAnsi="Arial" w:eastAsia="Songti SC"/>
+                <w:b w:val="0"/>
+                <w:sz w:val="18"/>
+              </w:rPr>
+              <w:t>0.5</w:t>
+            </w:r>
+          </w:p>
+        </w:tc>
+      </w:tr>
+      <w:tr>
+        <w:trPr>
+          <w:cantSplit/>
+        </w:trPr>
+        <w:tc>
+          <w:tcPr>
+            <w:tcW w:type="dxa" w:w="3628"/>
+            <w:vAlign w:val="center"/>
+            <w:shd w:fill="F5F7F8"/>
+            <w:tcMar>
+              <w:top w:w="65" w:type="dxa"/>
+              <w:bottom w:w="65" w:type="dxa"/>
+              <w:left w:w="65" w:type="dxa"/>
+              <w:right w:w="65" w:type="dxa"/>
+            </w:tcMar>
+          </w:tcPr>
+          <w:p>
+            <w:pPr>
+              <w:spacing w:before="20" w:after="20" w:line="260" w:lineRule="exact"/>
+              <w:jc w:val="left"/>
+            </w:pPr>
+            <w:r>
+              <w:rPr>
+                <w:rFonts w:ascii="Arial" w:hAnsi="Arial" w:eastAsia="Songti SC"/>
+                <w:b w:val="0"/>
+                <w:sz w:val="18"/>
+              </w:rPr>
+              <w:t>TIGHT_0P5 更紧容量</w:t>
+            </w:r>
+          </w:p>
+        </w:tc>
+        <w:tc>
+          <w:tcPr>
+            <w:tcW w:type="dxa" w:w="2041"/>
+            <w:vAlign w:val="center"/>
+            <w:shd w:fill="F5F7F8"/>
+            <w:tcMar>
+              <w:top w:w="65" w:type="dxa"/>
+              <w:bottom w:w="65" w:type="dxa"/>
+              <w:left w:w="65" w:type="dxa"/>
+              <w:right w:w="65" w:type="dxa"/>
+            </w:tcMar>
+          </w:tcPr>
+          <w:p>
+            <w:pPr>
+              <w:spacing w:before="20" w:after="20" w:line="260" w:lineRule="exact"/>
+              <w:jc w:val="center"/>
+            </w:pPr>
+            <w:r>
+              <w:rPr>
+                <w:rFonts w:ascii="Arial" w:hAnsi="Arial" w:eastAsia="Songti SC"/>
+                <w:b w:val="0"/>
+                <w:sz w:val="18"/>
+              </w:rPr>
+              <w:t>日VWAP近似</w:t>
+            </w:r>
+          </w:p>
+        </w:tc>
+        <w:tc>
+          <w:tcPr>
+            <w:tcW w:type="dxa" w:w="2041"/>
+            <w:vAlign w:val="center"/>
+            <w:shd w:fill="F5F7F8"/>
+            <w:tcMar>
+              <w:top w:w="65" w:type="dxa"/>
+              <w:bottom w:w="65" w:type="dxa"/>
+              <w:left w:w="65" w:type="dxa"/>
+              <w:right w:w="65" w:type="dxa"/>
+            </w:tcMar>
+          </w:tcPr>
+          <w:p>
+            <w:pPr>
+              <w:spacing w:before="20" w:after="20" w:line="260" w:lineRule="exact"/>
+              <w:jc w:val="center"/>
+            </w:pPr>
+            <w:r>
+              <w:rPr>
+                <w:rFonts w:ascii="Arial" w:hAnsi="Arial" w:eastAsia="Songti SC"/>
+                <w:b w:val="0"/>
+                <w:sz w:val="18"/>
+              </w:rPr>
+              <w:t>0.5%</w:t>
+            </w:r>
+          </w:p>
+        </w:tc>
+        <w:tc>
+          <w:tcPr>
+            <w:tcW w:type="dxa" w:w="1814"/>
+            <w:vAlign w:val="center"/>
+            <w:shd w:fill="F5F7F8"/>
+            <w:tcMar>
+              <w:top w:w="65" w:type="dxa"/>
+              <w:bottom w:w="65" w:type="dxa"/>
+              <w:left w:w="65" w:type="dxa"/>
+              <w:right w:w="65" w:type="dxa"/>
+            </w:tcMar>
+          </w:tcPr>
+          <w:p>
+            <w:pPr>
+              <w:spacing w:before="20" w:after="20" w:line="260" w:lineRule="exact"/>
+              <w:jc w:val="center"/>
+            </w:pPr>
+            <w:r>
+              <w:rPr>
+                <w:rFonts w:ascii="Arial" w:hAnsi="Arial" w:eastAsia="Songti SC"/>
+                <w:b w:val="0"/>
+                <w:sz w:val="18"/>
+              </w:rPr>
+              <w:t>0.5</w:t>
+            </w:r>
+          </w:p>
+        </w:tc>
+      </w:tr>
+      <w:tr>
+        <w:trPr>
+          <w:cantSplit/>
+        </w:trPr>
+        <w:tc>
+          <w:tcPr>
+            <w:tcW w:type="dxa" w:w="3628"/>
+            <w:vAlign w:val="center"/>
+            <w:shd w:fill="FFFFFF"/>
+            <w:tcMar>
+              <w:top w:w="65" w:type="dxa"/>
+              <w:bottom w:w="65" w:type="dxa"/>
+              <w:left w:w="65" w:type="dxa"/>
+              <w:right w:w="65" w:type="dxa"/>
+            </w:tcMar>
+          </w:tcPr>
+          <w:p>
+            <w:pPr>
+              <w:spacing w:before="20" w:after="20" w:line="260" w:lineRule="exact"/>
+              <w:jc w:val="left"/>
+            </w:pPr>
+            <w:r>
+              <w:rPr>
+                <w:rFonts w:ascii="Arial" w:hAnsi="Arial" w:eastAsia="Songti SC"/>
+                <w:b w:val="0"/>
+                <w:sz w:val="18"/>
+              </w:rPr>
+              <w:t>LOOSE_5P 更宽容量</w:t>
+            </w:r>
+          </w:p>
+        </w:tc>
+        <w:tc>
+          <w:tcPr>
+            <w:tcW w:type="dxa" w:w="2041"/>
+            <w:vAlign w:val="center"/>
+            <w:shd w:fill="FFFFFF"/>
+            <w:tcMar>
+              <w:top w:w="65" w:type="dxa"/>
+              <w:bottom w:w="65" w:type="dxa"/>
+              <w:left w:w="65" w:type="dxa"/>
+              <w:right w:w="65" w:type="dxa"/>
+            </w:tcMar>
+          </w:tcPr>
+          <w:p>
+            <w:pPr>
+              <w:spacing w:before="20" w:after="20" w:line="260" w:lineRule="exact"/>
+              <w:jc w:val="center"/>
+            </w:pPr>
+            <w:r>
+              <w:rPr>
+                <w:rFonts w:ascii="Arial" w:hAnsi="Arial" w:eastAsia="Songti SC"/>
+                <w:b w:val="0"/>
+                <w:sz w:val="18"/>
+              </w:rPr>
+              <w:t>日VWAP近似</w:t>
+            </w:r>
+          </w:p>
+        </w:tc>
+        <w:tc>
+          <w:tcPr>
+            <w:tcW w:type="dxa" w:w="2041"/>
+            <w:vAlign w:val="center"/>
+            <w:shd w:fill="FFFFFF"/>
+            <w:tcMar>
+              <w:top w:w="65" w:type="dxa"/>
+              <w:bottom w:w="65" w:type="dxa"/>
+              <w:left w:w="65" w:type="dxa"/>
+              <w:right w:w="65" w:type="dxa"/>
+            </w:tcMar>
+          </w:tcPr>
+          <w:p>
+            <w:pPr>
+              <w:spacing w:before="20" w:after="20" w:line="260" w:lineRule="exact"/>
+              <w:jc w:val="center"/>
+            </w:pPr>
+            <w:r>
+              <w:rPr>
+                <w:rFonts w:ascii="Arial" w:hAnsi="Arial" w:eastAsia="Songti SC"/>
+                <w:b w:val="0"/>
+                <w:sz w:val="18"/>
+              </w:rPr>
+              <w:t>5%</w:t>
+            </w:r>
+          </w:p>
+        </w:tc>
+        <w:tc>
+          <w:tcPr>
+            <w:tcW w:type="dxa" w:w="1814"/>
+            <w:vAlign w:val="center"/>
+            <w:shd w:fill="FFFFFF"/>
+            <w:tcMar>
+              <w:top w:w="65" w:type="dxa"/>
+              <w:bottom w:w="65" w:type="dxa"/>
+              <w:left w:w="65" w:type="dxa"/>
+              <w:right w:w="65" w:type="dxa"/>
+            </w:tcMar>
+          </w:tcPr>
+          <w:p>
+            <w:pPr>
+              <w:spacing w:before="20" w:after="20" w:line="260" w:lineRule="exact"/>
+              <w:jc w:val="center"/>
+            </w:pPr>
+            <w:r>
+              <w:rPr>
+                <w:rFonts w:ascii="Arial" w:hAnsi="Arial" w:eastAsia="Songti SC"/>
+                <w:b w:val="0"/>
+                <w:sz w:val="18"/>
+              </w:rPr>
+              <w:t>0.5</w:t>
+            </w:r>
+          </w:p>
+        </w:tc>
+      </w:tr>
+      <w:tr>
+        <w:trPr>
+          <w:cantSplit/>
+        </w:trPr>
+        <w:tc>
+          <w:tcPr>
+            <w:tcW w:type="dxa" w:w="3628"/>
+            <w:vAlign w:val="center"/>
+            <w:shd w:fill="F5F7F8"/>
+            <w:tcMar>
+              <w:top w:w="65" w:type="dxa"/>
+              <w:bottom w:w="65" w:type="dxa"/>
+              <w:left w:w="65" w:type="dxa"/>
+              <w:right w:w="65" w:type="dxa"/>
+            </w:tcMar>
+          </w:tcPr>
+          <w:p>
+            <w:pPr>
+              <w:spacing w:before="20" w:after="20" w:line="260" w:lineRule="exact"/>
+              <w:jc w:val="left"/>
+            </w:pPr>
+            <w:r>
+              <w:rPr>
+                <w:rFonts w:ascii="Arial" w:hAnsi="Arial" w:eastAsia="Songti SC"/>
+                <w:b w:val="0"/>
+                <w:sz w:val="18"/>
+              </w:rPr>
+              <w:t>IMPACT_HIGH_1P 更高冲击</w:t>
+            </w:r>
+          </w:p>
+        </w:tc>
+        <w:tc>
+          <w:tcPr>
+            <w:tcW w:type="dxa" w:w="2041"/>
+            <w:vAlign w:val="center"/>
+            <w:shd w:fill="F5F7F8"/>
+            <w:tcMar>
+              <w:top w:w="65" w:type="dxa"/>
+              <w:bottom w:w="65" w:type="dxa"/>
+              <w:left w:w="65" w:type="dxa"/>
+              <w:right w:w="65" w:type="dxa"/>
+            </w:tcMar>
+          </w:tcPr>
+          <w:p>
+            <w:pPr>
+              <w:spacing w:before="20" w:after="20" w:line="260" w:lineRule="exact"/>
+              <w:jc w:val="center"/>
+            </w:pPr>
+            <w:r>
+              <w:rPr>
+                <w:rFonts w:ascii="Arial" w:hAnsi="Arial" w:eastAsia="Songti SC"/>
+                <w:b w:val="0"/>
+                <w:sz w:val="18"/>
+              </w:rPr>
+              <w:t>日VWAP近似</w:t>
+            </w:r>
+          </w:p>
+        </w:tc>
+        <w:tc>
+          <w:tcPr>
+            <w:tcW w:type="dxa" w:w="2041"/>
+            <w:vAlign w:val="center"/>
+            <w:shd w:fill="F5F7F8"/>
+            <w:tcMar>
+              <w:top w:w="65" w:type="dxa"/>
+              <w:bottom w:w="65" w:type="dxa"/>
+              <w:left w:w="65" w:type="dxa"/>
+              <w:right w:w="65" w:type="dxa"/>
+            </w:tcMar>
+          </w:tcPr>
+          <w:p>
+            <w:pPr>
+              <w:spacing w:before="20" w:after="20" w:line="260" w:lineRule="exact"/>
+              <w:jc w:val="center"/>
+            </w:pPr>
+            <w:r>
+              <w:rPr>
+                <w:rFonts w:ascii="Arial" w:hAnsi="Arial" w:eastAsia="Songti SC"/>
+                <w:b w:val="0"/>
+                <w:sz w:val="18"/>
+              </w:rPr>
+              <w:t>1%</w:t>
+            </w:r>
+          </w:p>
+        </w:tc>
+        <w:tc>
+          <w:tcPr>
+            <w:tcW w:type="dxa" w:w="1814"/>
+            <w:vAlign w:val="center"/>
+            <w:shd w:fill="F5F7F8"/>
+            <w:tcMar>
+              <w:top w:w="65" w:type="dxa"/>
+              <w:bottom w:w="65" w:type="dxa"/>
+              <w:left w:w="65" w:type="dxa"/>
+              <w:right w:w="65" w:type="dxa"/>
+            </w:tcMar>
+          </w:tcPr>
+          <w:p>
+            <w:pPr>
+              <w:spacing w:before="20" w:after="20" w:line="260" w:lineRule="exact"/>
+              <w:jc w:val="center"/>
+            </w:pPr>
+            <w:r>
+              <w:rPr>
+                <w:rFonts w:ascii="Arial" w:hAnsi="Arial" w:eastAsia="Songti SC"/>
+                <w:b w:val="0"/>
+                <w:sz w:val="18"/>
+              </w:rPr>
+              <w:t>1.0</w:t>
+            </w:r>
+          </w:p>
+        </w:tc>
+      </w:tr>
+    </w:tbl>
+    <w:p>
+      <w:pPr>
+        <w:spacing w:after="0" w:line="60" w:lineRule="exact"/>
+      </w:pPr>
+    </w:p>
+    <w:p>
+      <w:pPr>
+        <w:spacing w:after="80" w:line="260" w:lineRule="exact"/>
+      </w:pPr>
+      <w:r>
+        <w:rPr>
+          <w:rFonts w:ascii="Arial" w:hAnsi="Arial" w:eastAsia="Songti SC"/>
+          <w:b w:val="0"/>
+          <w:color w:val="000000"/>
+          <w:sz w:val="18"/>
+        </w:rPr>
+        <w:t>所有场景保留100股整手和最低5元佣金。CAP_1P_SIGMA与主压力场景要求同样的已知σ，但不收增量冲击，用于把σ缺失覆盖变化与冲击路径分开。该对照在输入覆盖核验后、场景结果评估前加入。</w:t>
+      </w:r>
+    </w:p>
+    <w:p>
+      <w:pPr>
+        <w:pStyle w:val="Heading2"/>
+        <w:spacing w:after="80" w:line="360" w:lineRule="exact"/>
+      </w:pPr>
+      <w:r>
+        <w:rPr>
+          <w:rFonts w:ascii="Arial" w:hAnsi="Arial" w:eastAsia="Songti SC"/>
+          <w:b/>
+          <w:color w:val="000000"/>
+          <w:sz w:val="24"/>
+        </w:rPr>
+        <w:t>只把当日数据用于成交结果</w:t>
+      </w:r>
+    </w:p>
+    <w:p>
+      <w:pPr>
+        <w:spacing w:after="80" w:line="280" w:lineRule="exact"/>
+      </w:pPr>
+      <w:r>
+        <w:rPr>
+          <w:rFonts w:ascii="Arial" w:hAnsi="Arial" w:eastAsia="Songti SC"/>
+          <w:b w:val="0"/>
+          <w:color w:val="000000"/>
+          <w:sz w:val="20"/>
+        </w:rPr>
+        <w:t>选股、目标与预算使用事前信息。ADV是前20个交易日成交额均值，σ是前20个交易日复权日收益的样本标准差，均滞后一日且要求20个已知观察。当日金额与成交量换算的全天VWAP仅作成交参照，并核对最高最低价；保留原开盘可交易条件，再增加日内停牌、数据有效性和一字板筛选。因此VWAP与开盘基准之差同时包含价格和资格变化。</w:t>
+      </w:r>
+    </w:p>
+    <w:p>
+      <w:pPr>
+        <w:spacing w:after="80" w:line="280" w:lineRule="exact"/>
+      </w:pPr>
+      <w:r>
+        <w:rPr>
+          <w:rFonts w:ascii="Arial" w:hAnsi="Arial" w:eastAsia="Songti SC"/>
+          <w:b w:val="0"/>
+          <w:color w:val="000000"/>
+          <w:sz w:val="20"/>
+        </w:rPr>
+        <w:t>同一股票同一天的买卖共同使用金额上限min（p×滞后ADV，p×当日成交额），而非每笔独享容量。仅有证据的全天停牌可以令成交额记0；未知值保留未知并阻单。</w:t>
+      </w:r>
+    </w:p>
+    <w:p>
+      <w:pPr>
+        <w:pStyle w:val="Heading2"/>
+        <w:spacing w:after="80" w:line="360" w:lineRule="exact"/>
+      </w:pPr>
+      <w:r>
+        <w:rPr>
+          <w:rFonts w:ascii="Arial" w:hAnsi="Arial" w:eastAsia="Songti SC"/>
+          <w:b/>
+          <w:color w:val="000000"/>
+          <w:sz w:val="24"/>
+        </w:rPr>
+        <w:t>费用 预算与部分成交</w:t>
+      </w:r>
+    </w:p>
+    <w:p>
+      <w:pPr>
+        <w:spacing w:after="80" w:line="312" w:lineRule="auto"/>
+        <w:jc w:val="center"/>
+      </w:pPr>
+      <m:oMath>
+        <m:r>
+          <m:t>C(Q) = η × σ × Q × </m:t>
+        </m:r>
+        <m:rad>
+          <m:radPr>
+            <m:degHide m:val="1"/>
+          </m:radPr>
+          <m:deg/>
+          <m:e>
+            <m:f>
+              <m:num>
+                <m:r>
+                  <m:t>Q</m:t>
+                </m:r>
+              </m:num>
+              <m:den>
+                <m:r>
+                  <m:t>ADV</m:t>
+                </m:r>
+              </m:den>
+            </m:f>
+          </m:e>
+        </m:rad>
+      </m:oMath>
+    </w:p>
+    <w:p>
+      <w:pPr>
+        <w:spacing w:after="80" w:line="280" w:lineRule="exact"/>
+      </w:pPr>
+      <w:r>
+        <w:rPr>
+          <w:rFonts w:ascii="Arial" w:hAnsi="Arial" w:eastAsia="Songti SC"/>
+          <w:b w:val="0"/>
+          <w:color w:val="000000"/>
+          <w:sz w:val="20"/>
+        </w:rPr>
+        <w:t>Q为同股同日累计成交金额，每笔只收C（成交后Q）减C（成交前Q）。基础费用为27.5bp其他成本加2.5bp佣金，佣金每笔最低5元；冲击在此之外另计，不再改价重复收费。η为未校准的压力参数，不是实际冲击成本估计。</w:t>
+      </w:r>
+    </w:p>
+    <w:p>
+      <w:pPr>
+        <w:spacing w:after="80" w:line="280" w:lineRule="exact"/>
+      </w:pPr>
+      <w:r>
+        <w:rPr>
+          <w:rFonts w:ascii="Arial" w:hAnsi="Arial" w:eastAsia="Songti SC"/>
+          <w:b w:val="0"/>
+          <w:color w:val="000000"/>
+          <w:sz w:val="20"/>
+        </w:rPr>
+        <w:t>买入按已知涨停价及保守冲击预算安排，仅用前收盘现金；当日卖款不能资助当日买单。普通订单部分成交后继续尝试；ST剩余卖单及顺延补仓共用原风险事件的一个槽位，后续卖款与未完补仓保留，月末重新设定目标另记日志。</w:t>
+      </w:r>
+    </w:p>
+    <w:p>
+      <w:pPr>
+        <w:pStyle w:val="Heading1"/>
+        <w:pageBreakBefore/>
+        <w:spacing w:line="480" w:lineRule="exact"/>
+      </w:pPr>
+      <w:r>
+        <w:rPr>
+          <w:rFonts w:eastAsia="Songti SC"/>
+          <w:color w:val="000000"/>
+        </w:rPr>
+        <w:t>13  历史留出期的资金规模压力结果</w:t>
+      </w:r>
+    </w:p>
+    <w:p>
+      <w:pPr>
+        <w:spacing w:after="80" w:line="280" w:lineRule="exact"/>
+      </w:pPr>
+      <w:r>
+        <w:rPr>
+          <w:rFonts w:ascii="Arial" w:hAnsi="Arial" w:eastAsia="Songti SC"/>
+          <w:b w:val="0"/>
+          <w:color w:val="000000"/>
+          <w:sz w:val="20"/>
+        </w:rPr>
+        <w:t>表18使用相同现金起点逐档比较，基准本身也执行整手与最低佣金。这里的资金是期初投入额，账户随后复利；不能与原策略承接2023年持仓的23.42%年化直接相减。</w:t>
+      </w:r>
+    </w:p>
+    <w:p>
+      <w:pPr>
+        <w:keepNext/>
+        <w:spacing w:after="80" w:line="280" w:lineRule="exact"/>
+      </w:pPr>
+      <w:r>
+        <w:rPr>
+          <w:rFonts w:ascii="Arial" w:hAnsi="Arial" w:eastAsia="Songti SC"/>
+          <w:b/>
+          <w:color w:val="000000"/>
+          <w:sz w:val="20"/>
+        </w:rPr>
+        <w:t>表18  开盘基准与主压力场景 2024—2025</w:t>
+      </w:r>
+    </w:p>
+    <w:tbl>
+      <w:tblPr>
+        <w:tblW w:type="auto" w:w="0"/>
+        <w:jc w:val="center"/>
+        <w:tblLayout w:type="fixed"/>
+        <w:tblLook w:firstColumn="1" w:firstRow="1" w:lastColumn="0" w:lastRow="0" w:noHBand="0" w:noVBand="1" w:val="04A0"/>
+        <w:tblBorders>
+          <w:top w:val="single" w:sz="4" w:color="D9D9D9"/>
+          <w:bottom w:val="single" w:sz="4" w:color="D9D9D9"/>
+          <w:left w:val="single" w:sz="4" w:color="D9D9D9"/>
+          <w:right w:val="single" w:sz="4" w:color="D9D9D9"/>
+          <w:insideH w:val="single" w:sz="4" w:color="D9D9D9"/>
+          <w:insideV w:val="single" w:sz="4" w:color="D9D9D9"/>
+        </w:tblBorders>
+      </w:tblPr>
+      <w:tblGrid>
+        <w:gridCol w:w="1361"/>
+        <w:gridCol w:w="1361"/>
+        <w:gridCol w:w="1361"/>
+        <w:gridCol w:w="850"/>
+        <w:gridCol w:w="1531"/>
+        <w:gridCol w:w="1531"/>
+        <w:gridCol w:w="1531"/>
+      </w:tblGrid>
+      <w:tr>
+        <w:trPr>
+          <w:cantSplit/>
+          <w:tblHeader/>
+        </w:trPr>
+        <w:tc>
+          <w:tcPr>
+            <w:tcW w:type="dxa" w:w="1361"/>
+            <w:vAlign w:val="center"/>
+            <w:shd w:fill="E7EBEE"/>
+            <w:tcMar>
+              <w:top w:w="65" w:type="dxa"/>
+              <w:bottom w:w="65" w:type="dxa"/>
+              <w:left w:w="65" w:type="dxa"/>
+              <w:right w:w="65" w:type="dxa"/>
+            </w:tcMar>
+          </w:tcPr>
+          <w:p>
+            <w:pPr>
+              <w:spacing w:before="20" w:after="20" w:line="260" w:lineRule="exact"/>
+              <w:jc w:val="left"/>
+            </w:pPr>
+            <w:r>
+              <w:rPr>
+                <w:rFonts w:ascii="Arial" w:hAnsi="Arial" w:eastAsia="Songti SC"/>
+                <w:b/>
+                <w:sz w:val="18"/>
+              </w:rPr>
+              <w:t>初始资金</w:t>
+            </w:r>
+          </w:p>
+        </w:tc>
+        <w:tc>
+          <w:tcPr>
+            <w:tcW w:type="dxa" w:w="1361"/>
+            <w:vAlign w:val="center"/>
+            <w:shd w:fill="E7EBEE"/>
+            <w:tcMar>
+              <w:top w:w="65" w:type="dxa"/>
+              <w:bottom w:w="65" w:type="dxa"/>
+              <w:left w:w="65" w:type="dxa"/>
+              <w:right w:w="65" w:type="dxa"/>
+            </w:tcMar>
+          </w:tcPr>
+          <w:p>
+            <w:pPr>
+              <w:spacing w:before="20" w:after="20" w:line="260" w:lineRule="exact"/>
+              <w:jc w:val="center"/>
+            </w:pPr>
+            <w:r>
+              <w:rPr>
+                <w:rFonts w:ascii="Arial" w:hAnsi="Arial" w:eastAsia="Songti SC"/>
+                <w:b/>
+                <w:sz w:val="18"/>
+              </w:rPr>
+              <w:t>基准年化</w:t>
+            </w:r>
+          </w:p>
+        </w:tc>
+        <w:tc>
+          <w:tcPr>
+            <w:tcW w:type="dxa" w:w="1361"/>
+            <w:vAlign w:val="center"/>
+            <w:shd w:fill="E7EBEE"/>
+            <w:tcMar>
+              <w:top w:w="65" w:type="dxa"/>
+              <w:bottom w:w="65" w:type="dxa"/>
+              <w:left w:w="65" w:type="dxa"/>
+              <w:right w:w="65" w:type="dxa"/>
+            </w:tcMar>
+          </w:tcPr>
+          <w:p>
+            <w:pPr>
+              <w:spacing w:before="20" w:after="20" w:line="260" w:lineRule="exact"/>
+              <w:jc w:val="center"/>
+            </w:pPr>
+            <w:r>
+              <w:rPr>
+                <w:rFonts w:ascii="Arial" w:hAnsi="Arial" w:eastAsia="Songti SC"/>
+                <w:b/>
+                <w:sz w:val="18"/>
+              </w:rPr>
+              <w:t>主压力</w:t>
+              <w:br/>
+              <w:t>年化</w:t>
+            </w:r>
+          </w:p>
+        </w:tc>
+        <w:tc>
+          <w:tcPr>
+            <w:tcW w:type="dxa" w:w="850"/>
+            <w:vAlign w:val="center"/>
+            <w:shd w:fill="E7EBEE"/>
+            <w:tcMar>
+              <w:top w:w="65" w:type="dxa"/>
+              <w:bottom w:w="65" w:type="dxa"/>
+              <w:left w:w="65" w:type="dxa"/>
+              <w:right w:w="65" w:type="dxa"/>
+            </w:tcMar>
+          </w:tcPr>
+          <w:p>
+            <w:pPr>
+              <w:spacing w:before="20" w:after="20" w:line="260" w:lineRule="exact"/>
+              <w:jc w:val="center"/>
+            </w:pPr>
+            <w:r>
+              <w:rPr>
+                <w:rFonts w:ascii="Arial" w:hAnsi="Arial" w:eastAsia="Songti SC"/>
+                <w:b/>
+                <w:sz w:val="18"/>
+              </w:rPr>
+              <w:t>主压力</w:t>
+              <w:br/>
+              <w:t>夏普</w:t>
+            </w:r>
+          </w:p>
+        </w:tc>
+        <w:tc>
+          <w:tcPr>
+            <w:tcW w:type="dxa" w:w="1531"/>
+            <w:vAlign w:val="center"/>
+            <w:shd w:fill="E7EBEE"/>
+            <w:tcMar>
+              <w:top w:w="65" w:type="dxa"/>
+              <w:bottom w:w="65" w:type="dxa"/>
+              <w:left w:w="65" w:type="dxa"/>
+              <w:right w:w="65" w:type="dxa"/>
+            </w:tcMar>
+          </w:tcPr>
+          <w:p>
+            <w:pPr>
+              <w:spacing w:before="20" w:after="20" w:line="260" w:lineRule="exact"/>
+              <w:jc w:val="center"/>
+            </w:pPr>
+            <w:r>
+              <w:rPr>
+                <w:rFonts w:ascii="Arial" w:hAnsi="Arial" w:eastAsia="Songti SC"/>
+                <w:b/>
+                <w:sz w:val="18"/>
+              </w:rPr>
+              <w:t>主压力</w:t>
+              <w:br/>
+              <w:t>日度回撤</w:t>
+            </w:r>
+          </w:p>
+        </w:tc>
+        <w:tc>
+          <w:tcPr>
+            <w:tcW w:type="dxa" w:w="1531"/>
+            <w:vAlign w:val="center"/>
+            <w:shd w:fill="E7EBEE"/>
+            <w:tcMar>
+              <w:top w:w="65" w:type="dxa"/>
+              <w:bottom w:w="65" w:type="dxa"/>
+              <w:left w:w="65" w:type="dxa"/>
+              <w:right w:w="65" w:type="dxa"/>
+            </w:tcMar>
+          </w:tcPr>
+          <w:p>
+            <w:pPr>
+              <w:spacing w:before="20" w:after="20" w:line="260" w:lineRule="exact"/>
+              <w:jc w:val="center"/>
+            </w:pPr>
+            <w:r>
+              <w:rPr>
+                <w:rFonts w:ascii="Arial" w:hAnsi="Arial" w:eastAsia="Songti SC"/>
+                <w:b/>
+                <w:sz w:val="18"/>
+              </w:rPr>
+              <w:t>尝试金额</w:t>
+              <w:br/>
+              <w:t>完成率</w:t>
+            </w:r>
+          </w:p>
+        </w:tc>
+        <w:tc>
+          <w:tcPr>
+            <w:tcW w:type="dxa" w:w="1531"/>
+            <w:vAlign w:val="center"/>
+            <w:shd w:fill="E7EBEE"/>
+            <w:tcMar>
+              <w:top w:w="65" w:type="dxa"/>
+              <w:bottom w:w="65" w:type="dxa"/>
+              <w:left w:w="65" w:type="dxa"/>
+              <w:right w:w="65" w:type="dxa"/>
+            </w:tcMar>
+          </w:tcPr>
+          <w:p>
+            <w:pPr>
+              <w:spacing w:before="20" w:after="20" w:line="260" w:lineRule="exact"/>
+              <w:jc w:val="center"/>
+            </w:pPr>
+            <w:r>
+              <w:rPr>
+                <w:rFonts w:ascii="Arial" w:hAnsi="Arial" w:eastAsia="Songti SC"/>
+                <w:b/>
+                <w:sz w:val="18"/>
+              </w:rPr>
+              <w:t>平均现金</w:t>
+            </w:r>
+          </w:p>
+        </w:tc>
+      </w:tr>
+      <w:tr>
+        <w:trPr>
+          <w:cantSplit/>
+        </w:trPr>
+        <w:tc>
+          <w:tcPr>
+            <w:tcW w:type="dxa" w:w="1361"/>
+            <w:vAlign w:val="center"/>
+            <w:shd w:fill="FFFFFF"/>
+            <w:tcMar>
+              <w:top w:w="65" w:type="dxa"/>
+              <w:bottom w:w="65" w:type="dxa"/>
+              <w:left w:w="65" w:type="dxa"/>
+              <w:right w:w="65" w:type="dxa"/>
+            </w:tcMar>
+          </w:tcPr>
+          <w:p>
+            <w:pPr>
+              <w:spacing w:before="20" w:after="20" w:line="260" w:lineRule="exact"/>
+              <w:jc w:val="left"/>
+            </w:pPr>
+            <w:r>
+              <w:rPr>
+                <w:rFonts w:ascii="Arial" w:hAnsi="Arial" w:eastAsia="Songti SC"/>
+                <w:b w:val="0"/>
+                <w:sz w:val="18"/>
+              </w:rPr>
+              <w:t>10万元</w:t>
+            </w:r>
+          </w:p>
+        </w:tc>
+        <w:tc>
+          <w:tcPr>
+            <w:tcW w:type="dxa" w:w="1361"/>
+            <w:vAlign w:val="center"/>
+            <w:shd w:fill="FFFFFF"/>
+            <w:tcMar>
+              <w:top w:w="65" w:type="dxa"/>
+              <w:bottom w:w="65" w:type="dxa"/>
+              <w:left w:w="65" w:type="dxa"/>
+              <w:right w:w="65" w:type="dxa"/>
+            </w:tcMar>
+          </w:tcPr>
+          <w:p>
+            <w:pPr>
+              <w:spacing w:before="20" w:after="20" w:line="260" w:lineRule="exact"/>
+              <w:jc w:val="center"/>
+            </w:pPr>
+            <w:r>
+              <w:rPr>
+                <w:rFonts w:ascii="Arial" w:hAnsi="Arial" w:eastAsia="Songti SC"/>
+                <w:b w:val="0"/>
+                <w:sz w:val="18"/>
+              </w:rPr>
+              <w:t>17.17%</w:t>
+            </w:r>
+          </w:p>
+        </w:tc>
+        <w:tc>
+          <w:tcPr>
+            <w:tcW w:type="dxa" w:w="1361"/>
+            <w:vAlign w:val="center"/>
+            <w:shd w:fill="FFFFFF"/>
+            <w:tcMar>
+              <w:top w:w="65" w:type="dxa"/>
+              <w:bottom w:w="65" w:type="dxa"/>
+              <w:left w:w="65" w:type="dxa"/>
+              <w:right w:w="65" w:type="dxa"/>
+            </w:tcMar>
+          </w:tcPr>
+          <w:p>
+            <w:pPr>
+              <w:spacing w:before="20" w:after="20" w:line="260" w:lineRule="exact"/>
+              <w:jc w:val="center"/>
+            </w:pPr>
+            <w:r>
+              <w:rPr>
+                <w:rFonts w:ascii="Arial" w:hAnsi="Arial" w:eastAsia="Songti SC"/>
+                <w:b w:val="0"/>
+                <w:sz w:val="18"/>
+              </w:rPr>
+              <w:t>17.51%</w:t>
+            </w:r>
+          </w:p>
+        </w:tc>
+        <w:tc>
+          <w:tcPr>
+            <w:tcW w:type="dxa" w:w="850"/>
+            <w:vAlign w:val="center"/>
+            <w:shd w:fill="FFFFFF"/>
+            <w:tcMar>
+              <w:top w:w="65" w:type="dxa"/>
+              <w:bottom w:w="65" w:type="dxa"/>
+              <w:left w:w="65" w:type="dxa"/>
+              <w:right w:w="65" w:type="dxa"/>
+            </w:tcMar>
+          </w:tcPr>
+          <w:p>
+            <w:pPr>
+              <w:spacing w:before="20" w:after="20" w:line="260" w:lineRule="exact"/>
+              <w:jc w:val="center"/>
+            </w:pPr>
+            <w:r>
+              <w:rPr>
+                <w:rFonts w:ascii="Arial" w:hAnsi="Arial" w:eastAsia="Songti SC"/>
+                <w:b w:val="0"/>
+                <w:sz w:val="18"/>
+              </w:rPr>
+              <w:t>0.92</w:t>
+            </w:r>
+          </w:p>
+        </w:tc>
+        <w:tc>
+          <w:tcPr>
+            <w:tcW w:type="dxa" w:w="1531"/>
+            <w:vAlign w:val="center"/>
+            <w:shd w:fill="FFFFFF"/>
+            <w:tcMar>
+              <w:top w:w="65" w:type="dxa"/>
+              <w:bottom w:w="65" w:type="dxa"/>
+              <w:left w:w="65" w:type="dxa"/>
+              <w:right w:w="65" w:type="dxa"/>
+            </w:tcMar>
+          </w:tcPr>
+          <w:p>
+            <w:pPr>
+              <w:spacing w:before="20" w:after="20" w:line="260" w:lineRule="exact"/>
+              <w:jc w:val="center"/>
+            </w:pPr>
+            <w:r>
+              <w:rPr>
+                <w:rFonts w:ascii="Arial" w:hAnsi="Arial" w:eastAsia="Songti SC"/>
+                <w:b w:val="0"/>
+                <w:sz w:val="18"/>
+              </w:rPr>
+              <w:t>-21.70%</w:t>
+            </w:r>
+          </w:p>
+        </w:tc>
+        <w:tc>
+          <w:tcPr>
+            <w:tcW w:type="dxa" w:w="1531"/>
+            <w:vAlign w:val="center"/>
+            <w:shd w:fill="FFFFFF"/>
+            <w:tcMar>
+              <w:top w:w="65" w:type="dxa"/>
+              <w:bottom w:w="65" w:type="dxa"/>
+              <w:left w:w="65" w:type="dxa"/>
+              <w:right w:w="65" w:type="dxa"/>
+            </w:tcMar>
+          </w:tcPr>
+          <w:p>
+            <w:pPr>
+              <w:spacing w:before="20" w:after="20" w:line="260" w:lineRule="exact"/>
+              <w:jc w:val="center"/>
+            </w:pPr>
+            <w:r>
+              <w:rPr>
+                <w:rFonts w:ascii="Arial" w:hAnsi="Arial" w:eastAsia="Songti SC"/>
+                <w:b w:val="0"/>
+                <w:sz w:val="18"/>
+              </w:rPr>
+              <w:t>80.95%</w:t>
+            </w:r>
+          </w:p>
+        </w:tc>
+        <w:tc>
+          <w:tcPr>
+            <w:tcW w:type="dxa" w:w="1531"/>
+            <w:vAlign w:val="center"/>
+            <w:shd w:fill="FFFFFF"/>
+            <w:tcMar>
+              <w:top w:w="65" w:type="dxa"/>
+              <w:bottom w:w="65" w:type="dxa"/>
+              <w:left w:w="65" w:type="dxa"/>
+              <w:right w:w="65" w:type="dxa"/>
+            </w:tcMar>
+          </w:tcPr>
+          <w:p>
+            <w:pPr>
+              <w:spacing w:before="20" w:after="20" w:line="260" w:lineRule="exact"/>
+              <w:jc w:val="center"/>
+            </w:pPr>
+            <w:r>
+              <w:rPr>
+                <w:rFonts w:ascii="Arial" w:hAnsi="Arial" w:eastAsia="Songti SC"/>
+                <w:b w:val="0"/>
+                <w:sz w:val="18"/>
+              </w:rPr>
+              <w:t>45.46%</w:t>
+            </w:r>
+          </w:p>
+        </w:tc>
+      </w:tr>
+      <w:tr>
+        <w:trPr>
+          <w:cantSplit/>
+        </w:trPr>
+        <w:tc>
+          <w:tcPr>
+            <w:tcW w:type="dxa" w:w="1361"/>
+            <w:vAlign w:val="center"/>
+            <w:shd w:fill="F5F7F8"/>
+            <w:tcMar>
+              <w:top w:w="65" w:type="dxa"/>
+              <w:bottom w:w="65" w:type="dxa"/>
+              <w:left w:w="65" w:type="dxa"/>
+              <w:right w:w="65" w:type="dxa"/>
+            </w:tcMar>
+          </w:tcPr>
+          <w:p>
+            <w:pPr>
+              <w:spacing w:before="20" w:after="20" w:line="260" w:lineRule="exact"/>
+              <w:jc w:val="left"/>
+            </w:pPr>
+            <w:r>
+              <w:rPr>
+                <w:rFonts w:ascii="Arial" w:hAnsi="Arial" w:eastAsia="Songti SC"/>
+                <w:b w:val="0"/>
+                <w:sz w:val="18"/>
+              </w:rPr>
+              <w:t>30万元</w:t>
+            </w:r>
+          </w:p>
+        </w:tc>
+        <w:tc>
+          <w:tcPr>
+            <w:tcW w:type="dxa" w:w="1361"/>
+            <w:vAlign w:val="center"/>
+            <w:shd w:fill="F5F7F8"/>
+            <w:tcMar>
+              <w:top w:w="65" w:type="dxa"/>
+              <w:bottom w:w="65" w:type="dxa"/>
+              <w:left w:w="65" w:type="dxa"/>
+              <w:right w:w="65" w:type="dxa"/>
+            </w:tcMar>
+          </w:tcPr>
+          <w:p>
+            <w:pPr>
+              <w:spacing w:before="20" w:after="20" w:line="260" w:lineRule="exact"/>
+              <w:jc w:val="center"/>
+            </w:pPr>
+            <w:r>
+              <w:rPr>
+                <w:rFonts w:ascii="Arial" w:hAnsi="Arial" w:eastAsia="Songti SC"/>
+                <w:b w:val="0"/>
+                <w:sz w:val="18"/>
+              </w:rPr>
+              <w:t>21.35%</w:t>
+            </w:r>
+          </w:p>
+        </w:tc>
+        <w:tc>
+          <w:tcPr>
+            <w:tcW w:type="dxa" w:w="1361"/>
+            <w:vAlign w:val="center"/>
+            <w:shd w:fill="F5F7F8"/>
+            <w:tcMar>
+              <w:top w:w="65" w:type="dxa"/>
+              <w:bottom w:w="65" w:type="dxa"/>
+              <w:left w:w="65" w:type="dxa"/>
+              <w:right w:w="65" w:type="dxa"/>
+            </w:tcMar>
+          </w:tcPr>
+          <w:p>
+            <w:pPr>
+              <w:spacing w:before="20" w:after="20" w:line="260" w:lineRule="exact"/>
+              <w:jc w:val="center"/>
+            </w:pPr>
+            <w:r>
+              <w:rPr>
+                <w:rFonts w:ascii="Arial" w:hAnsi="Arial" w:eastAsia="Songti SC"/>
+                <w:b w:val="0"/>
+                <w:sz w:val="18"/>
+              </w:rPr>
+              <w:t>21.20%</w:t>
+            </w:r>
+          </w:p>
+        </w:tc>
+        <w:tc>
+          <w:tcPr>
+            <w:tcW w:type="dxa" w:w="850"/>
+            <w:vAlign w:val="center"/>
+            <w:shd w:fill="F5F7F8"/>
+            <w:tcMar>
+              <w:top w:w="65" w:type="dxa"/>
+              <w:bottom w:w="65" w:type="dxa"/>
+              <w:left w:w="65" w:type="dxa"/>
+              <w:right w:w="65" w:type="dxa"/>
+            </w:tcMar>
+          </w:tcPr>
+          <w:p>
+            <w:pPr>
+              <w:spacing w:before="20" w:after="20" w:line="260" w:lineRule="exact"/>
+              <w:jc w:val="center"/>
+            </w:pPr>
+            <w:r>
+              <w:rPr>
+                <w:rFonts w:ascii="Arial" w:hAnsi="Arial" w:eastAsia="Songti SC"/>
+                <w:b w:val="0"/>
+                <w:sz w:val="18"/>
+              </w:rPr>
+              <w:t>0.80</w:t>
+            </w:r>
+          </w:p>
+        </w:tc>
+        <w:tc>
+          <w:tcPr>
+            <w:tcW w:type="dxa" w:w="1531"/>
+            <w:vAlign w:val="center"/>
+            <w:shd w:fill="F5F7F8"/>
+            <w:tcMar>
+              <w:top w:w="65" w:type="dxa"/>
+              <w:bottom w:w="65" w:type="dxa"/>
+              <w:left w:w="65" w:type="dxa"/>
+              <w:right w:w="65" w:type="dxa"/>
+            </w:tcMar>
+          </w:tcPr>
+          <w:p>
+            <w:pPr>
+              <w:spacing w:before="20" w:after="20" w:line="260" w:lineRule="exact"/>
+              <w:jc w:val="center"/>
+            </w:pPr>
+            <w:r>
+              <w:rPr>
+                <w:rFonts w:ascii="Arial" w:hAnsi="Arial" w:eastAsia="Songti SC"/>
+                <w:b w:val="0"/>
+                <w:sz w:val="18"/>
+              </w:rPr>
+              <w:t>-37.30%</w:t>
+            </w:r>
+          </w:p>
+        </w:tc>
+        <w:tc>
+          <w:tcPr>
+            <w:tcW w:type="dxa" w:w="1531"/>
+            <w:vAlign w:val="center"/>
+            <w:shd w:fill="F5F7F8"/>
+            <w:tcMar>
+              <w:top w:w="65" w:type="dxa"/>
+              <w:bottom w:w="65" w:type="dxa"/>
+              <w:left w:w="65" w:type="dxa"/>
+              <w:right w:w="65" w:type="dxa"/>
+            </w:tcMar>
+          </w:tcPr>
+          <w:p>
+            <w:pPr>
+              <w:spacing w:before="20" w:after="20" w:line="260" w:lineRule="exact"/>
+              <w:jc w:val="center"/>
+            </w:pPr>
+            <w:r>
+              <w:rPr>
+                <w:rFonts w:ascii="Arial" w:hAnsi="Arial" w:eastAsia="Songti SC"/>
+                <w:b w:val="0"/>
+                <w:sz w:val="18"/>
+              </w:rPr>
+              <w:t>84.00%</w:t>
+            </w:r>
+          </w:p>
+        </w:tc>
+        <w:tc>
+          <w:tcPr>
+            <w:tcW w:type="dxa" w:w="1531"/>
+            <w:vAlign w:val="center"/>
+            <w:shd w:fill="F5F7F8"/>
+            <w:tcMar>
+              <w:top w:w="65" w:type="dxa"/>
+              <w:bottom w:w="65" w:type="dxa"/>
+              <w:left w:w="65" w:type="dxa"/>
+              <w:right w:w="65" w:type="dxa"/>
+            </w:tcMar>
+          </w:tcPr>
+          <w:p>
+            <w:pPr>
+              <w:spacing w:before="20" w:after="20" w:line="260" w:lineRule="exact"/>
+              <w:jc w:val="center"/>
+            </w:pPr>
+            <w:r>
+              <w:rPr>
+                <w:rFonts w:ascii="Arial" w:hAnsi="Arial" w:eastAsia="Songti SC"/>
+                <w:b w:val="0"/>
+                <w:sz w:val="18"/>
+              </w:rPr>
+              <w:t>14.87%</w:t>
+            </w:r>
+          </w:p>
+        </w:tc>
+      </w:tr>
+      <w:tr>
+        <w:trPr>
+          <w:cantSplit/>
+        </w:trPr>
+        <w:tc>
+          <w:tcPr>
+            <w:tcW w:type="dxa" w:w="1361"/>
+            <w:vAlign w:val="center"/>
+            <w:shd w:fill="FFFFFF"/>
+            <w:tcMar>
+              <w:top w:w="65" w:type="dxa"/>
+              <w:bottom w:w="65" w:type="dxa"/>
+              <w:left w:w="65" w:type="dxa"/>
+              <w:right w:w="65" w:type="dxa"/>
+            </w:tcMar>
+          </w:tcPr>
+          <w:p>
+            <w:pPr>
+              <w:spacing w:before="20" w:after="20" w:line="260" w:lineRule="exact"/>
+              <w:jc w:val="left"/>
+            </w:pPr>
+            <w:r>
+              <w:rPr>
+                <w:rFonts w:ascii="Arial" w:hAnsi="Arial" w:eastAsia="Songti SC"/>
+                <w:b w:val="0"/>
+                <w:sz w:val="18"/>
+              </w:rPr>
+              <w:t>100万元</w:t>
+            </w:r>
+          </w:p>
+        </w:tc>
+        <w:tc>
+          <w:tcPr>
+            <w:tcW w:type="dxa" w:w="1361"/>
+            <w:vAlign w:val="center"/>
+            <w:shd w:fill="FFFFFF"/>
+            <w:tcMar>
+              <w:top w:w="65" w:type="dxa"/>
+              <w:bottom w:w="65" w:type="dxa"/>
+              <w:left w:w="65" w:type="dxa"/>
+              <w:right w:w="65" w:type="dxa"/>
+            </w:tcMar>
+          </w:tcPr>
+          <w:p>
+            <w:pPr>
+              <w:spacing w:before="20" w:after="20" w:line="260" w:lineRule="exact"/>
+              <w:jc w:val="center"/>
+            </w:pPr>
+            <w:r>
+              <w:rPr>
+                <w:rFonts w:ascii="Arial" w:hAnsi="Arial" w:eastAsia="Songti SC"/>
+                <w:b w:val="0"/>
+                <w:sz w:val="18"/>
+              </w:rPr>
+              <w:t>22.00%</w:t>
+            </w:r>
+          </w:p>
+        </w:tc>
+        <w:tc>
+          <w:tcPr>
+            <w:tcW w:type="dxa" w:w="1361"/>
+            <w:vAlign w:val="center"/>
+            <w:shd w:fill="FFFFFF"/>
+            <w:tcMar>
+              <w:top w:w="65" w:type="dxa"/>
+              <w:bottom w:w="65" w:type="dxa"/>
+              <w:left w:w="65" w:type="dxa"/>
+              <w:right w:w="65" w:type="dxa"/>
+            </w:tcMar>
+          </w:tcPr>
+          <w:p>
+            <w:pPr>
+              <w:spacing w:before="20" w:after="20" w:line="260" w:lineRule="exact"/>
+              <w:jc w:val="center"/>
+            </w:pPr>
+            <w:r>
+              <w:rPr>
+                <w:rFonts w:ascii="Arial" w:hAnsi="Arial" w:eastAsia="Songti SC"/>
+                <w:b w:val="0"/>
+                <w:sz w:val="18"/>
+              </w:rPr>
+              <w:t>21.77%</w:t>
+            </w:r>
+          </w:p>
+        </w:tc>
+        <w:tc>
+          <w:tcPr>
+            <w:tcW w:type="dxa" w:w="850"/>
+            <w:vAlign w:val="center"/>
+            <w:shd w:fill="FFFFFF"/>
+            <w:tcMar>
+              <w:top w:w="65" w:type="dxa"/>
+              <w:bottom w:w="65" w:type="dxa"/>
+              <w:left w:w="65" w:type="dxa"/>
+              <w:right w:w="65" w:type="dxa"/>
+            </w:tcMar>
+          </w:tcPr>
+          <w:p>
+            <w:pPr>
+              <w:spacing w:before="20" w:after="20" w:line="260" w:lineRule="exact"/>
+              <w:jc w:val="center"/>
+            </w:pPr>
+            <w:r>
+              <w:rPr>
+                <w:rFonts w:ascii="Arial" w:hAnsi="Arial" w:eastAsia="Songti SC"/>
+                <w:b w:val="0"/>
+                <w:sz w:val="18"/>
+              </w:rPr>
+              <w:t>0.76</w:t>
+            </w:r>
+          </w:p>
+        </w:tc>
+        <w:tc>
+          <w:tcPr>
+            <w:tcW w:type="dxa" w:w="1531"/>
+            <w:vAlign w:val="center"/>
+            <w:shd w:fill="FFFFFF"/>
+            <w:tcMar>
+              <w:top w:w="65" w:type="dxa"/>
+              <w:bottom w:w="65" w:type="dxa"/>
+              <w:left w:w="65" w:type="dxa"/>
+              <w:right w:w="65" w:type="dxa"/>
+            </w:tcMar>
+          </w:tcPr>
+          <w:p>
+            <w:pPr>
+              <w:spacing w:before="20" w:after="20" w:line="260" w:lineRule="exact"/>
+              <w:jc w:val="center"/>
+            </w:pPr>
+            <w:r>
+              <w:rPr>
+                <w:rFonts w:ascii="Arial" w:hAnsi="Arial" w:eastAsia="Songti SC"/>
+                <w:b w:val="0"/>
+                <w:sz w:val="18"/>
+              </w:rPr>
+              <w:t>-42.90%</w:t>
+            </w:r>
+          </w:p>
+        </w:tc>
+        <w:tc>
+          <w:tcPr>
+            <w:tcW w:type="dxa" w:w="1531"/>
+            <w:vAlign w:val="center"/>
+            <w:shd w:fill="FFFFFF"/>
+            <w:tcMar>
+              <w:top w:w="65" w:type="dxa"/>
+              <w:bottom w:w="65" w:type="dxa"/>
+              <w:left w:w="65" w:type="dxa"/>
+              <w:right w:w="65" w:type="dxa"/>
+            </w:tcMar>
+          </w:tcPr>
+          <w:p>
+            <w:pPr>
+              <w:spacing w:before="20" w:after="20" w:line="260" w:lineRule="exact"/>
+              <w:jc w:val="center"/>
+            </w:pPr>
+            <w:r>
+              <w:rPr>
+                <w:rFonts w:ascii="Arial" w:hAnsi="Arial" w:eastAsia="Songti SC"/>
+                <w:b w:val="0"/>
+                <w:sz w:val="18"/>
+              </w:rPr>
+              <w:t>85.82%</w:t>
+            </w:r>
+          </w:p>
+        </w:tc>
+        <w:tc>
+          <w:tcPr>
+            <w:tcW w:type="dxa" w:w="1531"/>
+            <w:vAlign w:val="center"/>
+            <w:shd w:fill="FFFFFF"/>
+            <w:tcMar>
+              <w:top w:w="65" w:type="dxa"/>
+              <w:bottom w:w="65" w:type="dxa"/>
+              <w:left w:w="65" w:type="dxa"/>
+              <w:right w:w="65" w:type="dxa"/>
+            </w:tcMar>
+          </w:tcPr>
+          <w:p>
+            <w:pPr>
+              <w:spacing w:before="20" w:after="20" w:line="260" w:lineRule="exact"/>
+              <w:jc w:val="center"/>
+            </w:pPr>
+            <w:r>
+              <w:rPr>
+                <w:rFonts w:ascii="Arial" w:hAnsi="Arial" w:eastAsia="Songti SC"/>
+                <w:b w:val="0"/>
+                <w:sz w:val="18"/>
+              </w:rPr>
+              <w:t>5.14%</w:t>
+            </w:r>
+          </w:p>
+        </w:tc>
+      </w:tr>
+      <w:tr>
+        <w:trPr>
+          <w:cantSplit/>
+        </w:trPr>
+        <w:tc>
+          <w:tcPr>
+            <w:tcW w:type="dxa" w:w="1361"/>
+            <w:vAlign w:val="center"/>
+            <w:shd w:fill="F5F7F8"/>
+            <w:tcMar>
+              <w:top w:w="65" w:type="dxa"/>
+              <w:bottom w:w="65" w:type="dxa"/>
+              <w:left w:w="65" w:type="dxa"/>
+              <w:right w:w="65" w:type="dxa"/>
+            </w:tcMar>
+          </w:tcPr>
+          <w:p>
+            <w:pPr>
+              <w:spacing w:before="20" w:after="20" w:line="260" w:lineRule="exact"/>
+              <w:jc w:val="left"/>
+            </w:pPr>
+            <w:r>
+              <w:rPr>
+                <w:rFonts w:ascii="Arial" w:hAnsi="Arial" w:eastAsia="Songti SC"/>
+                <w:b w:val="0"/>
+                <w:sz w:val="18"/>
+              </w:rPr>
+              <w:t>200万元</w:t>
+            </w:r>
+          </w:p>
+        </w:tc>
+        <w:tc>
+          <w:tcPr>
+            <w:tcW w:type="dxa" w:w="1361"/>
+            <w:vAlign w:val="center"/>
+            <w:shd w:fill="F5F7F8"/>
+            <w:tcMar>
+              <w:top w:w="65" w:type="dxa"/>
+              <w:bottom w:w="65" w:type="dxa"/>
+              <w:left w:w="65" w:type="dxa"/>
+              <w:right w:w="65" w:type="dxa"/>
+            </w:tcMar>
+          </w:tcPr>
+          <w:p>
+            <w:pPr>
+              <w:spacing w:before="20" w:after="20" w:line="260" w:lineRule="exact"/>
+              <w:jc w:val="center"/>
+            </w:pPr>
+            <w:r>
+              <w:rPr>
+                <w:rFonts w:ascii="Arial" w:hAnsi="Arial" w:eastAsia="Songti SC"/>
+                <w:b w:val="0"/>
+                <w:sz w:val="18"/>
+              </w:rPr>
+              <w:t>22.22%</w:t>
+            </w:r>
+          </w:p>
+        </w:tc>
+        <w:tc>
+          <w:tcPr>
+            <w:tcW w:type="dxa" w:w="1361"/>
+            <w:vAlign w:val="center"/>
+            <w:shd w:fill="F5F7F8"/>
+            <w:tcMar>
+              <w:top w:w="65" w:type="dxa"/>
+              <w:bottom w:w="65" w:type="dxa"/>
+              <w:left w:w="65" w:type="dxa"/>
+              <w:right w:w="65" w:type="dxa"/>
+            </w:tcMar>
+          </w:tcPr>
+          <w:p>
+            <w:pPr>
+              <w:spacing w:before="20" w:after="20" w:line="260" w:lineRule="exact"/>
+              <w:jc w:val="center"/>
+            </w:pPr>
+            <w:r>
+              <w:rPr>
+                <w:rFonts w:ascii="Arial" w:hAnsi="Arial" w:eastAsia="Songti SC"/>
+                <w:b w:val="0"/>
+                <w:sz w:val="18"/>
+              </w:rPr>
+              <w:t>22.08%</w:t>
+            </w:r>
+          </w:p>
+        </w:tc>
+        <w:tc>
+          <w:tcPr>
+            <w:tcW w:type="dxa" w:w="850"/>
+            <w:vAlign w:val="center"/>
+            <w:shd w:fill="F5F7F8"/>
+            <w:tcMar>
+              <w:top w:w="65" w:type="dxa"/>
+              <w:bottom w:w="65" w:type="dxa"/>
+              <w:left w:w="65" w:type="dxa"/>
+              <w:right w:w="65" w:type="dxa"/>
+            </w:tcMar>
+          </w:tcPr>
+          <w:p>
+            <w:pPr>
+              <w:spacing w:before="20" w:after="20" w:line="260" w:lineRule="exact"/>
+              <w:jc w:val="center"/>
+            </w:pPr>
+            <w:r>
+              <w:rPr>
+                <w:rFonts w:ascii="Arial" w:hAnsi="Arial" w:eastAsia="Songti SC"/>
+                <w:b w:val="0"/>
+                <w:sz w:val="18"/>
+              </w:rPr>
+              <w:t>0.76</w:t>
+            </w:r>
+          </w:p>
+        </w:tc>
+        <w:tc>
+          <w:tcPr>
+            <w:tcW w:type="dxa" w:w="1531"/>
+            <w:vAlign w:val="center"/>
+            <w:shd w:fill="F5F7F8"/>
+            <w:tcMar>
+              <w:top w:w="65" w:type="dxa"/>
+              <w:bottom w:w="65" w:type="dxa"/>
+              <w:left w:w="65" w:type="dxa"/>
+              <w:right w:w="65" w:type="dxa"/>
+            </w:tcMar>
+          </w:tcPr>
+          <w:p>
+            <w:pPr>
+              <w:spacing w:before="20" w:after="20" w:line="260" w:lineRule="exact"/>
+              <w:jc w:val="center"/>
+            </w:pPr>
+            <w:r>
+              <w:rPr>
+                <w:rFonts w:ascii="Arial" w:hAnsi="Arial" w:eastAsia="Songti SC"/>
+                <w:b w:val="0"/>
+                <w:sz w:val="18"/>
+              </w:rPr>
+              <w:t>-44.10%</w:t>
+            </w:r>
+          </w:p>
+        </w:tc>
+        <w:tc>
+          <w:tcPr>
+            <w:tcW w:type="dxa" w:w="1531"/>
+            <w:vAlign w:val="center"/>
+            <w:shd w:fill="F5F7F8"/>
+            <w:tcMar>
+              <w:top w:w="65" w:type="dxa"/>
+              <w:bottom w:w="65" w:type="dxa"/>
+              <w:left w:w="65" w:type="dxa"/>
+              <w:right w:w="65" w:type="dxa"/>
+            </w:tcMar>
+          </w:tcPr>
+          <w:p>
+            <w:pPr>
+              <w:spacing w:before="20" w:after="20" w:line="260" w:lineRule="exact"/>
+              <w:jc w:val="center"/>
+            </w:pPr>
+            <w:r>
+              <w:rPr>
+                <w:rFonts w:ascii="Arial" w:hAnsi="Arial" w:eastAsia="Songti SC"/>
+                <w:b w:val="0"/>
+                <w:sz w:val="18"/>
+              </w:rPr>
+              <w:t>86.40%</w:t>
+            </w:r>
+          </w:p>
+        </w:tc>
+        <w:tc>
+          <w:tcPr>
+            <w:tcW w:type="dxa" w:w="1531"/>
+            <w:vAlign w:val="center"/>
+            <w:shd w:fill="F5F7F8"/>
+            <w:tcMar>
+              <w:top w:w="65" w:type="dxa"/>
+              <w:bottom w:w="65" w:type="dxa"/>
+              <w:left w:w="65" w:type="dxa"/>
+              <w:right w:w="65" w:type="dxa"/>
+            </w:tcMar>
+          </w:tcPr>
+          <w:p>
+            <w:pPr>
+              <w:spacing w:before="20" w:after="20" w:line="260" w:lineRule="exact"/>
+              <w:jc w:val="center"/>
+            </w:pPr>
+            <w:r>
+              <w:rPr>
+                <w:rFonts w:ascii="Arial" w:hAnsi="Arial" w:eastAsia="Songti SC"/>
+                <w:b w:val="0"/>
+                <w:sz w:val="18"/>
+              </w:rPr>
+              <w:t>3.00%</w:t>
+            </w:r>
+          </w:p>
+        </w:tc>
+      </w:tr>
+      <w:tr>
+        <w:trPr>
+          <w:cantSplit/>
+        </w:trPr>
+        <w:tc>
+          <w:tcPr>
+            <w:tcW w:type="dxa" w:w="1361"/>
+            <w:vAlign w:val="center"/>
+            <w:shd w:fill="FFFFFF"/>
+            <w:tcMar>
+              <w:top w:w="65" w:type="dxa"/>
+              <w:bottom w:w="65" w:type="dxa"/>
+              <w:left w:w="65" w:type="dxa"/>
+              <w:right w:w="65" w:type="dxa"/>
+            </w:tcMar>
+          </w:tcPr>
+          <w:p>
+            <w:pPr>
+              <w:spacing w:before="20" w:after="20" w:line="260" w:lineRule="exact"/>
+              <w:jc w:val="left"/>
+            </w:pPr>
+            <w:r>
+              <w:rPr>
+                <w:rFonts w:ascii="Arial" w:hAnsi="Arial" w:eastAsia="Songti SC"/>
+                <w:b w:val="0"/>
+                <w:sz w:val="18"/>
+              </w:rPr>
+              <w:t>500万元</w:t>
+            </w:r>
+          </w:p>
+        </w:tc>
+        <w:tc>
+          <w:tcPr>
+            <w:tcW w:type="dxa" w:w="1361"/>
+            <w:vAlign w:val="center"/>
+            <w:shd w:fill="FFFFFF"/>
+            <w:tcMar>
+              <w:top w:w="65" w:type="dxa"/>
+              <w:bottom w:w="65" w:type="dxa"/>
+              <w:left w:w="65" w:type="dxa"/>
+              <w:right w:w="65" w:type="dxa"/>
+            </w:tcMar>
+          </w:tcPr>
+          <w:p>
+            <w:pPr>
+              <w:spacing w:before="20" w:after="20" w:line="260" w:lineRule="exact"/>
+              <w:jc w:val="center"/>
+            </w:pPr>
+            <w:r>
+              <w:rPr>
+                <w:rFonts w:ascii="Arial" w:hAnsi="Arial" w:eastAsia="Songti SC"/>
+                <w:b w:val="0"/>
+                <w:sz w:val="18"/>
+              </w:rPr>
+              <w:t>22.47%</w:t>
+            </w:r>
+          </w:p>
+        </w:tc>
+        <w:tc>
+          <w:tcPr>
+            <w:tcW w:type="dxa" w:w="1361"/>
+            <w:vAlign w:val="center"/>
+            <w:shd w:fill="FFFFFF"/>
+            <w:tcMar>
+              <w:top w:w="65" w:type="dxa"/>
+              <w:bottom w:w="65" w:type="dxa"/>
+              <w:left w:w="65" w:type="dxa"/>
+              <w:right w:w="65" w:type="dxa"/>
+            </w:tcMar>
+          </w:tcPr>
+          <w:p>
+            <w:pPr>
+              <w:spacing w:before="20" w:after="20" w:line="260" w:lineRule="exact"/>
+              <w:jc w:val="center"/>
+            </w:pPr>
+            <w:r>
+              <w:rPr>
+                <w:rFonts w:ascii="Arial" w:hAnsi="Arial" w:eastAsia="Songti SC"/>
+                <w:b w:val="0"/>
+                <w:sz w:val="18"/>
+              </w:rPr>
+              <w:t>22.33%</w:t>
+            </w:r>
+          </w:p>
+        </w:tc>
+        <w:tc>
+          <w:tcPr>
+            <w:tcW w:type="dxa" w:w="850"/>
+            <w:vAlign w:val="center"/>
+            <w:shd w:fill="FFFFFF"/>
+            <w:tcMar>
+              <w:top w:w="65" w:type="dxa"/>
+              <w:bottom w:w="65" w:type="dxa"/>
+              <w:left w:w="65" w:type="dxa"/>
+              <w:right w:w="65" w:type="dxa"/>
+            </w:tcMar>
+          </w:tcPr>
+          <w:p>
+            <w:pPr>
+              <w:spacing w:before="20" w:after="20" w:line="260" w:lineRule="exact"/>
+              <w:jc w:val="center"/>
+            </w:pPr>
+            <w:r>
+              <w:rPr>
+                <w:rFonts w:ascii="Arial" w:hAnsi="Arial" w:eastAsia="Songti SC"/>
+                <w:b w:val="0"/>
+                <w:sz w:val="18"/>
+              </w:rPr>
+              <w:t>0.76</w:t>
+            </w:r>
+          </w:p>
+        </w:tc>
+        <w:tc>
+          <w:tcPr>
+            <w:tcW w:type="dxa" w:w="1531"/>
+            <w:vAlign w:val="center"/>
+            <w:shd w:fill="FFFFFF"/>
+            <w:tcMar>
+              <w:top w:w="65" w:type="dxa"/>
+              <w:bottom w:w="65" w:type="dxa"/>
+              <w:left w:w="65" w:type="dxa"/>
+              <w:right w:w="65" w:type="dxa"/>
+            </w:tcMar>
+          </w:tcPr>
+          <w:p>
+            <w:pPr>
+              <w:spacing w:before="20" w:after="20" w:line="260" w:lineRule="exact"/>
+              <w:jc w:val="center"/>
+            </w:pPr>
+            <w:r>
+              <w:rPr>
+                <w:rFonts w:ascii="Arial" w:hAnsi="Arial" w:eastAsia="Songti SC"/>
+                <w:b w:val="0"/>
+                <w:sz w:val="18"/>
+              </w:rPr>
+              <w:t>-44.75%</w:t>
+            </w:r>
+          </w:p>
+        </w:tc>
+        <w:tc>
+          <w:tcPr>
+            <w:tcW w:type="dxa" w:w="1531"/>
+            <w:vAlign w:val="center"/>
+            <w:shd w:fill="FFFFFF"/>
+            <w:tcMar>
+              <w:top w:w="65" w:type="dxa"/>
+              <w:bottom w:w="65" w:type="dxa"/>
+              <w:left w:w="65" w:type="dxa"/>
+              <w:right w:w="65" w:type="dxa"/>
+            </w:tcMar>
+          </w:tcPr>
+          <w:p>
+            <w:pPr>
+              <w:spacing w:before="20" w:after="20" w:line="260" w:lineRule="exact"/>
+              <w:jc w:val="center"/>
+            </w:pPr>
+            <w:r>
+              <w:rPr>
+                <w:rFonts w:ascii="Arial" w:hAnsi="Arial" w:eastAsia="Songti SC"/>
+                <w:b w:val="0"/>
+                <w:sz w:val="18"/>
+              </w:rPr>
+              <w:t>87.01%</w:t>
+            </w:r>
+          </w:p>
+        </w:tc>
+        <w:tc>
+          <w:tcPr>
+            <w:tcW w:type="dxa" w:w="1531"/>
+            <w:vAlign w:val="center"/>
+            <w:shd w:fill="FFFFFF"/>
+            <w:tcMar>
+              <w:top w:w="65" w:type="dxa"/>
+              <w:bottom w:w="65" w:type="dxa"/>
+              <w:left w:w="65" w:type="dxa"/>
+              <w:right w:w="65" w:type="dxa"/>
+            </w:tcMar>
+          </w:tcPr>
+          <w:p>
+            <w:pPr>
+              <w:spacing w:before="20" w:after="20" w:line="260" w:lineRule="exact"/>
+              <w:jc w:val="center"/>
+            </w:pPr>
+            <w:r>
+              <w:rPr>
+                <w:rFonts w:ascii="Arial" w:hAnsi="Arial" w:eastAsia="Songti SC"/>
+                <w:b w:val="0"/>
+                <w:sz w:val="18"/>
+              </w:rPr>
+              <w:t>1.87%</w:t>
+            </w:r>
+          </w:p>
+        </w:tc>
+      </w:tr>
+      <w:tr>
+        <w:trPr>
+          <w:cantSplit/>
+        </w:trPr>
+        <w:tc>
+          <w:tcPr>
+            <w:tcW w:type="dxa" w:w="1361"/>
+            <w:vAlign w:val="center"/>
+            <w:shd w:fill="F5F7F8"/>
+            <w:tcMar>
+              <w:top w:w="65" w:type="dxa"/>
+              <w:bottom w:w="65" w:type="dxa"/>
+              <w:left w:w="65" w:type="dxa"/>
+              <w:right w:w="65" w:type="dxa"/>
+            </w:tcMar>
+          </w:tcPr>
+          <w:p>
+            <w:pPr>
+              <w:spacing w:before="20" w:after="20" w:line="260" w:lineRule="exact"/>
+              <w:jc w:val="left"/>
+            </w:pPr>
+            <w:r>
+              <w:rPr>
+                <w:rFonts w:ascii="Arial" w:hAnsi="Arial" w:eastAsia="Songti SC"/>
+                <w:b w:val="0"/>
+                <w:sz w:val="18"/>
+              </w:rPr>
+              <w:t>1,000万元</w:t>
+            </w:r>
+          </w:p>
+        </w:tc>
+        <w:tc>
+          <w:tcPr>
+            <w:tcW w:type="dxa" w:w="1361"/>
+            <w:vAlign w:val="center"/>
+            <w:shd w:fill="F5F7F8"/>
+            <w:tcMar>
+              <w:top w:w="65" w:type="dxa"/>
+              <w:bottom w:w="65" w:type="dxa"/>
+              <w:left w:w="65" w:type="dxa"/>
+              <w:right w:w="65" w:type="dxa"/>
+            </w:tcMar>
+          </w:tcPr>
+          <w:p>
+            <w:pPr>
+              <w:spacing w:before="20" w:after="20" w:line="260" w:lineRule="exact"/>
+              <w:jc w:val="center"/>
+            </w:pPr>
+            <w:r>
+              <w:rPr>
+                <w:rFonts w:ascii="Arial" w:hAnsi="Arial" w:eastAsia="Songti SC"/>
+                <w:b w:val="0"/>
+                <w:sz w:val="18"/>
+              </w:rPr>
+              <w:t>22.60%</w:t>
+            </w:r>
+          </w:p>
+        </w:tc>
+        <w:tc>
+          <w:tcPr>
+            <w:tcW w:type="dxa" w:w="1361"/>
+            <w:vAlign w:val="center"/>
+            <w:shd w:fill="F5F7F8"/>
+            <w:tcMar>
+              <w:top w:w="65" w:type="dxa"/>
+              <w:bottom w:w="65" w:type="dxa"/>
+              <w:left w:w="65" w:type="dxa"/>
+              <w:right w:w="65" w:type="dxa"/>
+            </w:tcMar>
+          </w:tcPr>
+          <w:p>
+            <w:pPr>
+              <w:spacing w:before="20" w:after="20" w:line="260" w:lineRule="exact"/>
+              <w:jc w:val="center"/>
+            </w:pPr>
+            <w:r>
+              <w:rPr>
+                <w:rFonts w:ascii="Arial" w:hAnsi="Arial" w:eastAsia="Songti SC"/>
+                <w:b w:val="0"/>
+                <w:sz w:val="18"/>
+              </w:rPr>
+              <w:t>22.66%</w:t>
+            </w:r>
+          </w:p>
+        </w:tc>
+        <w:tc>
+          <w:tcPr>
+            <w:tcW w:type="dxa" w:w="850"/>
+            <w:vAlign w:val="center"/>
+            <w:shd w:fill="F5F7F8"/>
+            <w:tcMar>
+              <w:top w:w="65" w:type="dxa"/>
+              <w:bottom w:w="65" w:type="dxa"/>
+              <w:left w:w="65" w:type="dxa"/>
+              <w:right w:w="65" w:type="dxa"/>
+            </w:tcMar>
+          </w:tcPr>
+          <w:p>
+            <w:pPr>
+              <w:spacing w:before="20" w:after="20" w:line="260" w:lineRule="exact"/>
+              <w:jc w:val="center"/>
+            </w:pPr>
+            <w:r>
+              <w:rPr>
+                <w:rFonts w:ascii="Arial" w:hAnsi="Arial" w:eastAsia="Songti SC"/>
+                <w:b w:val="0"/>
+                <w:sz w:val="18"/>
+              </w:rPr>
+              <w:t>0.76</w:t>
+            </w:r>
+          </w:p>
+        </w:tc>
+        <w:tc>
+          <w:tcPr>
+            <w:tcW w:type="dxa" w:w="1531"/>
+            <w:vAlign w:val="center"/>
+            <w:shd w:fill="F5F7F8"/>
+            <w:tcMar>
+              <w:top w:w="65" w:type="dxa"/>
+              <w:bottom w:w="65" w:type="dxa"/>
+              <w:left w:w="65" w:type="dxa"/>
+              <w:right w:w="65" w:type="dxa"/>
+            </w:tcMar>
+          </w:tcPr>
+          <w:p>
+            <w:pPr>
+              <w:spacing w:before="20" w:after="20" w:line="260" w:lineRule="exact"/>
+              <w:jc w:val="center"/>
+            </w:pPr>
+            <w:r>
+              <w:rPr>
+                <w:rFonts w:ascii="Arial" w:hAnsi="Arial" w:eastAsia="Songti SC"/>
+                <w:b w:val="0"/>
+                <w:sz w:val="18"/>
+              </w:rPr>
+              <w:t>-44.94%</w:t>
+            </w:r>
+          </w:p>
+        </w:tc>
+        <w:tc>
+          <w:tcPr>
+            <w:tcW w:type="dxa" w:w="1531"/>
+            <w:vAlign w:val="center"/>
+            <w:shd w:fill="F5F7F8"/>
+            <w:tcMar>
+              <w:top w:w="65" w:type="dxa"/>
+              <w:bottom w:w="65" w:type="dxa"/>
+              <w:left w:w="65" w:type="dxa"/>
+              <w:right w:w="65" w:type="dxa"/>
+            </w:tcMar>
+          </w:tcPr>
+          <w:p>
+            <w:pPr>
+              <w:spacing w:before="20" w:after="20" w:line="260" w:lineRule="exact"/>
+              <w:jc w:val="center"/>
+            </w:pPr>
+            <w:r>
+              <w:rPr>
+                <w:rFonts w:ascii="Arial" w:hAnsi="Arial" w:eastAsia="Songti SC"/>
+                <w:b w:val="0"/>
+                <w:sz w:val="18"/>
+              </w:rPr>
+              <w:t>87.28%</w:t>
+            </w:r>
+          </w:p>
+        </w:tc>
+        <w:tc>
+          <w:tcPr>
+            <w:tcW w:type="dxa" w:w="1531"/>
+            <w:vAlign w:val="center"/>
+            <w:shd w:fill="F5F7F8"/>
+            <w:tcMar>
+              <w:top w:w="65" w:type="dxa"/>
+              <w:bottom w:w="65" w:type="dxa"/>
+              <w:left w:w="65" w:type="dxa"/>
+              <w:right w:w="65" w:type="dxa"/>
+            </w:tcMar>
+          </w:tcPr>
+          <w:p>
+            <w:pPr>
+              <w:spacing w:before="20" w:after="20" w:line="260" w:lineRule="exact"/>
+              <w:jc w:val="center"/>
+            </w:pPr>
+            <w:r>
+              <w:rPr>
+                <w:rFonts w:ascii="Arial" w:hAnsi="Arial" w:eastAsia="Songti SC"/>
+                <w:b w:val="0"/>
+                <w:sz w:val="18"/>
+              </w:rPr>
+              <w:t>1.52%</w:t>
+            </w:r>
+          </w:p>
+        </w:tc>
+      </w:tr>
+      <w:tr>
+        <w:trPr>
+          <w:cantSplit/>
+        </w:trPr>
+        <w:tc>
+          <w:tcPr>
+            <w:tcW w:type="dxa" w:w="1361"/>
+            <w:vAlign w:val="center"/>
+            <w:shd w:fill="FFFFFF"/>
+            <w:tcMar>
+              <w:top w:w="65" w:type="dxa"/>
+              <w:bottom w:w="65" w:type="dxa"/>
+              <w:left w:w="65" w:type="dxa"/>
+              <w:right w:w="65" w:type="dxa"/>
+            </w:tcMar>
+          </w:tcPr>
+          <w:p>
+            <w:pPr>
+              <w:spacing w:before="20" w:after="20" w:line="260" w:lineRule="exact"/>
+              <w:jc w:val="left"/>
+            </w:pPr>
+            <w:r>
+              <w:rPr>
+                <w:rFonts w:ascii="Arial" w:hAnsi="Arial" w:eastAsia="Songti SC"/>
+                <w:b w:val="0"/>
+                <w:sz w:val="18"/>
+              </w:rPr>
+              <w:t>3,000万元</w:t>
+            </w:r>
+          </w:p>
+        </w:tc>
+        <w:tc>
+          <w:tcPr>
+            <w:tcW w:type="dxa" w:w="1361"/>
+            <w:vAlign w:val="center"/>
+            <w:shd w:fill="FFFFFF"/>
+            <w:tcMar>
+              <w:top w:w="65" w:type="dxa"/>
+              <w:bottom w:w="65" w:type="dxa"/>
+              <w:left w:w="65" w:type="dxa"/>
+              <w:right w:w="65" w:type="dxa"/>
+            </w:tcMar>
+          </w:tcPr>
+          <w:p>
+            <w:pPr>
+              <w:spacing w:before="20" w:after="20" w:line="260" w:lineRule="exact"/>
+              <w:jc w:val="center"/>
+            </w:pPr>
+            <w:r>
+              <w:rPr>
+                <w:rFonts w:ascii="Arial" w:hAnsi="Arial" w:eastAsia="Songti SC"/>
+                <w:b w:val="0"/>
+                <w:sz w:val="18"/>
+              </w:rPr>
+              <w:t>22.76%</w:t>
+            </w:r>
+          </w:p>
+        </w:tc>
+        <w:tc>
+          <w:tcPr>
+            <w:tcW w:type="dxa" w:w="1361"/>
+            <w:vAlign w:val="center"/>
+            <w:shd w:fill="FFFFFF"/>
+            <w:tcMar>
+              <w:top w:w="65" w:type="dxa"/>
+              <w:bottom w:w="65" w:type="dxa"/>
+              <w:left w:w="65" w:type="dxa"/>
+              <w:right w:w="65" w:type="dxa"/>
+            </w:tcMar>
+          </w:tcPr>
+          <w:p>
+            <w:pPr>
+              <w:spacing w:before="20" w:after="20" w:line="260" w:lineRule="exact"/>
+              <w:jc w:val="center"/>
+            </w:pPr>
+            <w:r>
+              <w:rPr>
+                <w:rFonts w:ascii="Arial" w:hAnsi="Arial" w:eastAsia="Songti SC"/>
+                <w:b w:val="0"/>
+                <w:sz w:val="18"/>
+              </w:rPr>
+              <w:t>23.09%</w:t>
+            </w:r>
+          </w:p>
+        </w:tc>
+        <w:tc>
+          <w:tcPr>
+            <w:tcW w:type="dxa" w:w="850"/>
+            <w:vAlign w:val="center"/>
+            <w:shd w:fill="FFFFFF"/>
+            <w:tcMar>
+              <w:top w:w="65" w:type="dxa"/>
+              <w:bottom w:w="65" w:type="dxa"/>
+              <w:left w:w="65" w:type="dxa"/>
+              <w:right w:w="65" w:type="dxa"/>
+            </w:tcMar>
+          </w:tcPr>
+          <w:p>
+            <w:pPr>
+              <w:spacing w:before="20" w:after="20" w:line="260" w:lineRule="exact"/>
+              <w:jc w:val="center"/>
+            </w:pPr>
+            <w:r>
+              <w:rPr>
+                <w:rFonts w:ascii="Arial" w:hAnsi="Arial" w:eastAsia="Songti SC"/>
+                <w:b w:val="0"/>
+                <w:sz w:val="18"/>
+              </w:rPr>
+              <w:t>0.77</w:t>
+            </w:r>
+          </w:p>
+        </w:tc>
+        <w:tc>
+          <w:tcPr>
+            <w:tcW w:type="dxa" w:w="1531"/>
+            <w:vAlign w:val="center"/>
+            <w:shd w:fill="FFFFFF"/>
+            <w:tcMar>
+              <w:top w:w="65" w:type="dxa"/>
+              <w:bottom w:w="65" w:type="dxa"/>
+              <w:left w:w="65" w:type="dxa"/>
+              <w:right w:w="65" w:type="dxa"/>
+            </w:tcMar>
+          </w:tcPr>
+          <w:p>
+            <w:pPr>
+              <w:spacing w:before="20" w:after="20" w:line="260" w:lineRule="exact"/>
+              <w:jc w:val="center"/>
+            </w:pPr>
+            <w:r>
+              <w:rPr>
+                <w:rFonts w:ascii="Arial" w:hAnsi="Arial" w:eastAsia="Songti SC"/>
+                <w:b w:val="0"/>
+                <w:sz w:val="18"/>
+              </w:rPr>
+              <w:t>-45.04%</w:t>
+            </w:r>
+          </w:p>
+        </w:tc>
+        <w:tc>
+          <w:tcPr>
+            <w:tcW w:type="dxa" w:w="1531"/>
+            <w:vAlign w:val="center"/>
+            <w:shd w:fill="FFFFFF"/>
+            <w:tcMar>
+              <w:top w:w="65" w:type="dxa"/>
+              <w:bottom w:w="65" w:type="dxa"/>
+              <w:left w:w="65" w:type="dxa"/>
+              <w:right w:w="65" w:type="dxa"/>
+            </w:tcMar>
+          </w:tcPr>
+          <w:p>
+            <w:pPr>
+              <w:spacing w:before="20" w:after="20" w:line="260" w:lineRule="exact"/>
+              <w:jc w:val="center"/>
+            </w:pPr>
+            <w:r>
+              <w:rPr>
+                <w:rFonts w:ascii="Arial" w:hAnsi="Arial" w:eastAsia="Songti SC"/>
+                <w:b w:val="0"/>
+                <w:sz w:val="18"/>
+              </w:rPr>
+              <w:t>84.90%</w:t>
+            </w:r>
+          </w:p>
+        </w:tc>
+        <w:tc>
+          <w:tcPr>
+            <w:tcW w:type="dxa" w:w="1531"/>
+            <w:vAlign w:val="center"/>
+            <w:shd w:fill="FFFFFF"/>
+            <w:tcMar>
+              <w:top w:w="65" w:type="dxa"/>
+              <w:bottom w:w="65" w:type="dxa"/>
+              <w:left w:w="65" w:type="dxa"/>
+              <w:right w:w="65" w:type="dxa"/>
+            </w:tcMar>
+          </w:tcPr>
+          <w:p>
+            <w:pPr>
+              <w:spacing w:before="20" w:after="20" w:line="260" w:lineRule="exact"/>
+              <w:jc w:val="center"/>
+            </w:pPr>
+            <w:r>
+              <w:rPr>
+                <w:rFonts w:ascii="Arial" w:hAnsi="Arial" w:eastAsia="Songti SC"/>
+                <w:b w:val="0"/>
+                <w:sz w:val="18"/>
+              </w:rPr>
+              <w:t>1.35%</w:t>
+            </w:r>
+          </w:p>
+        </w:tc>
+      </w:tr>
+      <w:tr>
+        <w:trPr>
+          <w:cantSplit/>
+        </w:trPr>
+        <w:tc>
+          <w:tcPr>
+            <w:tcW w:type="dxa" w:w="1361"/>
+            <w:vAlign w:val="center"/>
+            <w:shd w:fill="F5F7F8"/>
+            <w:tcMar>
+              <w:top w:w="65" w:type="dxa"/>
+              <w:bottom w:w="65" w:type="dxa"/>
+              <w:left w:w="65" w:type="dxa"/>
+              <w:right w:w="65" w:type="dxa"/>
+            </w:tcMar>
+          </w:tcPr>
+          <w:p>
+            <w:pPr>
+              <w:spacing w:before="20" w:after="20" w:line="260" w:lineRule="exact"/>
+              <w:jc w:val="left"/>
+            </w:pPr>
+            <w:r>
+              <w:rPr>
+                <w:rFonts w:ascii="Arial" w:hAnsi="Arial" w:eastAsia="Songti SC"/>
+                <w:b w:val="0"/>
+                <w:sz w:val="18"/>
+              </w:rPr>
+              <w:t>5,000万元</w:t>
+            </w:r>
+          </w:p>
+        </w:tc>
+        <w:tc>
+          <w:tcPr>
+            <w:tcW w:type="dxa" w:w="1361"/>
+            <w:vAlign w:val="center"/>
+            <w:shd w:fill="F5F7F8"/>
+            <w:tcMar>
+              <w:top w:w="65" w:type="dxa"/>
+              <w:bottom w:w="65" w:type="dxa"/>
+              <w:left w:w="65" w:type="dxa"/>
+              <w:right w:w="65" w:type="dxa"/>
+            </w:tcMar>
+          </w:tcPr>
+          <w:p>
+            <w:pPr>
+              <w:spacing w:before="20" w:after="20" w:line="260" w:lineRule="exact"/>
+              <w:jc w:val="center"/>
+            </w:pPr>
+            <w:r>
+              <w:rPr>
+                <w:rFonts w:ascii="Arial" w:hAnsi="Arial" w:eastAsia="Songti SC"/>
+                <w:b w:val="0"/>
+                <w:sz w:val="18"/>
+              </w:rPr>
+              <w:t>22.81%</w:t>
+            </w:r>
+          </w:p>
+        </w:tc>
+        <w:tc>
+          <w:tcPr>
+            <w:tcW w:type="dxa" w:w="1361"/>
+            <w:vAlign w:val="center"/>
+            <w:shd w:fill="F5F7F8"/>
+            <w:tcMar>
+              <w:top w:w="65" w:type="dxa"/>
+              <w:bottom w:w="65" w:type="dxa"/>
+              <w:left w:w="65" w:type="dxa"/>
+              <w:right w:w="65" w:type="dxa"/>
+            </w:tcMar>
+          </w:tcPr>
+          <w:p>
+            <w:pPr>
+              <w:spacing w:before="20" w:after="20" w:line="260" w:lineRule="exact"/>
+              <w:jc w:val="center"/>
+            </w:pPr>
+            <w:r>
+              <w:rPr>
+                <w:rFonts w:ascii="Arial" w:hAnsi="Arial" w:eastAsia="Songti SC"/>
+                <w:b w:val="0"/>
+                <w:sz w:val="18"/>
+              </w:rPr>
+              <w:t>23.38%</w:t>
+            </w:r>
+          </w:p>
+        </w:tc>
+        <w:tc>
+          <w:tcPr>
+            <w:tcW w:type="dxa" w:w="850"/>
+            <w:vAlign w:val="center"/>
+            <w:shd w:fill="F5F7F8"/>
+            <w:tcMar>
+              <w:top w:w="65" w:type="dxa"/>
+              <w:bottom w:w="65" w:type="dxa"/>
+              <w:left w:w="65" w:type="dxa"/>
+              <w:right w:w="65" w:type="dxa"/>
+            </w:tcMar>
+          </w:tcPr>
+          <w:p>
+            <w:pPr>
+              <w:spacing w:before="20" w:after="20" w:line="260" w:lineRule="exact"/>
+              <w:jc w:val="center"/>
+            </w:pPr>
+            <w:r>
+              <w:rPr>
+                <w:rFonts w:ascii="Arial" w:hAnsi="Arial" w:eastAsia="Songti SC"/>
+                <w:b w:val="0"/>
+                <w:sz w:val="18"/>
+              </w:rPr>
+              <w:t>0.78</w:t>
+            </w:r>
+          </w:p>
+        </w:tc>
+        <w:tc>
+          <w:tcPr>
+            <w:tcW w:type="dxa" w:w="1531"/>
+            <w:vAlign w:val="center"/>
+            <w:shd w:fill="F5F7F8"/>
+            <w:tcMar>
+              <w:top w:w="65" w:type="dxa"/>
+              <w:bottom w:w="65" w:type="dxa"/>
+              <w:left w:w="65" w:type="dxa"/>
+              <w:right w:w="65" w:type="dxa"/>
+            </w:tcMar>
+          </w:tcPr>
+          <w:p>
+            <w:pPr>
+              <w:spacing w:before="20" w:after="20" w:line="260" w:lineRule="exact"/>
+              <w:jc w:val="center"/>
+            </w:pPr>
+            <w:r>
+              <w:rPr>
+                <w:rFonts w:ascii="Arial" w:hAnsi="Arial" w:eastAsia="Songti SC"/>
+                <w:b w:val="0"/>
+                <w:sz w:val="18"/>
+              </w:rPr>
+              <w:t>-44.85%</w:t>
+            </w:r>
+          </w:p>
+        </w:tc>
+        <w:tc>
+          <w:tcPr>
+            <w:tcW w:type="dxa" w:w="1531"/>
+            <w:vAlign w:val="center"/>
+            <w:shd w:fill="F5F7F8"/>
+            <w:tcMar>
+              <w:top w:w="65" w:type="dxa"/>
+              <w:bottom w:w="65" w:type="dxa"/>
+              <w:left w:w="65" w:type="dxa"/>
+              <w:right w:w="65" w:type="dxa"/>
+            </w:tcMar>
+          </w:tcPr>
+          <w:p>
+            <w:pPr>
+              <w:spacing w:before="20" w:after="20" w:line="260" w:lineRule="exact"/>
+              <w:jc w:val="center"/>
+            </w:pPr>
+            <w:r>
+              <w:rPr>
+                <w:rFonts w:ascii="Arial" w:hAnsi="Arial" w:eastAsia="Songti SC"/>
+                <w:b w:val="0"/>
+                <w:sz w:val="18"/>
+              </w:rPr>
+              <w:t>77.93%</w:t>
+            </w:r>
+          </w:p>
+        </w:tc>
+        <w:tc>
+          <w:tcPr>
+            <w:tcW w:type="dxa" w:w="1531"/>
+            <w:vAlign w:val="center"/>
+            <w:shd w:fill="F5F7F8"/>
+            <w:tcMar>
+              <w:top w:w="65" w:type="dxa"/>
+              <w:bottom w:w="65" w:type="dxa"/>
+              <w:left w:w="65" w:type="dxa"/>
+              <w:right w:w="65" w:type="dxa"/>
+            </w:tcMar>
+          </w:tcPr>
+          <w:p>
+            <w:pPr>
+              <w:spacing w:before="20" w:after="20" w:line="260" w:lineRule="exact"/>
+              <w:jc w:val="center"/>
+            </w:pPr>
+            <w:r>
+              <w:rPr>
+                <w:rFonts w:ascii="Arial" w:hAnsi="Arial" w:eastAsia="Songti SC"/>
+                <w:b w:val="0"/>
+                <w:sz w:val="18"/>
+              </w:rPr>
+              <w:t>1.45%</w:t>
+            </w:r>
+          </w:p>
+        </w:tc>
+      </w:tr>
+    </w:tbl>
+    <w:p>
+      <w:pPr>
+        <w:spacing w:after="0" w:line="60" w:lineRule="exact"/>
+      </w:pPr>
+    </w:p>
+    <w:p>
+      <w:pPr>
+        <w:spacing w:after="80" w:line="260" w:lineRule="exact"/>
+      </w:pPr>
+      <w:r>
+        <w:rPr>
+          <w:rFonts w:ascii="Arial" w:hAnsi="Arial" w:eastAsia="Songti SC"/>
+          <w:b w:val="0"/>
+          <w:color w:val="000000"/>
+          <w:sz w:val="18"/>
+        </w:rPr>
+        <w:t>完成率＝各次实际成交份额×前收盘标记价格之和，除以计划份额×同一标记价格之和。次日重试再次进入分母；该指标衡量每日尝试金额完成程度，不是唯一母单最终成交率。</w:t>
+      </w:r>
+    </w:p>
+    <w:p>
+      <w:pPr>
+        <w:keepNext/>
+        <w:spacing w:after="80" w:line="280" w:lineRule="exact"/>
+      </w:pPr>
+      <w:r>
+        <w:rPr>
+          <w:rFonts w:ascii="Arial" w:hAnsi="Arial" w:eastAsia="Songti SC"/>
+          <w:b/>
+          <w:color w:val="000000"/>
+          <w:sz w:val="20"/>
+        </w:rPr>
+        <w:t>图7  资金增加后的收益与尝试完成率</w:t>
+      </w:r>
+    </w:p>
+    <w:p>
+      <w:pPr>
+        <w:keepNext/>
+        <w:spacing w:after="80" w:line="240" w:lineRule="auto"/>
+      </w:pPr>
+      <w:r>
+        <w:rPr>
+          <w:rFonts w:eastAsia="Songti SC"/>
+        </w:rPr>
+        <w:drawing>
+          <wp:inline xmlns:a="http://schemas.openxmlformats.org/drawingml/2006/main" xmlns:pic="http://schemas.openxmlformats.org/drawingml/2006/picture">
+            <wp:extent cx="6012000" cy="2168799"/>
+            <wp:docPr id="7" name="Picture 7"/>
+            <wp:cNvGraphicFramePr>
+              <a:graphicFrameLocks noChangeAspect="1"/>
+            </wp:cNvGraphicFramePr>
+            <a:graphic>
+              <a:graphicData uri="http://schemas.openxmlformats.org/drawingml/2006/picture">
+                <pic:pic>
+                  <pic:nvPicPr>
+                    <pic:cNvPr id="0" name="capacity_stress.png"/>
+                    <pic:cNvPicPr/>
+                  </pic:nvPicPr>
+                  <pic:blipFill>
+                    <a:blip r:embed="rId23"/>
+                    <a:stretch>
+                      <a:fillRect/>
+                    </a:stretch>
+                  </pic:blipFill>
+                  <pic:spPr>
+                    <a:xfrm>
+                      <a:off x="0" y="0"/>
+                      <a:ext cx="6012000" cy="2168799"/>
+                    </a:xfrm>
+                    <a:prstGeom prst="rect"/>
+                  </pic:spPr>
+                </pic:pic>
+              </a:graphicData>
+            </a:graphic>
+          </wp:inline>
+        </w:drawing>
+      </w:r>
+    </w:p>
+    <w:p>
+      <w:pPr>
+        <w:spacing w:after="80" w:line="260" w:lineRule="exact"/>
+      </w:pPr>
+      <w:r>
+        <w:rPr>
+          <w:rFonts w:ascii="Arial" w:hAnsi="Arial" w:eastAsia="Songti SC"/>
+          <w:b w:val="0"/>
+          <w:color w:val="000000"/>
+          <w:sz w:val="18"/>
+        </w:rPr>
+        <w:t>蓝线为1%主压力，深蓝为0.5%容量，浅蓝为5%容量，三者η均为0.5；灰虚线为原开盘基准。横轴为期初资金，对数刻度。未依据结果寻找最佳上限。</w:t>
+      </w:r>
+    </w:p>
+    <w:p>
+      <w:pPr>
+        <w:spacing w:after="80" w:line="280" w:lineRule="exact"/>
+      </w:pPr>
+      <w:r>
+        <w:rPr>
+          <w:rFonts w:ascii="Arial" w:hAnsi="Arial" w:eastAsia="Songti SC"/>
+          <w:b w:val="0"/>
+          <w:color w:val="000000"/>
+          <w:sz w:val="20"/>
+        </w:rPr>
+        <w:t>100万元主压力年化21.77%，较同资金开盘基准变动-0.22个百分点，尝试完成率85.82%；5000万元对应23.38%、+0.57个百分点和77.93%。这些是固定假设下的历史压力结果，不能认证实盘可承载资金。</w:t>
+      </w:r>
+    </w:p>
+    <w:p>
+      <w:pPr>
+        <w:pStyle w:val="Heading1"/>
+        <w:pageBreakBefore/>
+        <w:spacing w:line="480" w:lineRule="exact"/>
+      </w:pPr>
+      <w:r>
+        <w:rPr>
+          <w:rFonts w:eastAsia="Songti SC"/>
+          <w:color w:val="000000"/>
+        </w:rPr>
+        <w:t>14  差额来源 数据覆盖与未完成的退出</w:t>
+      </w:r>
+    </w:p>
+    <w:p>
+      <w:pPr>
+        <w:keepNext/>
+        <w:spacing w:after="80" w:line="280" w:lineRule="exact"/>
+      </w:pPr>
+      <w:r>
+        <w:rPr>
+          <w:rFonts w:ascii="Arial" w:hAnsi="Arial" w:eastAsia="Songti SC"/>
+          <w:b/>
+          <w:color w:val="000000"/>
+          <w:sz w:val="20"/>
+        </w:rPr>
+        <w:t>表19  分步对照的年化收益变化 2024—2025</w:t>
+      </w:r>
+    </w:p>
+    <w:tbl>
+      <w:tblPr>
+        <w:tblW w:type="auto" w:w="0"/>
+        <w:jc w:val="center"/>
+        <w:tblLayout w:type="fixed"/>
+        <w:tblLook w:firstColumn="1" w:firstRow="1" w:lastColumn="0" w:lastRow="0" w:noHBand="0" w:noVBand="1" w:val="04A0"/>
+        <w:tblBorders>
+          <w:top w:val="single" w:sz="4" w:color="D9D9D9"/>
+          <w:bottom w:val="single" w:sz="4" w:color="D9D9D9"/>
+          <w:left w:val="single" w:sz="4" w:color="D9D9D9"/>
+          <w:right w:val="single" w:sz="4" w:color="D9D9D9"/>
+          <w:insideH w:val="single" w:sz="4" w:color="D9D9D9"/>
+          <w:insideV w:val="single" w:sz="4" w:color="D9D9D9"/>
+        </w:tblBorders>
+      </w:tblPr>
+      <w:tblGrid>
+        <w:gridCol w:w="5669"/>
+        <w:gridCol w:w="1928"/>
+        <w:gridCol w:w="1928"/>
+      </w:tblGrid>
+      <w:tr>
+        <w:trPr>
+          <w:cantSplit/>
+          <w:tblHeader/>
+        </w:trPr>
+        <w:tc>
+          <w:tcPr>
+            <w:tcW w:type="dxa" w:w="5669"/>
+            <w:vAlign w:val="center"/>
+            <w:shd w:fill="E7EBEE"/>
+            <w:tcMar>
+              <w:top w:w="65" w:type="dxa"/>
+              <w:bottom w:w="65" w:type="dxa"/>
+              <w:left w:w="65" w:type="dxa"/>
+              <w:right w:w="65" w:type="dxa"/>
+            </w:tcMar>
+          </w:tcPr>
+          <w:p>
+            <w:pPr>
+              <w:spacing w:before="20" w:after="20" w:line="260" w:lineRule="exact"/>
+              <w:jc w:val="left"/>
+            </w:pPr>
+            <w:r>
+              <w:rPr>
+                <w:rFonts w:ascii="Arial" w:hAnsi="Arial" w:eastAsia="Songti SC"/>
+                <w:b/>
+                <w:sz w:val="18"/>
+              </w:rPr>
+              <w:t>比较及含义</w:t>
+            </w:r>
+          </w:p>
+        </w:tc>
+        <w:tc>
+          <w:tcPr>
+            <w:tcW w:type="dxa" w:w="1928"/>
+            <w:vAlign w:val="center"/>
+            <w:shd w:fill="E7EBEE"/>
+            <w:tcMar>
+              <w:top w:w="65" w:type="dxa"/>
+              <w:bottom w:w="65" w:type="dxa"/>
+              <w:left w:w="65" w:type="dxa"/>
+              <w:right w:w="65" w:type="dxa"/>
+            </w:tcMar>
+          </w:tcPr>
+          <w:p>
+            <w:pPr>
+              <w:spacing w:before="20" w:after="20" w:line="260" w:lineRule="exact"/>
+              <w:jc w:val="center"/>
+            </w:pPr>
+            <w:r>
+              <w:rPr>
+                <w:rFonts w:ascii="Arial" w:hAnsi="Arial" w:eastAsia="Songti SC"/>
+                <w:b/>
+                <w:sz w:val="18"/>
+              </w:rPr>
+              <w:t>100万元</w:t>
+              <w:br/>
+              <w:t>变化百分点</w:t>
+            </w:r>
+          </w:p>
+        </w:tc>
+        <w:tc>
+          <w:tcPr>
+            <w:tcW w:type="dxa" w:w="1928"/>
+            <w:vAlign w:val="center"/>
+            <w:shd w:fill="E7EBEE"/>
+            <w:tcMar>
+              <w:top w:w="65" w:type="dxa"/>
+              <w:bottom w:w="65" w:type="dxa"/>
+              <w:left w:w="65" w:type="dxa"/>
+              <w:right w:w="65" w:type="dxa"/>
+            </w:tcMar>
+          </w:tcPr>
+          <w:p>
+            <w:pPr>
+              <w:spacing w:before="20" w:after="20" w:line="260" w:lineRule="exact"/>
+              <w:jc w:val="center"/>
+            </w:pPr>
+            <w:r>
+              <w:rPr>
+                <w:rFonts w:ascii="Arial" w:hAnsi="Arial" w:eastAsia="Songti SC"/>
+                <w:b/>
+                <w:sz w:val="18"/>
+              </w:rPr>
+              <w:t>5000万元</w:t>
+              <w:br/>
+              <w:t>变化百分点</w:t>
+            </w:r>
+          </w:p>
+        </w:tc>
+      </w:tr>
+      <w:tr>
+        <w:trPr>
+          <w:cantSplit/>
+        </w:trPr>
+        <w:tc>
+          <w:tcPr>
+            <w:tcW w:type="dxa" w:w="5669"/>
+            <w:vAlign w:val="center"/>
+            <w:shd w:fill="FFFFFF"/>
+            <w:tcMar>
+              <w:top w:w="65" w:type="dxa"/>
+              <w:bottom w:w="65" w:type="dxa"/>
+              <w:left w:w="65" w:type="dxa"/>
+              <w:right w:w="65" w:type="dxa"/>
+            </w:tcMar>
+          </w:tcPr>
+          <w:p>
+            <w:pPr>
+              <w:spacing w:before="20" w:after="20" w:line="260" w:lineRule="exact"/>
+              <w:jc w:val="left"/>
+            </w:pPr>
+            <w:r>
+              <w:rPr>
+                <w:rFonts w:ascii="Arial" w:hAnsi="Arial" w:eastAsia="Songti SC"/>
+                <w:b w:val="0"/>
+                <w:sz w:val="18"/>
+              </w:rPr>
+              <w:t>VWAP_BASE − OPEN_BASE</w:t>
+              <w:br/>
+              <w:t>价格参照与成交资格</w:t>
+            </w:r>
+          </w:p>
+        </w:tc>
+        <w:tc>
+          <w:tcPr>
+            <w:tcW w:type="dxa" w:w="1928"/>
+            <w:vAlign w:val="center"/>
+            <w:shd w:fill="FFFFFF"/>
+            <w:tcMar>
+              <w:top w:w="65" w:type="dxa"/>
+              <w:bottom w:w="65" w:type="dxa"/>
+              <w:left w:w="65" w:type="dxa"/>
+              <w:right w:w="65" w:type="dxa"/>
+            </w:tcMar>
+          </w:tcPr>
+          <w:p>
+            <w:pPr>
+              <w:spacing w:before="20" w:after="20" w:line="260" w:lineRule="exact"/>
+              <w:jc w:val="center"/>
+            </w:pPr>
+            <w:r>
+              <w:rPr>
+                <w:rFonts w:ascii="Arial" w:hAnsi="Arial" w:eastAsia="Songti SC"/>
+                <w:b w:val="0"/>
+                <w:sz w:val="18"/>
+              </w:rPr>
+              <w:t>-0.14</w:t>
+            </w:r>
+          </w:p>
+        </w:tc>
+        <w:tc>
+          <w:tcPr>
+            <w:tcW w:type="dxa" w:w="1928"/>
+            <w:vAlign w:val="center"/>
+            <w:shd w:fill="FFFFFF"/>
+            <w:tcMar>
+              <w:top w:w="65" w:type="dxa"/>
+              <w:bottom w:w="65" w:type="dxa"/>
+              <w:left w:w="65" w:type="dxa"/>
+              <w:right w:w="65" w:type="dxa"/>
+            </w:tcMar>
+          </w:tcPr>
+          <w:p>
+            <w:pPr>
+              <w:spacing w:before="20" w:after="20" w:line="260" w:lineRule="exact"/>
+              <w:jc w:val="center"/>
+            </w:pPr>
+            <w:r>
+              <w:rPr>
+                <w:rFonts w:ascii="Arial" w:hAnsi="Arial" w:eastAsia="Songti SC"/>
+                <w:b w:val="0"/>
+                <w:sz w:val="18"/>
+              </w:rPr>
+              <w:t>+0.12</w:t>
+            </w:r>
+          </w:p>
+        </w:tc>
+      </w:tr>
+      <w:tr>
+        <w:trPr>
+          <w:cantSplit/>
+        </w:trPr>
+        <w:tc>
+          <w:tcPr>
+            <w:tcW w:type="dxa" w:w="5669"/>
+            <w:vAlign w:val="center"/>
+            <w:shd w:fill="F5F7F8"/>
+            <w:tcMar>
+              <w:top w:w="65" w:type="dxa"/>
+              <w:bottom w:w="65" w:type="dxa"/>
+              <w:left w:w="65" w:type="dxa"/>
+              <w:right w:w="65" w:type="dxa"/>
+            </w:tcMar>
+          </w:tcPr>
+          <w:p>
+            <w:pPr>
+              <w:spacing w:before="20" w:after="20" w:line="260" w:lineRule="exact"/>
+              <w:jc w:val="left"/>
+            </w:pPr>
+            <w:r>
+              <w:rPr>
+                <w:rFonts w:ascii="Arial" w:hAnsi="Arial" w:eastAsia="Songti SC"/>
+                <w:b w:val="0"/>
+                <w:sz w:val="18"/>
+              </w:rPr>
+              <w:t>CAP_1P − VWAP_BASE</w:t>
+              <w:br/>
+              <w:t>容量与延迟路径</w:t>
+            </w:r>
+          </w:p>
+        </w:tc>
+        <w:tc>
+          <w:tcPr>
+            <w:tcW w:type="dxa" w:w="1928"/>
+            <w:vAlign w:val="center"/>
+            <w:shd w:fill="F5F7F8"/>
+            <w:tcMar>
+              <w:top w:w="65" w:type="dxa"/>
+              <w:bottom w:w="65" w:type="dxa"/>
+              <w:left w:w="65" w:type="dxa"/>
+              <w:right w:w="65" w:type="dxa"/>
+            </w:tcMar>
+          </w:tcPr>
+          <w:p>
+            <w:pPr>
+              <w:spacing w:before="20" w:after="20" w:line="260" w:lineRule="exact"/>
+              <w:jc w:val="center"/>
+            </w:pPr>
+            <w:r>
+              <w:rPr>
+                <w:rFonts w:ascii="Arial" w:hAnsi="Arial" w:eastAsia="Songti SC"/>
+                <w:b w:val="0"/>
+                <w:sz w:val="18"/>
+              </w:rPr>
+              <w:t>+0.00</w:t>
+            </w:r>
+          </w:p>
+        </w:tc>
+        <w:tc>
+          <w:tcPr>
+            <w:tcW w:type="dxa" w:w="1928"/>
+            <w:vAlign w:val="center"/>
+            <w:shd w:fill="F5F7F8"/>
+            <w:tcMar>
+              <w:top w:w="65" w:type="dxa"/>
+              <w:bottom w:w="65" w:type="dxa"/>
+              <w:left w:w="65" w:type="dxa"/>
+              <w:right w:w="65" w:type="dxa"/>
+            </w:tcMar>
+          </w:tcPr>
+          <w:p>
+            <w:pPr>
+              <w:spacing w:before="20" w:after="20" w:line="260" w:lineRule="exact"/>
+              <w:jc w:val="center"/>
+            </w:pPr>
+            <w:r>
+              <w:rPr>
+                <w:rFonts w:ascii="Arial" w:hAnsi="Arial" w:eastAsia="Songti SC"/>
+                <w:b w:val="0"/>
+                <w:sz w:val="18"/>
+              </w:rPr>
+              <w:t>+1.11</w:t>
+            </w:r>
+          </w:p>
+        </w:tc>
+      </w:tr>
+      <w:tr>
+        <w:trPr>
+          <w:cantSplit/>
+        </w:trPr>
+        <w:tc>
+          <w:tcPr>
+            <w:tcW w:type="dxa" w:w="5669"/>
+            <w:vAlign w:val="center"/>
+            <w:shd w:fill="FFFFFF"/>
+            <w:tcMar>
+              <w:top w:w="65" w:type="dxa"/>
+              <w:bottom w:w="65" w:type="dxa"/>
+              <w:left w:w="65" w:type="dxa"/>
+              <w:right w:w="65" w:type="dxa"/>
+            </w:tcMar>
+          </w:tcPr>
+          <w:p>
+            <w:pPr>
+              <w:spacing w:before="20" w:after="20" w:line="260" w:lineRule="exact"/>
+              <w:jc w:val="left"/>
+            </w:pPr>
+            <w:r>
+              <w:rPr>
+                <w:rFonts w:ascii="Arial" w:hAnsi="Arial" w:eastAsia="Songti SC"/>
+                <w:b w:val="0"/>
+                <w:sz w:val="18"/>
+              </w:rPr>
+              <w:t>CAP_1P_SIGMA − CAP_1P</w:t>
+              <w:br/>
+              <w:t>波动率数据覆盖</w:t>
+            </w:r>
+          </w:p>
+        </w:tc>
+        <w:tc>
+          <w:tcPr>
+            <w:tcW w:type="dxa" w:w="1928"/>
+            <w:vAlign w:val="center"/>
+            <w:shd w:fill="FFFFFF"/>
+            <w:tcMar>
+              <w:top w:w="65" w:type="dxa"/>
+              <w:bottom w:w="65" w:type="dxa"/>
+              <w:left w:w="65" w:type="dxa"/>
+              <w:right w:w="65" w:type="dxa"/>
+            </w:tcMar>
+          </w:tcPr>
+          <w:p>
+            <w:pPr>
+              <w:spacing w:before="20" w:after="20" w:line="260" w:lineRule="exact"/>
+              <w:jc w:val="center"/>
+            </w:pPr>
+            <w:r>
+              <w:rPr>
+                <w:rFonts w:ascii="Arial" w:hAnsi="Arial" w:eastAsia="Songti SC"/>
+                <w:b w:val="0"/>
+                <w:sz w:val="18"/>
+              </w:rPr>
+              <w:t>+0.00</w:t>
+            </w:r>
+          </w:p>
+        </w:tc>
+        <w:tc>
+          <w:tcPr>
+            <w:tcW w:type="dxa" w:w="1928"/>
+            <w:vAlign w:val="center"/>
+            <w:shd w:fill="FFFFFF"/>
+            <w:tcMar>
+              <w:top w:w="65" w:type="dxa"/>
+              <w:bottom w:w="65" w:type="dxa"/>
+              <w:left w:w="65" w:type="dxa"/>
+              <w:right w:w="65" w:type="dxa"/>
+            </w:tcMar>
+          </w:tcPr>
+          <w:p>
+            <w:pPr>
+              <w:spacing w:before="20" w:after="20" w:line="260" w:lineRule="exact"/>
+              <w:jc w:val="center"/>
+            </w:pPr>
+            <w:r>
+              <w:rPr>
+                <w:rFonts w:ascii="Arial" w:hAnsi="Arial" w:eastAsia="Songti SC"/>
+                <w:b w:val="0"/>
+                <w:sz w:val="18"/>
+              </w:rPr>
+              <w:t>+0.00</w:t>
+            </w:r>
+          </w:p>
+        </w:tc>
+      </w:tr>
+      <w:tr>
+        <w:trPr>
+          <w:cantSplit/>
+        </w:trPr>
+        <w:tc>
+          <w:tcPr>
+            <w:tcW w:type="dxa" w:w="5669"/>
+            <w:vAlign w:val="center"/>
+            <w:shd w:fill="F5F7F8"/>
+            <w:tcMar>
+              <w:top w:w="65" w:type="dxa"/>
+              <w:bottom w:w="65" w:type="dxa"/>
+              <w:left w:w="65" w:type="dxa"/>
+              <w:right w:w="65" w:type="dxa"/>
+            </w:tcMar>
+          </w:tcPr>
+          <w:p>
+            <w:pPr>
+              <w:spacing w:before="20" w:after="20" w:line="260" w:lineRule="exact"/>
+              <w:jc w:val="left"/>
+            </w:pPr>
+            <w:r>
+              <w:rPr>
+                <w:rFonts w:ascii="Arial" w:hAnsi="Arial" w:eastAsia="Songti SC"/>
+                <w:b w:val="0"/>
+                <w:sz w:val="18"/>
+              </w:rPr>
+              <w:t>MAIN_1P − CAP_1P_SIGMA</w:t>
+              <w:br/>
+              <w:t>增量冲击与持仓路径</w:t>
+            </w:r>
+          </w:p>
+        </w:tc>
+        <w:tc>
+          <w:tcPr>
+            <w:tcW w:type="dxa" w:w="1928"/>
+            <w:vAlign w:val="center"/>
+            <w:shd w:fill="F5F7F8"/>
+            <w:tcMar>
+              <w:top w:w="65" w:type="dxa"/>
+              <w:bottom w:w="65" w:type="dxa"/>
+              <w:left w:w="65" w:type="dxa"/>
+              <w:right w:w="65" w:type="dxa"/>
+            </w:tcMar>
+          </w:tcPr>
+          <w:p>
+            <w:pPr>
+              <w:spacing w:before="20" w:after="20" w:line="260" w:lineRule="exact"/>
+              <w:jc w:val="center"/>
+            </w:pPr>
+            <w:r>
+              <w:rPr>
+                <w:rFonts w:ascii="Arial" w:hAnsi="Arial" w:eastAsia="Songti SC"/>
+                <w:b w:val="0"/>
+                <w:sz w:val="18"/>
+              </w:rPr>
+              <w:t>-0.09</w:t>
+            </w:r>
+          </w:p>
+        </w:tc>
+        <w:tc>
+          <w:tcPr>
+            <w:tcW w:type="dxa" w:w="1928"/>
+            <w:vAlign w:val="center"/>
+            <w:shd w:fill="F5F7F8"/>
+            <w:tcMar>
+              <w:top w:w="65" w:type="dxa"/>
+              <w:bottom w:w="65" w:type="dxa"/>
+              <w:left w:w="65" w:type="dxa"/>
+              <w:right w:w="65" w:type="dxa"/>
+            </w:tcMar>
+          </w:tcPr>
+          <w:p>
+            <w:pPr>
+              <w:spacing w:before="20" w:after="20" w:line="260" w:lineRule="exact"/>
+              <w:jc w:val="center"/>
+            </w:pPr>
+            <w:r>
+              <w:rPr>
+                <w:rFonts w:ascii="Arial" w:hAnsi="Arial" w:eastAsia="Songti SC"/>
+                <w:b w:val="0"/>
+                <w:sz w:val="18"/>
+              </w:rPr>
+              <w:t>-0.65</w:t>
+            </w:r>
+          </w:p>
+        </w:tc>
+      </w:tr>
+    </w:tbl>
+    <w:p>
+      <w:pPr>
+        <w:spacing w:after="0" w:line="60" w:lineRule="exact"/>
+      </w:pPr>
+    </w:p>
+    <w:p>
+      <w:pPr>
+        <w:spacing w:after="80" w:line="260" w:lineRule="exact"/>
+      </w:pPr>
+      <w:r>
+        <w:rPr>
+          <w:rFonts w:ascii="Arial" w:hAnsi="Arial" w:eastAsia="Songti SC"/>
+          <w:b w:val="0"/>
+          <w:color w:val="000000"/>
+          <w:sz w:val="18"/>
+        </w:rPr>
+        <w:t>各行是重跑后的年化差额，不是现金费用的简单扣减。最后一行使用相同σ资格；差异仍可通过现金、整手、延迟与后续持仓传播。容量更紧可能减少涨跌两侧暴露，曲线不保证单调。</w:t>
+      </w:r>
+    </w:p>
+    <w:p>
+      <w:pPr>
+        <w:spacing w:after="80" w:line="260" w:lineRule="exact"/>
+      </w:pPr>
+      <w:r>
+        <w:rPr>
+          <w:rFonts w:ascii="Arial" w:hAnsi="Arial" w:eastAsia="Songti SC"/>
+          <w:b w:val="0"/>
+          <w:color w:val="000000"/>
+          <w:sz w:val="18"/>
+        </w:rPr>
+        <w:t>保持1%容量，把η从0.5升至1.0，100万／5000万元年化分别较主压力变动-0.08／-0.69个百分点。主压力这两档累计增量冲击费用为0.16／56.23万元。</w:t>
+      </w:r>
+    </w:p>
+    <w:p>
+      <w:pPr>
+        <w:keepNext/>
+        <w:spacing w:after="80" w:line="280" w:lineRule="exact"/>
+      </w:pPr>
+      <w:r>
+        <w:rPr>
+          <w:rFonts w:ascii="Arial" w:hAnsi="Arial" w:eastAsia="Songti SC"/>
+          <w:b/>
+          <w:color w:val="000000"/>
+          <w:sz w:val="20"/>
+        </w:rPr>
+        <w:t>表20  样本内压力结果及复利规模 2015—2023</w:t>
+      </w:r>
+    </w:p>
+    <w:tbl>
+      <w:tblPr>
+        <w:tblW w:type="auto" w:w="0"/>
+        <w:jc w:val="center"/>
+        <w:tblLayout w:type="fixed"/>
+        <w:tblLook w:firstColumn="1" w:firstRow="1" w:lastColumn="0" w:lastRow="0" w:noHBand="0" w:noVBand="1" w:val="04A0"/>
+        <w:tblBorders>
+          <w:top w:val="single" w:sz="4" w:color="D9D9D9"/>
+          <w:bottom w:val="single" w:sz="4" w:color="D9D9D9"/>
+          <w:left w:val="single" w:sz="4" w:color="D9D9D9"/>
+          <w:right w:val="single" w:sz="4" w:color="D9D9D9"/>
+          <w:insideH w:val="single" w:sz="4" w:color="D9D9D9"/>
+          <w:insideV w:val="single" w:sz="4" w:color="D9D9D9"/>
+        </w:tblBorders>
+      </w:tblPr>
+      <w:tblGrid>
+        <w:gridCol w:w="1531"/>
+        <w:gridCol w:w="1701"/>
+        <w:gridCol w:w="1757"/>
+        <w:gridCol w:w="1928"/>
+        <w:gridCol w:w="2608"/>
+      </w:tblGrid>
+      <w:tr>
+        <w:trPr>
+          <w:cantSplit/>
+          <w:tblHeader/>
+        </w:trPr>
+        <w:tc>
+          <w:tcPr>
+            <w:tcW w:type="dxa" w:w="1531"/>
+            <w:vAlign w:val="center"/>
+            <w:shd w:fill="E7EBEE"/>
+            <w:tcMar>
+              <w:top w:w="65" w:type="dxa"/>
+              <w:bottom w:w="65" w:type="dxa"/>
+              <w:left w:w="65" w:type="dxa"/>
+              <w:right w:w="65" w:type="dxa"/>
+            </w:tcMar>
+          </w:tcPr>
+          <w:p>
+            <w:pPr>
+              <w:spacing w:before="20" w:after="20" w:line="260" w:lineRule="exact"/>
+              <w:jc w:val="left"/>
+            </w:pPr>
+            <w:r>
+              <w:rPr>
+                <w:rFonts w:ascii="Arial" w:hAnsi="Arial" w:eastAsia="Songti SC"/>
+                <w:b/>
+                <w:sz w:val="18"/>
+              </w:rPr>
+              <w:t>初始资金</w:t>
+            </w:r>
+          </w:p>
+        </w:tc>
+        <w:tc>
+          <w:tcPr>
+            <w:tcW w:type="dxa" w:w="1701"/>
+            <w:vAlign w:val="center"/>
+            <w:shd w:fill="E7EBEE"/>
+            <w:tcMar>
+              <w:top w:w="65" w:type="dxa"/>
+              <w:bottom w:w="65" w:type="dxa"/>
+              <w:left w:w="65" w:type="dxa"/>
+              <w:right w:w="65" w:type="dxa"/>
+            </w:tcMar>
+          </w:tcPr>
+          <w:p>
+            <w:pPr>
+              <w:spacing w:before="20" w:after="20" w:line="260" w:lineRule="exact"/>
+              <w:jc w:val="center"/>
+            </w:pPr>
+            <w:r>
+              <w:rPr>
+                <w:rFonts w:ascii="Arial" w:hAnsi="Arial" w:eastAsia="Songti SC"/>
+                <w:b/>
+                <w:sz w:val="18"/>
+              </w:rPr>
+              <w:t>基准年化</w:t>
+            </w:r>
+          </w:p>
+        </w:tc>
+        <w:tc>
+          <w:tcPr>
+            <w:tcW w:type="dxa" w:w="1757"/>
+            <w:vAlign w:val="center"/>
+            <w:shd w:fill="E7EBEE"/>
+            <w:tcMar>
+              <w:top w:w="65" w:type="dxa"/>
+              <w:bottom w:w="65" w:type="dxa"/>
+              <w:left w:w="65" w:type="dxa"/>
+              <w:right w:w="65" w:type="dxa"/>
+            </w:tcMar>
+          </w:tcPr>
+          <w:p>
+            <w:pPr>
+              <w:spacing w:before="20" w:after="20" w:line="260" w:lineRule="exact"/>
+              <w:jc w:val="center"/>
+            </w:pPr>
+            <w:r>
+              <w:rPr>
+                <w:rFonts w:ascii="Arial" w:hAnsi="Arial" w:eastAsia="Songti SC"/>
+                <w:b/>
+                <w:sz w:val="18"/>
+              </w:rPr>
+              <w:t>主压力年化</w:t>
+            </w:r>
+          </w:p>
+        </w:tc>
+        <w:tc>
+          <w:tcPr>
+            <w:tcW w:type="dxa" w:w="1928"/>
+            <w:vAlign w:val="center"/>
+            <w:shd w:fill="E7EBEE"/>
+            <w:tcMar>
+              <w:top w:w="65" w:type="dxa"/>
+              <w:bottom w:w="65" w:type="dxa"/>
+              <w:left w:w="65" w:type="dxa"/>
+              <w:right w:w="65" w:type="dxa"/>
+            </w:tcMar>
+          </w:tcPr>
+          <w:p>
+            <w:pPr>
+              <w:spacing w:before="20" w:after="20" w:line="260" w:lineRule="exact"/>
+              <w:jc w:val="center"/>
+            </w:pPr>
+            <w:r>
+              <w:rPr>
+                <w:rFonts w:ascii="Arial" w:hAnsi="Arial" w:eastAsia="Songti SC"/>
+                <w:b/>
+                <w:sz w:val="18"/>
+              </w:rPr>
+              <w:t>尝试完成率</w:t>
+            </w:r>
+          </w:p>
+        </w:tc>
+        <w:tc>
+          <w:tcPr>
+            <w:tcW w:type="dxa" w:w="2608"/>
+            <w:vAlign w:val="center"/>
+            <w:shd w:fill="E7EBEE"/>
+            <w:tcMar>
+              <w:top w:w="65" w:type="dxa"/>
+              <w:bottom w:w="65" w:type="dxa"/>
+              <w:left w:w="65" w:type="dxa"/>
+              <w:right w:w="65" w:type="dxa"/>
+            </w:tcMar>
+          </w:tcPr>
+          <w:p>
+            <w:pPr>
+              <w:spacing w:before="20" w:after="20" w:line="260" w:lineRule="exact"/>
+              <w:jc w:val="center"/>
+            </w:pPr>
+            <w:r>
+              <w:rPr>
+                <w:rFonts w:ascii="Arial" w:hAnsi="Arial" w:eastAsia="Songti SC"/>
+                <w:b/>
+                <w:sz w:val="18"/>
+              </w:rPr>
+              <w:t>主压力最大净值</w:t>
+            </w:r>
+          </w:p>
+        </w:tc>
+      </w:tr>
+      <w:tr>
+        <w:trPr>
+          <w:cantSplit/>
+        </w:trPr>
+        <w:tc>
+          <w:tcPr>
+            <w:tcW w:type="dxa" w:w="1531"/>
+            <w:vAlign w:val="center"/>
+            <w:shd w:fill="FFFFFF"/>
+            <w:tcMar>
+              <w:top w:w="65" w:type="dxa"/>
+              <w:bottom w:w="65" w:type="dxa"/>
+              <w:left w:w="65" w:type="dxa"/>
+              <w:right w:w="65" w:type="dxa"/>
+            </w:tcMar>
+          </w:tcPr>
+          <w:p>
+            <w:pPr>
+              <w:spacing w:before="20" w:after="20" w:line="260" w:lineRule="exact"/>
+              <w:jc w:val="left"/>
+            </w:pPr>
+            <w:r>
+              <w:rPr>
+                <w:rFonts w:ascii="Arial" w:hAnsi="Arial" w:eastAsia="Songti SC"/>
+                <w:b w:val="0"/>
+                <w:sz w:val="18"/>
+              </w:rPr>
+              <w:t>100万元</w:t>
+            </w:r>
+          </w:p>
+        </w:tc>
+        <w:tc>
+          <w:tcPr>
+            <w:tcW w:type="dxa" w:w="1701"/>
+            <w:vAlign w:val="center"/>
+            <w:shd w:fill="FFFFFF"/>
+            <w:tcMar>
+              <w:top w:w="65" w:type="dxa"/>
+              <w:bottom w:w="65" w:type="dxa"/>
+              <w:left w:w="65" w:type="dxa"/>
+              <w:right w:w="65" w:type="dxa"/>
+            </w:tcMar>
+          </w:tcPr>
+          <w:p>
+            <w:pPr>
+              <w:spacing w:before="20" w:after="20" w:line="260" w:lineRule="exact"/>
+              <w:jc w:val="center"/>
+            </w:pPr>
+            <w:r>
+              <w:rPr>
+                <w:rFonts w:ascii="Arial" w:hAnsi="Arial" w:eastAsia="Songti SC"/>
+                <w:b w:val="0"/>
+                <w:sz w:val="18"/>
+              </w:rPr>
+              <w:t>22.05%</w:t>
+            </w:r>
+          </w:p>
+        </w:tc>
+        <w:tc>
+          <w:tcPr>
+            <w:tcW w:type="dxa" w:w="1757"/>
+            <w:vAlign w:val="center"/>
+            <w:shd w:fill="FFFFFF"/>
+            <w:tcMar>
+              <w:top w:w="65" w:type="dxa"/>
+              <w:bottom w:w="65" w:type="dxa"/>
+              <w:left w:w="65" w:type="dxa"/>
+              <w:right w:w="65" w:type="dxa"/>
+            </w:tcMar>
+          </w:tcPr>
+          <w:p>
+            <w:pPr>
+              <w:spacing w:before="20" w:after="20" w:line="260" w:lineRule="exact"/>
+              <w:jc w:val="center"/>
+            </w:pPr>
+            <w:r>
+              <w:rPr>
+                <w:rFonts w:ascii="Arial" w:hAnsi="Arial" w:eastAsia="Songti SC"/>
+                <w:b w:val="0"/>
+                <w:sz w:val="18"/>
+              </w:rPr>
+              <w:t>21.74%</w:t>
+            </w:r>
+          </w:p>
+        </w:tc>
+        <w:tc>
+          <w:tcPr>
+            <w:tcW w:type="dxa" w:w="1928"/>
+            <w:vAlign w:val="center"/>
+            <w:shd w:fill="FFFFFF"/>
+            <w:tcMar>
+              <w:top w:w="65" w:type="dxa"/>
+              <w:bottom w:w="65" w:type="dxa"/>
+              <w:left w:w="65" w:type="dxa"/>
+              <w:right w:w="65" w:type="dxa"/>
+            </w:tcMar>
+          </w:tcPr>
+          <w:p>
+            <w:pPr>
+              <w:spacing w:before="20" w:after="20" w:line="260" w:lineRule="exact"/>
+              <w:jc w:val="center"/>
+            </w:pPr>
+            <w:r>
+              <w:rPr>
+                <w:rFonts w:ascii="Arial" w:hAnsi="Arial" w:eastAsia="Songti SC"/>
+                <w:b w:val="0"/>
+                <w:sz w:val="18"/>
+              </w:rPr>
+              <w:t>43.45%</w:t>
+            </w:r>
+          </w:p>
+        </w:tc>
+        <w:tc>
+          <w:tcPr>
+            <w:tcW w:type="dxa" w:w="2608"/>
+            <w:vAlign w:val="center"/>
+            <w:shd w:fill="FFFFFF"/>
+            <w:tcMar>
+              <w:top w:w="65" w:type="dxa"/>
+              <w:bottom w:w="65" w:type="dxa"/>
+              <w:left w:w="65" w:type="dxa"/>
+              <w:right w:w="65" w:type="dxa"/>
+            </w:tcMar>
+          </w:tcPr>
+          <w:p>
+            <w:pPr>
+              <w:spacing w:before="20" w:after="20" w:line="260" w:lineRule="exact"/>
+              <w:jc w:val="center"/>
+            </w:pPr>
+            <w:r>
+              <w:rPr>
+                <w:rFonts w:ascii="Arial" w:hAnsi="Arial" w:eastAsia="Songti SC"/>
+                <w:b w:val="0"/>
+                <w:sz w:val="18"/>
+              </w:rPr>
+              <w:t>602.3万元</w:t>
+            </w:r>
+          </w:p>
+        </w:tc>
+      </w:tr>
+      <w:tr>
+        <w:trPr>
+          <w:cantSplit/>
+        </w:trPr>
+        <w:tc>
+          <w:tcPr>
+            <w:tcW w:type="dxa" w:w="1531"/>
+            <w:vAlign w:val="center"/>
+            <w:shd w:fill="F5F7F8"/>
+            <w:tcMar>
+              <w:top w:w="65" w:type="dxa"/>
+              <w:bottom w:w="65" w:type="dxa"/>
+              <w:left w:w="65" w:type="dxa"/>
+              <w:right w:w="65" w:type="dxa"/>
+            </w:tcMar>
+          </w:tcPr>
+          <w:p>
+            <w:pPr>
+              <w:spacing w:before="20" w:after="20" w:line="260" w:lineRule="exact"/>
+              <w:jc w:val="left"/>
+            </w:pPr>
+            <w:r>
+              <w:rPr>
+                <w:rFonts w:ascii="Arial" w:hAnsi="Arial" w:eastAsia="Songti SC"/>
+                <w:b w:val="0"/>
+                <w:sz w:val="18"/>
+              </w:rPr>
+              <w:t>5,000万元</w:t>
+            </w:r>
+          </w:p>
+        </w:tc>
+        <w:tc>
+          <w:tcPr>
+            <w:tcW w:type="dxa" w:w="1701"/>
+            <w:vAlign w:val="center"/>
+            <w:shd w:fill="F5F7F8"/>
+            <w:tcMar>
+              <w:top w:w="65" w:type="dxa"/>
+              <w:bottom w:w="65" w:type="dxa"/>
+              <w:left w:w="65" w:type="dxa"/>
+              <w:right w:w="65" w:type="dxa"/>
+            </w:tcMar>
+          </w:tcPr>
+          <w:p>
+            <w:pPr>
+              <w:spacing w:before="20" w:after="20" w:line="260" w:lineRule="exact"/>
+              <w:jc w:val="center"/>
+            </w:pPr>
+            <w:r>
+              <w:rPr>
+                <w:rFonts w:ascii="Arial" w:hAnsi="Arial" w:eastAsia="Songti SC"/>
+                <w:b w:val="0"/>
+                <w:sz w:val="18"/>
+              </w:rPr>
+              <w:t>22.98%</w:t>
+            </w:r>
+          </w:p>
+        </w:tc>
+        <w:tc>
+          <w:tcPr>
+            <w:tcW w:type="dxa" w:w="1757"/>
+            <w:vAlign w:val="center"/>
+            <w:shd w:fill="F5F7F8"/>
+            <w:tcMar>
+              <w:top w:w="65" w:type="dxa"/>
+              <w:bottom w:w="65" w:type="dxa"/>
+              <w:left w:w="65" w:type="dxa"/>
+              <w:right w:w="65" w:type="dxa"/>
+            </w:tcMar>
+          </w:tcPr>
+          <w:p>
+            <w:pPr>
+              <w:spacing w:before="20" w:after="20" w:line="260" w:lineRule="exact"/>
+              <w:jc w:val="center"/>
+            </w:pPr>
+            <w:r>
+              <w:rPr>
+                <w:rFonts w:ascii="Arial" w:hAnsi="Arial" w:eastAsia="Songti SC"/>
+                <w:b w:val="0"/>
+                <w:sz w:val="18"/>
+              </w:rPr>
+              <w:t>21.60%</w:t>
+            </w:r>
+          </w:p>
+        </w:tc>
+        <w:tc>
+          <w:tcPr>
+            <w:tcW w:type="dxa" w:w="1928"/>
+            <w:vAlign w:val="center"/>
+            <w:shd w:fill="F5F7F8"/>
+            <w:tcMar>
+              <w:top w:w="65" w:type="dxa"/>
+              <w:bottom w:w="65" w:type="dxa"/>
+              <w:left w:w="65" w:type="dxa"/>
+              <w:right w:w="65" w:type="dxa"/>
+            </w:tcMar>
+          </w:tcPr>
+          <w:p>
+            <w:pPr>
+              <w:spacing w:before="20" w:after="20" w:line="260" w:lineRule="exact"/>
+              <w:jc w:val="center"/>
+            </w:pPr>
+            <w:r>
+              <w:rPr>
+                <w:rFonts w:ascii="Arial" w:hAnsi="Arial" w:eastAsia="Songti SC"/>
+                <w:b w:val="0"/>
+                <w:sz w:val="18"/>
+              </w:rPr>
+              <w:t>27.64%</w:t>
+            </w:r>
+          </w:p>
+        </w:tc>
+        <w:tc>
+          <w:tcPr>
+            <w:tcW w:type="dxa" w:w="2608"/>
+            <w:vAlign w:val="center"/>
+            <w:shd w:fill="F5F7F8"/>
+            <w:tcMar>
+              <w:top w:w="65" w:type="dxa"/>
+              <w:bottom w:w="65" w:type="dxa"/>
+              <w:left w:w="65" w:type="dxa"/>
+              <w:right w:w="65" w:type="dxa"/>
+            </w:tcMar>
+          </w:tcPr>
+          <w:p>
+            <w:pPr>
+              <w:spacing w:before="20" w:after="20" w:line="260" w:lineRule="exact"/>
+              <w:jc w:val="center"/>
+            </w:pPr>
+            <w:r>
+              <w:rPr>
+                <w:rFonts w:ascii="Arial" w:hAnsi="Arial" w:eastAsia="Songti SC"/>
+                <w:b w:val="0"/>
+                <w:sz w:val="18"/>
+              </w:rPr>
+              <w:t>29,816.2万元</w:t>
+            </w:r>
+          </w:p>
+        </w:tc>
+      </w:tr>
+    </w:tbl>
+    <w:p>
+      <w:pPr>
+        <w:spacing w:after="0" w:line="60" w:lineRule="exact"/>
+      </w:pPr>
+    </w:p>
+    <w:p>
+      <w:pPr>
+        <w:spacing w:after="80" w:line="260" w:lineRule="exact"/>
+      </w:pPr>
+      <w:r>
+        <w:rPr>
+          <w:rFonts w:ascii="Arial" w:hAnsi="Arial" w:eastAsia="Songti SC"/>
+          <w:b w:val="0"/>
+          <w:color w:val="000000"/>
+          <w:sz w:val="18"/>
+        </w:rPr>
+        <w:t>2024—2025主压力的最大净值：100万元起点为159.2万元，5000万元起点为8,182.7万元。九年样本内路径可能放大实际资金量；所有结果均不代表全程维持恒定规模。完整八场景收益、月度夏普和风险指标见performance.csv。</w:t>
+      </w:r>
+    </w:p>
+    <w:p>
+      <w:pPr>
+        <w:spacing w:after="80" w:line="260" w:lineRule="exact"/>
+      </w:pPr>
+      <w:r>
+        <w:rPr>
+          <w:rFonts w:ascii="Arial" w:hAnsi="Arial" w:eastAsia="Songti SC"/>
+          <w:b w:val="0"/>
+          <w:color w:val="000000"/>
+          <w:sz w:val="18"/>
+        </w:rPr>
+        <w:t>历史留出100万／5000万元主压力的月末平均普通目标缺口占净值5.29%／1.03%；这只度量普通目标缺口，ST补仓未用预算在结果表中另列，不能把尝试完成率当作组合目标完成率。</w:t>
+      </w:r>
+    </w:p>
+    <w:p>
+      <w:pPr>
+        <w:pStyle w:val="Heading2"/>
+        <w:pageBreakBefore/>
+        <w:spacing w:after="80" w:line="360" w:lineRule="exact"/>
+      </w:pPr>
+      <w:r>
+        <w:rPr>
+          <w:rFonts w:ascii="Arial" w:hAnsi="Arial" w:eastAsia="Songti SC"/>
+          <w:b/>
+          <w:color w:val="000000"/>
+          <w:sz w:val="24"/>
+        </w:rPr>
+        <w:t>14（续） 未知数据与风险退出需要单列</w:t>
+      </w:r>
+    </w:p>
+    <w:p>
+      <w:pPr>
+        <w:spacing w:after="80" w:line="260" w:lineRule="exact"/>
+      </w:pPr>
+      <w:r>
+        <w:rPr>
+          <w:rFonts w:ascii="Arial" w:hAnsi="Arial" w:eastAsia="Songti SC"/>
+          <w:b w:val="0"/>
+          <w:color w:val="000000"/>
+          <w:sz w:val="18"/>
+        </w:rPr>
+        <w:t>公开输入核验记录：新旧重叠字段差异0项；原市场矩阵内VWAP异常0项；已有开盘报价但成交量缺失的公司日0项。原冻结赢家的144,314条计划记录中，ADV未知0条、ADV为0有10,069条、σ未知100条。该口径是原订单覆盖，不是新场景的成交率。</w:t>
+      </w:r>
+    </w:p>
+    <w:p>
+      <w:pPr>
+        <w:spacing w:after="80" w:line="260" w:lineRule="exact"/>
+      </w:pPr>
+      <w:r>
+        <w:rPr>
+          <w:rFonts w:ascii="Arial" w:hAnsi="Arial" w:eastAsia="Songti SC"/>
+          <w:b w:val="0"/>
+          <w:color w:val="000000"/>
+          <w:sz w:val="18"/>
+        </w:rPr>
+        <w:t>主压力中，因所需数据缺失、无效或ADV为0而未成交的尝试，样本内100万／5000万元分别为109／124次，历史留出为0／0次。该汇总含零ADV，不可全部称为数据缺失；详细原因见constraint_summary.csv。</w:t>
+      </w:r>
+    </w:p>
+    <w:p>
+      <w:pPr>
+        <w:spacing w:after="80" w:line="260" w:lineRule="exact"/>
+      </w:pPr>
+      <w:r>
+        <w:rPr>
+          <w:rFonts w:ascii="Arial" w:hAnsi="Arial" w:eastAsia="Songti SC"/>
+          <w:b w:val="0"/>
+          <w:color w:val="000000"/>
+          <w:sz w:val="18"/>
+        </w:rPr>
+        <w:t>历史留出100万／5000万元主压力的ST卖出已成交部分，最长延迟分别为16／16个交易日；期末待退出股票为0／0只，占净值0.00%／0.00%。已成交延迟不覆盖仍未卖出的尾部风险。</w:t>
+      </w:r>
+    </w:p>
+    <w:p>
+      <w:pPr>
+        <w:spacing w:after="80" w:line="260" w:lineRule="exact"/>
+      </w:pPr>
+      <w:r>
+        <w:rPr>
+          <w:rFonts w:ascii="Arial" w:hAnsi="Arial" w:eastAsia="Songti SC"/>
+          <w:b w:val="0"/>
+          <w:color w:val="000000"/>
+          <w:sz w:val="18"/>
+        </w:rPr>
+        <w:t>期末仍待退出头寸的最长已等待时间分别为0／0个交易日。</w:t>
+      </w:r>
+    </w:p>
+    <w:p>
+      <w:pPr>
+        <w:spacing w:after="80" w:line="260" w:lineRule="exact"/>
+      </w:pPr>
+      <w:r>
+        <w:rPr>
+          <w:rFonts w:ascii="Arial" w:hAnsi="Arial" w:eastAsia="Songti SC"/>
+          <w:b w:val="0"/>
+          <w:color w:val="000000"/>
+          <w:sz w:val="18"/>
+        </w:rPr>
+        <w:t>期末待退出为0不等于全部成功卖出。600321.SH在模型中于2024-06-27按冻结的零残值规则终止记账；100万／5000万元主情景的最后账面冲销分别为3,950／168,450元，卖出回款均为0。这是终止时账面冲销，非总投资损失；多情景中的同一事件不能重复算作多家公司。</w:t>
+      </w:r>
+    </w:p>
+    <w:p>
+      <w:pPr>
+        <w:spacing w:after="80" w:line="260" w:lineRule="exact"/>
+      </w:pPr>
+      <w:r>
+        <w:rPr>
+          <w:rFonts w:ascii="Arial" w:hAnsi="Arial" w:eastAsia="Songti SC"/>
+          <w:b w:val="0"/>
+          <w:color w:val="000000"/>
+          <w:sz w:val="18"/>
+        </w:rPr>
+        <w:t>日频总量无法描述分钟价格路径、买卖价差、开盘竞价队列及成交量的内生反应。全天VWAP也不保证真实可获得。本文没有实测订单校准η，复权份额与分红再投资仍不是完整券商结算账户。因此只判断固定压力假设怎样改变收益与暴露，不宣布“某资金规模一定可执行”。</w:t>
       </w:r>
     </w:p>
     <w:p>
@@ -11766,7 +16101,11 @@
         <w:spacing w:line="480" w:lineRule="exact"/>
       </w:pPr>
       <w:r>
-        <w:t>12  结论与仍然不能回答的问题</w:t>
+        <w:rPr>
+          <w:rFonts w:eastAsia="Songti SC"/>
+          <w:color w:val="000000"/>
+        </w:rPr>
+        <w:t>15  结论与仍然不能回答的问题</w:t>
       </w:r>
     </w:p>
     <w:p>
@@ -11778,6 +16117,7 @@
       <w:r>
         <w:rPr>
           <w:rFonts w:eastAsia="Songti SC"/>
+          <w:color w:val="000000"/>
         </w:rPr>
         <w:t>当前证据支持什么</w:t>
       </w:r>
@@ -11804,6 +16144,7 @@
       <w:r>
         <w:rPr>
           <w:rFonts w:eastAsia="Songti SC"/>
+          <w:color w:val="000000"/>
         </w:rPr>
         <w:t>哪些原始判断需要收窄</w:t>
       </w:r>
@@ -11830,6 +16171,7 @@
       <w:r>
         <w:rPr>
           <w:rFonts w:eastAsia="Songti SC"/>
+          <w:color w:val="000000"/>
         </w:rPr>
         <w:t>优先考虑的证据限制</w:t>
       </w:r>
@@ -11855,9 +16197,8 @@
       <w:r>
         <w:rPr>
           <w:rFonts w:eastAsia="Songti SC"/>
-          <w:b w:val="0"/>
         </w:rPr>
-        <w:t>价格与结算：日线开盘能否成交是简化假设，未建模排队、成交量和冲击。停牌沿用末次价格会延迟风险显现，退市残值并非认证清算款；整手实验仍采用复权收益账户。若要给出实际可执行资金需求，应优先补齐公司行动与券商费用结算，并加入成交量限制。</w:t>
+        <w:t>价格与结算：本次增加了日成交额约束、部分成交重试与增量冲击情景，但没有分钟路径、买卖价差、队列或实测冲击校准，日VWAP也不是可保证的成交价。停牌末次估值可延迟风险显现，退市残值并非认证清算款；整手实验沿用复权账户，派息到账、红股、税款与整数登记仍需完整重建。</w:t>
       </w:r>
     </w:p>
     <w:p>
@@ -11895,6 +16236,7 @@
       <w:r>
         <w:rPr>
           <w:rFonts w:eastAsia="Songti SC"/>
+          <w:color w:val="000000"/>
         </w:rPr>
         <w:t>项目的最终表述</w:t>
       </w:r>
@@ -11905,7 +16247,10 @@
         <w:spacing w:line="280" w:lineRule="exact"/>
       </w:pPr>
       <w:r>
-        <w:t>本项目验证了一个受ST和交易约束影响的A股小市值策略，并通过历史留出、区间扩展、收益集中度、市场环境与资金敏感性分析划定适用边界。收益受少数强势月份影响，当月风格关联不能直接用于预测下月大跌，资金约束会改变实际暴露。核心价值是可复现地说明收益优势、风险代价和证据不足，而不是把历史最高收益包装为稳健获利规律。</w:t>
+        <w:rPr>
+          <w:rFonts w:eastAsia="Songti SC"/>
+        </w:rPr>
+        <w:t>本项目研究了一个受ST和交易约束影响的A股小市值策略，并用历史留出、区间扩展、收益集中度、市场环境、整手费用与成交容量压力划定适用边界。固定压力假设会改变实现收益与持仓路径，不能据此认证可执行资金上限。研究支持描述历史收益优势及风险代价，不支持把最高历史收益包装为稳健获利规律、独立Alpha或壳价值。</w:t>
       </w:r>
     </w:p>
     <w:p>
@@ -11918,6 +16263,7 @@
       <w:r>
         <w:rPr>
           <w:rFonts w:eastAsia="Songti SC"/>
+          <w:color w:val="000000"/>
         </w:rPr>
         <w:t>附录  数据核验 复现与参考来源</w:t>
       </w:r>
@@ -11931,6 +16277,7 @@
       <w:r>
         <w:rPr>
           <w:rFonts w:eastAsia="Songti SC"/>
+          <w:color w:val="000000"/>
         </w:rPr>
         <w:t>结果与核验记录</w:t>
       </w:r>
@@ -11943,10 +16290,8 @@
       <w:r>
         <w:rPr>
           <w:rFonts w:eastAsia="Songti SC"/>
-          <w:b w:val="0"/>
-          <w:sz w:val="18"/>
         </w:rPr>
-        <w:t>主结果覆盖132个月、66,000个分组公司—月，冻结原始输入12,579份。核验清单包含24个公司—月及31个执行案例；源项目核心135项测试通过；公开版本另行执行测试，结果见仓库持续集成记录，新增资金实验核对买单100股整数倍、费用与现金预算，扩展实验补证209个暂停上市交易日。上述为程序与来源记录检查，未获得独立人工签字。</w:t>
+        <w:t>主结果覆盖132个月、66,000个分组公司—月，冻结原始输入12,579份。核验清单包含24个公司—月及31个执行案例；源项目核心135项测试通过；公开版本另行执行测试，结果见仓库持续集成记录，新增资金实验核对买单100股整数倍、费用与现金预算，扩展实验补证209个暂停上市交易日。上述为程序与来源记录检查，未获得独立人工签字。 新增128格容量情景分别重建并核对每日现金、持仓净值、前日预算、整手、共享成交额度与费用；逐格检查摘要见results/capacity/ledger_checks.csv。这是模型内部一致性验证，不是实际成交认证。</w:t>
       </w:r>
     </w:p>
     <w:p>
@@ -11972,6 +16317,7 @@
       <w:r>
         <w:rPr>
           <w:rFonts w:eastAsia="Songti SC"/>
+          <w:color w:val="000000"/>
         </w:rPr>
         <w:t>复现与定位</w:t>
       </w:r>
@@ -11983,9 +16329,9 @@
       </w:pPr>
       <w:r>
         <w:rPr>
-          <w:sz w:val="18"/>
+          <w:rFonts w:eastAsia="Songti SC"/>
         </w:rPr>
-        <w:t>公开包可用research.ipynb复算选优、绩效与主要统计量；这属于已保存结果的复算。完整交易回测使用python -m microcap all，需另外准备已授权的历史输入，运行前执行缺口检查。Word统一由scripts/build_word_report.py生成；复现步骤与依赖见RUN_GUIDE.md。</w:t>
+        <w:t>公开包可用research.ipynb复算选优、绩效与主要统计量；这属于已保存结果的复算。完整交易回测使用python -m microcap all，需另外准备已授权的历史输入，运行前执行缺口检查。Word统一由scripts/build_word_report.py生成；复现步骤与依赖见RUN_GUIDE.md。 容量完整重跑使用scripts/run_capacity_stress.py，需授权数据；scripts/build_capacity_figures.py复算图表，_report_capacity.py在统一入口中插入本次结果。</w:t>
       </w:r>
     </w:p>
     <w:p>
@@ -11995,9 +16341,9 @@
       </w:pPr>
       <w:r>
         <w:rPr>
-          <w:sz w:val="18"/>
+          <w:rFonts w:eastAsia="Songti SC"/>
         </w:rPr>
-        <w:t>核心结果位于results，执行和区间扩展位于results/supplement，适用性分析位于results/applicability。PUBLIC_MANIFEST.json校验公开文件，provenance说明历史记录的边界。原始行情、完整逐笔模拟账本及公告证据未随公开包提供；不能仅凭公开结果表认证原始输入。</w:t>
+        <w:t>核心结果位于results，执行和区间扩展位于results/supplement，适用性分析位于results/applicability。PUBLIC_MANIFEST.json校验公开文件，provenance说明历史记录的边界。原始行情、完整逐笔模拟账本及公告证据未随公开包提供；不能仅凭公开结果表认证原始输入。 成交容量协议、覆盖记录、128格绩效及尝试统计位于results/capacity；原始日行情与逐笔模拟账本仍不公开，结果复算不等于独立认证输入。</w:t>
       </w:r>
     </w:p>
     <w:p>
@@ -12009,6 +16355,7 @@
       <w:r>
         <w:rPr>
           <w:rFonts w:eastAsia="Songti SC"/>
+          <w:color w:val="000000"/>
         </w:rPr>
         <w:t>参考来源</w:t>
       </w:r>
@@ -12221,6 +16568,84 @@
           <w:sz w:val="18"/>
         </w:rPr>
         <w:t>2019-029；2019年5月27日进入退市整理期。</w:t>
+      </w:r>
+    </w:p>
+    <w:p>
+      <w:pPr>
+        <w:spacing w:after="20" w:line="260" w:lineRule="exact"/>
+      </w:pPr>
+      <w:hyperlink r:id="rId24">
+        <w:r>
+          <w:rPr>
+            <w:color w:val="245D86"/>
+            <w:sz w:val="18"/>
+          </w:rPr>
+          <w:t>8  Tushare 日线行情字段说明</w:t>
+        </w:r>
+      </w:hyperlink>
+    </w:p>
+    <w:p>
+      <w:pPr>
+        <w:spacing w:line="260" w:lineRule="exact" w:after="60"/>
+      </w:pPr>
+      <w:r>
+        <w:rPr>
+          <w:rFonts w:eastAsia="Songti SC"/>
+          <w:sz w:val="18"/>
+        </w:rPr>
+        <w:t>成交额以千元、成交量以手记录；用于日VWAP和成交容量输入的单位换算。</w:t>
+      </w:r>
+    </w:p>
+    <w:p>
+      <w:pPr>
+        <w:spacing w:after="20" w:line="260" w:lineRule="exact"/>
+      </w:pPr>
+      <w:hyperlink r:id="rId25">
+        <w:r>
+          <w:rPr>
+            <w:color w:val="245D86"/>
+            <w:sz w:val="18"/>
+          </w:rPr>
+          <w:t>9  Tóth等 Anomalous Price Impact and the Critical Nature of Liquidity</w:t>
+        </w:r>
+      </w:hyperlink>
+    </w:p>
+    <w:p>
+      <w:pPr>
+        <w:spacing w:line="260" w:lineRule="exact" w:after="60"/>
+      </w:pPr>
+      <w:r>
+        <w:rPr>
+          <w:rFonts w:eastAsia="Songti SC"/>
+          <w:sz w:val="18"/>
+        </w:rPr>
+        <w:t>Physical Review X 1 021006；平方根冲击形式的方法背景，不提供本策略的实测参数。</w:t>
+      </w:r>
+    </w:p>
+    <w:p>
+      <w:pPr>
+        <w:spacing w:after="20" w:line="260" w:lineRule="exact"/>
+      </w:pPr>
+      <w:hyperlink r:id="rId26">
+        <w:r>
+          <w:rPr>
+            <w:color w:val="245D86"/>
+            <w:sz w:val="18"/>
+          </w:rPr>
+          <w:t>10  Frazzini Israel Moskowitz Trading Costs of Asset Pricing Anomalies</w:t>
+        </w:r>
+      </w:hyperlink>
+    </w:p>
+    <w:p>
+      <w:pPr>
+        <w:spacing w:line="260" w:lineRule="exact" w:after="60"/>
+      </w:pPr>
+      <w:r>
+        <w:rPr>
+          <w:rFonts w:eastAsia="Songti SC"/>
+          <w:sz w:val="18"/>
+        </w:rPr>
+        <w:t>AQR工作论文；交易成本与规模影响的方法参考，不能把海外估计直接当作A股参数。</w:t>
       </w:r>
     </w:p>
     <w:sectPr>

</xml_diff>